<commit_message>
docs: update PROJECT-FEATURES-EXPLAINED for completed parity phase
Mark PARITY-07..11 as shipped (broadcast announcements, promo/bonus credits,
in-app API reference, campaign retry, self-host Check-for-Updates); refresh the
status summary to "parity complete"; regenerate the .docx.

Co-Authored-By: Claude Opus 4.8 (1M context) <noreply@anthropic.com>
</commit_message>
<xml_diff>
--- a/docs/PROJECT-FEATURES-EXPLAINED.docx
+++ b/docs/PROJECT-FEATURES-EXPLAINED.docx
@@ -3923,7 +3923,7 @@
                 <w:color w:val="1F2937"/>
                 <w:sz w:val="20"/>
               </w:rPr>
-              <w:t>Bulk outbound calling campaigns (schedule, queue, retry).</w:t>
+              <w:t>Bulk outbound calling campaigns (schedule, queue, live status counts, retry failed).</w:t>
             </w:r>
           </w:p>
         </w:tc>
@@ -7091,7 +7091,7 @@
                 <w:color w:val="1F2937"/>
                 <w:sz w:val="20"/>
               </w:rPr>
-              <w:t>Wallet mein promotional credits. (⏳ abhi banana baaki)</w:t>
+              <w:t>Wallet mein promo/bonus credits — admin grants + redeemable promo codes; paid balance se pehle spend, expire ho sakte hain.</w:t>
             </w:r>
           </w:p>
         </w:tc>
@@ -8852,7 +8852,7 @@
                 <w:color w:val="1F2937"/>
                 <w:sz w:val="20"/>
               </w:rPr>
-              <w:t>Super-admin → sabhi tenants ko announcement. (🔄 in-progress)</w:t>
+              <w:t>Super-admin → sabhi tenants ko targeted announcement (severity + notification center).</w:t>
             </w:r>
           </w:p>
         </w:tc>
@@ -9178,7 +9178,7 @@
                 <w:color w:val="1F2937"/>
                 <w:sz w:val="20"/>
               </w:rPr>
-              <w:t>Dashboard mein live API explorer. (⏳ baaki)</w:t>
+              <w:t>Dashboard mein live API explorer — copy-ready curl + "Try it".</w:t>
             </w:r>
           </w:p>
         </w:tc>
@@ -9233,7 +9233,7 @@
                 <w:color w:val="1F2937"/>
                 <w:sz w:val="20"/>
               </w:rPr>
-              <w:t>sdk package</w:t>
+              <w:t>Check-for-Updates (parity)</w:t>
             </w:r>
           </w:p>
         </w:tc>
@@ -9259,7 +9259,7 @@
                 <w:color w:val="1F2937"/>
                 <w:sz w:val="20"/>
               </w:rPr>
-              <w:t>Public SDK (customers integrate kar sakein).</w:t>
+              <w:t>Self-host version check — installed vs latest release, read-only (auto-apply nahi).</w:t>
             </w:r>
           </w:p>
         </w:tc>
@@ -9314,7 +9314,7 @@
                 <w:color w:val="1F2937"/>
                 <w:sz w:val="20"/>
               </w:rPr>
-              <w:t>ops module</w:t>
+              <w:t>sdk package</w:t>
             </w:r>
           </w:p>
         </w:tc>
@@ -9341,7 +9341,7 @@
                 <w:color w:val="1F2937"/>
                 <w:sz w:val="20"/>
               </w:rPr>
-              <w:t>Ops toolkit (support/maintenance tasks).</w:t>
+              <w:t>Public SDK (customers integrate kar sakein).</w:t>
             </w:r>
           </w:p>
         </w:tc>
@@ -9396,7 +9396,7 @@
                 <w:color w:val="1F2937"/>
                 <w:sz w:val="20"/>
               </w:rPr>
-              <w:t>desk module</w:t>
+              <w:t>ops module</w:t>
             </w:r>
           </w:p>
         </w:tc>
@@ -9422,7 +9422,7 @@
                 <w:color w:val="1F2937"/>
                 <w:sz w:val="20"/>
               </w:rPr>
-              <w:t>Agent Desk — human live call takeover.</w:t>
+              <w:t>Ops toolkit (support/maintenance tasks).</w:t>
             </w:r>
           </w:p>
         </w:tc>
@@ -9477,7 +9477,7 @@
                 <w:color w:val="1F2937"/>
                 <w:sz w:val="20"/>
               </w:rPr>
-              <w:t>latency</w:t>
+              <w:t>desk module</w:t>
             </w:r>
           </w:p>
         </w:tc>
@@ -9504,7 +9504,7 @@
                 <w:color w:val="1F2937"/>
                 <w:sz w:val="20"/>
               </w:rPr>
-              <w:t>Latency monitoring/hardening.</w:t>
+              <w:t>Agent Desk — human live call takeover.</w:t>
             </w:r>
           </w:p>
         </w:tc>
@@ -9559,7 +9559,7 @@
                 <w:color w:val="1F2937"/>
                 <w:sz w:val="20"/>
               </w:rPr>
-              <w:t>scale</w:t>
+              <w:t>latency</w:t>
             </w:r>
           </w:p>
         </w:tc>
@@ -9585,7 +9585,7 @@
                 <w:color w:val="1F2937"/>
                 <w:sz w:val="20"/>
               </w:rPr>
-              <w:t>Scaling infra controls.</w:t>
+              <w:t>Latency monitoring/hardening.</w:t>
             </w:r>
           </w:p>
         </w:tc>
@@ -9640,7 +9640,7 @@
                 <w:color w:val="1F2937"/>
                 <w:sz w:val="20"/>
               </w:rPr>
-              <w:t>launch</w:t>
+              <w:t>scale</w:t>
             </w:r>
           </w:p>
         </w:tc>
@@ -9667,7 +9667,7 @@
                 <w:color w:val="1F2937"/>
                 <w:sz w:val="20"/>
               </w:rPr>
-              <w:t>Launch-readiness checks.</w:t>
+              <w:t>Scaling infra controls.</w:t>
             </w:r>
           </w:p>
         </w:tc>
@@ -9722,7 +9722,7 @@
                 <w:color w:val="1F2937"/>
                 <w:sz w:val="20"/>
               </w:rPr>
-              <w:t>observability</w:t>
+              <w:t>launch</w:t>
             </w:r>
           </w:p>
         </w:tc>
@@ -9748,7 +9748,7 @@
                 <w:color w:val="1F2937"/>
                 <w:sz w:val="20"/>
               </w:rPr>
-              <w:t>Logs/metrics/traces.</w:t>
+              <w:t>Launch-readiness checks.</w:t>
             </w:r>
           </w:p>
         </w:tc>
@@ -9774,7 +9774,7 @@
                 <w:color w:val="1F2937"/>
                 <w:sz w:val="20"/>
               </w:rPr>
-              <w:t>🔀 Hybrid (Sentry/Prometheus)</w:t>
+              <w:t>🏠 Native</w:t>
             </w:r>
           </w:p>
         </w:tc>
@@ -9803,7 +9803,7 @@
                 <w:color w:val="1F2937"/>
                 <w:sz w:val="20"/>
               </w:rPr>
-              <w:t>health</w:t>
+              <w:t>observability</w:t>
             </w:r>
           </w:p>
         </w:tc>
@@ -9830,7 +9830,7 @@
                 <w:color w:val="1F2937"/>
                 <w:sz w:val="20"/>
               </w:rPr>
-              <w:t>Health-check endpoints.</w:t>
+              <w:t>Logs/metrics/traces.</w:t>
             </w:r>
           </w:p>
         </w:tc>
@@ -9838,6 +9838,86 @@
           <w:tcPr>
             <w:tcW w:type="dxa" w:w="2880"/>
             <w:shd w:val="clear" w:color="auto" w:fill="EEF2FF"/>
+            <w:tcBorders>
+              <w:top w:val="single" w:sz="4" w:space="0" w:color="C7D2FE"/>
+              <w:left w:val="single" w:sz="4" w:space="0" w:color="C7D2FE"/>
+              <w:bottom w:val="single" w:sz="4" w:space="0" w:color="C7D2FE"/>
+              <w:right w:val="single" w:sz="4" w:space="0" w:color="C7D2FE"/>
+            </w:tcBorders>
+          </w:tcPr>
+          <w:p>
+            <w:pPr>
+              <w:spacing w:before="40" w:after="40"/>
+            </w:pPr>
+            <w:r/>
+            <w:r>
+              <w:rPr>
+                <w:b w:val="0"/>
+                <w:i w:val="0"/>
+                <w:color w:val="1F2937"/>
+                <w:sz w:val="20"/>
+              </w:rPr>
+              <w:t>🔀 Hybrid (Sentry/Prometheus)</w:t>
+            </w:r>
+          </w:p>
+        </w:tc>
+      </w:tr>
+      <w:tr>
+        <w:tc>
+          <w:tcPr>
+            <w:tcW w:type="dxa" w:w="2880"/>
+            <w:tcBorders>
+              <w:top w:val="single" w:sz="4" w:space="0" w:color="C7D2FE"/>
+              <w:left w:val="single" w:sz="4" w:space="0" w:color="C7D2FE"/>
+              <w:bottom w:val="single" w:sz="4" w:space="0" w:color="C7D2FE"/>
+              <w:right w:val="single" w:sz="4" w:space="0" w:color="C7D2FE"/>
+            </w:tcBorders>
+          </w:tcPr>
+          <w:p>
+            <w:pPr>
+              <w:spacing w:before="40" w:after="40"/>
+            </w:pPr>
+            <w:r/>
+            <w:r>
+              <w:rPr>
+                <w:b w:val="0"/>
+                <w:i w:val="0"/>
+                <w:color w:val="1F2937"/>
+                <w:sz w:val="20"/>
+              </w:rPr>
+              <w:t>health</w:t>
+            </w:r>
+          </w:p>
+        </w:tc>
+        <w:tc>
+          <w:tcPr>
+            <w:tcW w:type="dxa" w:w="2880"/>
+            <w:tcBorders>
+              <w:top w:val="single" w:sz="4" w:space="0" w:color="C7D2FE"/>
+              <w:left w:val="single" w:sz="4" w:space="0" w:color="C7D2FE"/>
+              <w:bottom w:val="single" w:sz="4" w:space="0" w:color="C7D2FE"/>
+              <w:right w:val="single" w:sz="4" w:space="0" w:color="C7D2FE"/>
+            </w:tcBorders>
+          </w:tcPr>
+          <w:p>
+            <w:pPr>
+              <w:spacing w:before="40" w:after="40"/>
+            </w:pPr>
+            <w:r/>
+            <w:r>
+              <w:rPr>
+                <w:b w:val="0"/>
+                <w:i w:val="0"/>
+                <w:color w:val="1F2937"/>
+                <w:sz w:val="20"/>
+              </w:rPr>
+              <w:t>Health-check endpoints.</w:t>
+            </w:r>
+          </w:p>
+        </w:tc>
+        <w:tc>
+          <w:tcPr>
+            <w:tcW w:type="dxa" w:w="2880"/>
             <w:tcBorders>
               <w:top w:val="single" w:sz="4" w:space="0" w:color="C7D2FE"/>
               <w:left w:val="single" w:sz="4" w:space="0" w:color="C7D2FE"/>
@@ -11116,7 +11196,7 @@
           <w:color w:val="4F46E5"/>
           <w:sz w:val="30"/>
         </w:rPr>
-        <w:t>📝 Status Summary — kya bacha hai (Competitor-Parity phase)</w:t>
+        <w:t>📝 Status Summary — Competitor-Parity phase ✅ COMPLETE</w:t>
       </w:r>
     </w:p>
     <w:p>
@@ -11148,7 +11228,43 @@
           <w:color w:val="1F2937"/>
           <w:sz w:val="21"/>
         </w:rPr>
-        <w:t xml:space="preserve"> hai. Sirf yeh parity features baaki:</w:t>
+        <w:t xml:space="preserve"> hai, aur </w:t>
+      </w:r>
+      <w:r>
+        <w:rPr>
+          <w:b/>
+          <w:i w:val="0"/>
+          <w:color w:val="1F2937"/>
+          <w:sz w:val="21"/>
+        </w:rPr>
+        <w:t>Competitor-Parity phase bhi ab complete</w:t>
+      </w:r>
+      <w:r>
+        <w:rPr>
+          <w:b w:val="0"/>
+          <w:i w:val="0"/>
+          <w:color w:val="1F2937"/>
+          <w:sz w:val="21"/>
+        </w:rPr>
+        <w:t xml:space="preserve"> hai — VocalIQ ab IntelliCall AI + AgentLabs AI ka strict </w:t>
+      </w:r>
+      <w:r>
+        <w:rPr>
+          <w:b/>
+          <w:i w:val="0"/>
+          <w:color w:val="1F2937"/>
+          <w:sz w:val="21"/>
+        </w:rPr>
+        <w:t>superset</w:t>
+      </w:r>
+      <w:r>
+        <w:rPr>
+          <w:b w:val="0"/>
+          <w:i w:val="0"/>
+          <w:color w:val="1F2937"/>
+          <w:sz w:val="21"/>
+        </w:rPr>
+        <w:t xml:space="preserve"> hai.</w:t>
       </w:r>
     </w:p>
     <w:tbl>
@@ -11241,7 +11357,7 @@
                 <w:color w:val="1F2937"/>
                 <w:sz w:val="20"/>
               </w:rPr>
-              <w:t>PARITY-07 Broadcast announcements</w:t>
+              <w:t>PARITY-01 Plivo + OpenRouter adapters</w:t>
             </w:r>
           </w:p>
         </w:tc>
@@ -11267,7 +11383,7 @@
                 <w:color w:val="1F2937"/>
                 <w:sz w:val="20"/>
               </w:rPr>
-              <w:t>🔄 in-progress (uncommitted)</w:t>
+              <w:t>✅ merged (#136)</w:t>
             </w:r>
           </w:p>
         </w:tc>
@@ -11296,7 +11412,7 @@
                 <w:color w:val="1F2937"/>
                 <w:sz w:val="20"/>
               </w:rPr>
-              <w:t>PARITY-08 Promo/bonus credits</w:t>
+              <w:t>PARITY-02 Instant-dial API</w:t>
             </w:r>
           </w:p>
         </w:tc>
@@ -11323,7 +11439,7 @@
                 <w:color w:val="1F2937"/>
                 <w:sz w:val="20"/>
               </w:rPr>
-              <w:t>⏳ baaki</w:t>
+              <w:t>✅ merged (#137)</w:t>
             </w:r>
           </w:p>
         </w:tc>
@@ -11351,7 +11467,7 @@
                 <w:color w:val="1F2937"/>
                 <w:sz w:val="20"/>
               </w:rPr>
-              <w:t>PARITY-09 In-app API reference</w:t>
+              <w:t>PARITY-03 AI Form Builder</w:t>
             </w:r>
           </w:p>
         </w:tc>
@@ -11377,7 +11493,7 @@
                 <w:color w:val="1F2937"/>
                 <w:sz w:val="20"/>
               </w:rPr>
-              <w:t>⏳ baaki</w:t>
+              <w:t>✅ (Day-37 delivered)</w:t>
             </w:r>
           </w:p>
         </w:tc>
@@ -11406,7 +11522,7 @@
                 <w:color w:val="1F2937"/>
                 <w:sz w:val="20"/>
               </w:rPr>
-              <w:t>PARITY-10 Enhancements batch (5 UI/export items)</w:t>
+              <w:t>PARITY-04 Form-to-Call</w:t>
             </w:r>
           </w:p>
         </w:tc>
@@ -11433,7 +11549,7 @@
                 <w:color w:val="1F2937"/>
                 <w:sz w:val="20"/>
               </w:rPr>
-              <w:t>⏳ baaki</w:t>
+              <w:t>✅ merged (#138)</w:t>
             </w:r>
           </w:p>
         </w:tc>
@@ -11461,6 +11577,336 @@
                 <w:color w:val="1F2937"/>
                 <w:sz w:val="20"/>
               </w:rPr>
+              <w:t>PARITY-05 n8n connector</w:t>
+            </w:r>
+          </w:p>
+        </w:tc>
+        <w:tc>
+          <w:tcPr>
+            <w:tcW w:type="dxa" w:w="4320"/>
+            <w:tcBorders>
+              <w:top w:val="single" w:sz="4" w:space="0" w:color="C7D2FE"/>
+              <w:left w:val="single" w:sz="4" w:space="0" w:color="C7D2FE"/>
+              <w:bottom w:val="single" w:sz="4" w:space="0" w:color="C7D2FE"/>
+              <w:right w:val="single" w:sz="4" w:space="0" w:color="C7D2FE"/>
+            </w:tcBorders>
+          </w:tcPr>
+          <w:p>
+            <w:pPr>
+              <w:spacing w:before="40" w:after="40"/>
+            </w:pPr>
+            <w:r/>
+            <w:r>
+              <w:rPr>
+                <w:b w:val="0"/>
+                <w:i w:val="0"/>
+                <w:color w:val="1F2937"/>
+                <w:sz w:val="20"/>
+              </w:rPr>
+              <w:t>✅ merged (#139)</w:t>
+            </w:r>
+          </w:p>
+        </w:tc>
+      </w:tr>
+      <w:tr>
+        <w:tc>
+          <w:tcPr>
+            <w:tcW w:type="dxa" w:w="4320"/>
+            <w:shd w:val="clear" w:color="auto" w:fill="EEF2FF"/>
+            <w:tcBorders>
+              <w:top w:val="single" w:sz="4" w:space="0" w:color="C7D2FE"/>
+              <w:left w:val="single" w:sz="4" w:space="0" w:color="C7D2FE"/>
+              <w:bottom w:val="single" w:sz="4" w:space="0" w:color="C7D2FE"/>
+              <w:right w:val="single" w:sz="4" w:space="0" w:color="C7D2FE"/>
+            </w:tcBorders>
+          </w:tcPr>
+          <w:p>
+            <w:pPr>
+              <w:spacing w:before="40" w:after="40"/>
+            </w:pPr>
+            <w:r/>
+            <w:r>
+              <w:rPr>
+                <w:b w:val="0"/>
+                <w:i w:val="0"/>
+                <w:color w:val="1F2937"/>
+                <w:sz w:val="20"/>
+              </w:rPr>
+              <w:t>PARITY-06 Slack connector</w:t>
+            </w:r>
+          </w:p>
+        </w:tc>
+        <w:tc>
+          <w:tcPr>
+            <w:tcW w:type="dxa" w:w="4320"/>
+            <w:shd w:val="clear" w:color="auto" w:fill="EEF2FF"/>
+            <w:tcBorders>
+              <w:top w:val="single" w:sz="4" w:space="0" w:color="C7D2FE"/>
+              <w:left w:val="single" w:sz="4" w:space="0" w:color="C7D2FE"/>
+              <w:bottom w:val="single" w:sz="4" w:space="0" w:color="C7D2FE"/>
+              <w:right w:val="single" w:sz="4" w:space="0" w:color="C7D2FE"/>
+            </w:tcBorders>
+          </w:tcPr>
+          <w:p>
+            <w:pPr>
+              <w:spacing w:before="40" w:after="40"/>
+            </w:pPr>
+            <w:r/>
+            <w:r>
+              <w:rPr>
+                <w:b w:val="0"/>
+                <w:i w:val="0"/>
+                <w:color w:val="1F2937"/>
+                <w:sz w:val="20"/>
+              </w:rPr>
+              <w:t>✅ merged (#140)</w:t>
+            </w:r>
+          </w:p>
+        </w:tc>
+      </w:tr>
+      <w:tr>
+        <w:tc>
+          <w:tcPr>
+            <w:tcW w:type="dxa" w:w="4320"/>
+            <w:tcBorders>
+              <w:top w:val="single" w:sz="4" w:space="0" w:color="C7D2FE"/>
+              <w:left w:val="single" w:sz="4" w:space="0" w:color="C7D2FE"/>
+              <w:bottom w:val="single" w:sz="4" w:space="0" w:color="C7D2FE"/>
+              <w:right w:val="single" w:sz="4" w:space="0" w:color="C7D2FE"/>
+            </w:tcBorders>
+          </w:tcPr>
+          <w:p>
+            <w:pPr>
+              <w:spacing w:before="40" w:after="40"/>
+            </w:pPr>
+            <w:r/>
+            <w:r>
+              <w:rPr>
+                <w:b w:val="0"/>
+                <w:i w:val="0"/>
+                <w:color w:val="1F2937"/>
+                <w:sz w:val="20"/>
+              </w:rPr>
+              <w:t>PARITY-07 Broadcast announcements</w:t>
+            </w:r>
+          </w:p>
+        </w:tc>
+        <w:tc>
+          <w:tcPr>
+            <w:tcW w:type="dxa" w:w="4320"/>
+            <w:tcBorders>
+              <w:top w:val="single" w:sz="4" w:space="0" w:color="C7D2FE"/>
+              <w:left w:val="single" w:sz="4" w:space="0" w:color="C7D2FE"/>
+              <w:bottom w:val="single" w:sz="4" w:space="0" w:color="C7D2FE"/>
+              <w:right w:val="single" w:sz="4" w:space="0" w:color="C7D2FE"/>
+            </w:tcBorders>
+          </w:tcPr>
+          <w:p>
+            <w:pPr>
+              <w:spacing w:before="40" w:after="40"/>
+            </w:pPr>
+            <w:r/>
+            <w:r>
+              <w:rPr>
+                <w:b w:val="0"/>
+                <w:i w:val="0"/>
+                <w:color w:val="1F2937"/>
+                <w:sz w:val="20"/>
+              </w:rPr>
+              <w:t>✅ merged (#142)</w:t>
+            </w:r>
+          </w:p>
+        </w:tc>
+      </w:tr>
+      <w:tr>
+        <w:tc>
+          <w:tcPr>
+            <w:tcW w:type="dxa" w:w="4320"/>
+            <w:shd w:val="clear" w:color="auto" w:fill="EEF2FF"/>
+            <w:tcBorders>
+              <w:top w:val="single" w:sz="4" w:space="0" w:color="C7D2FE"/>
+              <w:left w:val="single" w:sz="4" w:space="0" w:color="C7D2FE"/>
+              <w:bottom w:val="single" w:sz="4" w:space="0" w:color="C7D2FE"/>
+              <w:right w:val="single" w:sz="4" w:space="0" w:color="C7D2FE"/>
+            </w:tcBorders>
+          </w:tcPr>
+          <w:p>
+            <w:pPr>
+              <w:spacing w:before="40" w:after="40"/>
+            </w:pPr>
+            <w:r/>
+            <w:r>
+              <w:rPr>
+                <w:b w:val="0"/>
+                <w:i w:val="0"/>
+                <w:color w:val="1F2937"/>
+                <w:sz w:val="20"/>
+              </w:rPr>
+              <w:t>PARITY-08 Promo/bonus credits</w:t>
+            </w:r>
+          </w:p>
+        </w:tc>
+        <w:tc>
+          <w:tcPr>
+            <w:tcW w:type="dxa" w:w="4320"/>
+            <w:shd w:val="clear" w:color="auto" w:fill="EEF2FF"/>
+            <w:tcBorders>
+              <w:top w:val="single" w:sz="4" w:space="0" w:color="C7D2FE"/>
+              <w:left w:val="single" w:sz="4" w:space="0" w:color="C7D2FE"/>
+              <w:bottom w:val="single" w:sz="4" w:space="0" w:color="C7D2FE"/>
+              <w:right w:val="single" w:sz="4" w:space="0" w:color="C7D2FE"/>
+            </w:tcBorders>
+          </w:tcPr>
+          <w:p>
+            <w:pPr>
+              <w:spacing w:before="40" w:after="40"/>
+            </w:pPr>
+            <w:r/>
+            <w:r>
+              <w:rPr>
+                <w:b w:val="0"/>
+                <w:i w:val="0"/>
+                <w:color w:val="1F2937"/>
+                <w:sz w:val="20"/>
+              </w:rPr>
+              <w:t>✅ merged (#143)</w:t>
+            </w:r>
+          </w:p>
+        </w:tc>
+      </w:tr>
+      <w:tr>
+        <w:tc>
+          <w:tcPr>
+            <w:tcW w:type="dxa" w:w="4320"/>
+            <w:tcBorders>
+              <w:top w:val="single" w:sz="4" w:space="0" w:color="C7D2FE"/>
+              <w:left w:val="single" w:sz="4" w:space="0" w:color="C7D2FE"/>
+              <w:bottom w:val="single" w:sz="4" w:space="0" w:color="C7D2FE"/>
+              <w:right w:val="single" w:sz="4" w:space="0" w:color="C7D2FE"/>
+            </w:tcBorders>
+          </w:tcPr>
+          <w:p>
+            <w:pPr>
+              <w:spacing w:before="40" w:after="40"/>
+            </w:pPr>
+            <w:r/>
+            <w:r>
+              <w:rPr>
+                <w:b w:val="0"/>
+                <w:i w:val="0"/>
+                <w:color w:val="1F2937"/>
+                <w:sz w:val="20"/>
+              </w:rPr>
+              <w:t>PARITY-09 In-app API reference</w:t>
+            </w:r>
+          </w:p>
+        </w:tc>
+        <w:tc>
+          <w:tcPr>
+            <w:tcW w:type="dxa" w:w="4320"/>
+            <w:tcBorders>
+              <w:top w:val="single" w:sz="4" w:space="0" w:color="C7D2FE"/>
+              <w:left w:val="single" w:sz="4" w:space="0" w:color="C7D2FE"/>
+              <w:bottom w:val="single" w:sz="4" w:space="0" w:color="C7D2FE"/>
+              <w:right w:val="single" w:sz="4" w:space="0" w:color="C7D2FE"/>
+            </w:tcBorders>
+          </w:tcPr>
+          <w:p>
+            <w:pPr>
+              <w:spacing w:before="40" w:after="40"/>
+            </w:pPr>
+            <w:r/>
+            <w:r>
+              <w:rPr>
+                <w:b w:val="0"/>
+                <w:i w:val="0"/>
+                <w:color w:val="1F2937"/>
+                <w:sz w:val="20"/>
+              </w:rPr>
+              <w:t>✅ merged (#144)</w:t>
+            </w:r>
+          </w:p>
+        </w:tc>
+      </w:tr>
+      <w:tr>
+        <w:tc>
+          <w:tcPr>
+            <w:tcW w:type="dxa" w:w="4320"/>
+            <w:shd w:val="clear" w:color="auto" w:fill="EEF2FF"/>
+            <w:tcBorders>
+              <w:top w:val="single" w:sz="4" w:space="0" w:color="C7D2FE"/>
+              <w:left w:val="single" w:sz="4" w:space="0" w:color="C7D2FE"/>
+              <w:bottom w:val="single" w:sz="4" w:space="0" w:color="C7D2FE"/>
+              <w:right w:val="single" w:sz="4" w:space="0" w:color="C7D2FE"/>
+            </w:tcBorders>
+          </w:tcPr>
+          <w:p>
+            <w:pPr>
+              <w:spacing w:before="40" w:after="40"/>
+            </w:pPr>
+            <w:r/>
+            <w:r>
+              <w:rPr>
+                <w:b w:val="0"/>
+                <w:i w:val="0"/>
+                <w:color w:val="1F2937"/>
+                <w:sz w:val="20"/>
+              </w:rPr>
+              <w:t>PARITY-10 Campaign retry (enhancements batch)</w:t>
+            </w:r>
+          </w:p>
+        </w:tc>
+        <w:tc>
+          <w:tcPr>
+            <w:tcW w:type="dxa" w:w="4320"/>
+            <w:shd w:val="clear" w:color="auto" w:fill="EEF2FF"/>
+            <w:tcBorders>
+              <w:top w:val="single" w:sz="4" w:space="0" w:color="C7D2FE"/>
+              <w:left w:val="single" w:sz="4" w:space="0" w:color="C7D2FE"/>
+              <w:bottom w:val="single" w:sz="4" w:space="0" w:color="C7D2FE"/>
+              <w:right w:val="single" w:sz="4" w:space="0" w:color="C7D2FE"/>
+            </w:tcBorders>
+          </w:tcPr>
+          <w:p>
+            <w:pPr>
+              <w:spacing w:before="40" w:after="40"/>
+            </w:pPr>
+            <w:r/>
+            <w:r>
+              <w:rPr>
+                <w:b w:val="0"/>
+                <w:i w:val="0"/>
+                <w:color w:val="1F2937"/>
+                <w:sz w:val="20"/>
+              </w:rPr>
+              <w:t>✅ merged (#145)</w:t>
+            </w:r>
+          </w:p>
+        </w:tc>
+      </w:tr>
+      <w:tr>
+        <w:tc>
+          <w:tcPr>
+            <w:tcW w:type="dxa" w:w="4320"/>
+            <w:tcBorders>
+              <w:top w:val="single" w:sz="4" w:space="0" w:color="C7D2FE"/>
+              <w:left w:val="single" w:sz="4" w:space="0" w:color="C7D2FE"/>
+              <w:bottom w:val="single" w:sz="4" w:space="0" w:color="C7D2FE"/>
+              <w:right w:val="single" w:sz="4" w:space="0" w:color="C7D2FE"/>
+            </w:tcBorders>
+          </w:tcPr>
+          <w:p>
+            <w:pPr>
+              <w:spacing w:before="40" w:after="40"/>
+            </w:pPr>
+            <w:r/>
+            <w:r>
+              <w:rPr>
+                <w:b w:val="0"/>
+                <w:i w:val="0"/>
+                <w:color w:val="1F2937"/>
+                <w:sz w:val="20"/>
+              </w:rPr>
               <w:t>PARITY-11 Self-host installer + update checker</w:t>
             </w:r>
           </w:p>
@@ -11487,7 +11933,7 @@
                 <w:color w:val="1F2937"/>
                 <w:sz w:val="20"/>
               </w:rPr>
-              <w:t>⏳ baaki</w:t>
+              <w:t>✅ merged (#146)</w:t>
             </w:r>
           </w:p>
         </w:tc>
@@ -11497,6 +11943,29 @@
       <w:pPr>
         <w:spacing w:after="40"/>
       </w:pPr>
+    </w:p>
+    <w:p>
+      <w:pPr>
+        <w:spacing w:after="80"/>
+      </w:pPr>
+      <w:r>
+        <w:rPr>
+          <w:b/>
+          <w:i w:val="0"/>
+          <w:color w:val="1F2937"/>
+          <w:sz w:val="21"/>
+        </w:rPr>
+        <w:t>Tracked follow-ups (PARITY-10, minor):</w:t>
+      </w:r>
+      <w:r>
+        <w:rPr>
+          <w:b w:val="0"/>
+          <w:i w:val="0"/>
+          <w:color w:val="1F2937"/>
+          <w:sz w:val="21"/>
+        </w:rPr>
+        <w:t xml:space="preserve"> unified notification matrix, analytics PDF + trend tiles, per-run manual retry.</w:t>
+      </w:r>
     </w:p>
     <w:p>
       <w:pPr>

</xml_diff>

<commit_message>
docs: update PROJECT-FEATURES-EXPLAINED for completed parity phase (#147)
Mark PARITY-07..11 as shipped (broadcast announcements, promo/bonus credits,
in-app API reference, campaign retry, self-host Check-for-Updates); refresh the
status summary to "parity complete"; regenerate the .docx.

Co-authored-by: thequantcoder <guptaarpita1702@gmail.com>
Co-authored-by: Claude Opus 4.8 (1M context) <noreply@anthropic.com>
</commit_message>
<xml_diff>
--- a/docs/PROJECT-FEATURES-EXPLAINED.docx
+++ b/docs/PROJECT-FEATURES-EXPLAINED.docx
@@ -3923,7 +3923,7 @@
                 <w:color w:val="1F2937"/>
                 <w:sz w:val="20"/>
               </w:rPr>
-              <w:t>Bulk outbound calling campaigns (schedule, queue, retry).</w:t>
+              <w:t>Bulk outbound calling campaigns (schedule, queue, live status counts, retry failed).</w:t>
             </w:r>
           </w:p>
         </w:tc>
@@ -7091,7 +7091,7 @@
                 <w:color w:val="1F2937"/>
                 <w:sz w:val="20"/>
               </w:rPr>
-              <w:t>Wallet mein promotional credits. (⏳ abhi banana baaki)</w:t>
+              <w:t>Wallet mein promo/bonus credits — admin grants + redeemable promo codes; paid balance se pehle spend, expire ho sakte hain.</w:t>
             </w:r>
           </w:p>
         </w:tc>
@@ -8852,7 +8852,7 @@
                 <w:color w:val="1F2937"/>
                 <w:sz w:val="20"/>
               </w:rPr>
-              <w:t>Super-admin → sabhi tenants ko announcement. (🔄 in-progress)</w:t>
+              <w:t>Super-admin → sabhi tenants ko targeted announcement (severity + notification center).</w:t>
             </w:r>
           </w:p>
         </w:tc>
@@ -9178,7 +9178,7 @@
                 <w:color w:val="1F2937"/>
                 <w:sz w:val="20"/>
               </w:rPr>
-              <w:t>Dashboard mein live API explorer. (⏳ baaki)</w:t>
+              <w:t>Dashboard mein live API explorer — copy-ready curl + "Try it".</w:t>
             </w:r>
           </w:p>
         </w:tc>
@@ -9233,7 +9233,7 @@
                 <w:color w:val="1F2937"/>
                 <w:sz w:val="20"/>
               </w:rPr>
-              <w:t>sdk package</w:t>
+              <w:t>Check-for-Updates (parity)</w:t>
             </w:r>
           </w:p>
         </w:tc>
@@ -9259,7 +9259,7 @@
                 <w:color w:val="1F2937"/>
                 <w:sz w:val="20"/>
               </w:rPr>
-              <w:t>Public SDK (customers integrate kar sakein).</w:t>
+              <w:t>Self-host version check — installed vs latest release, read-only (auto-apply nahi).</w:t>
             </w:r>
           </w:p>
         </w:tc>
@@ -9314,7 +9314,7 @@
                 <w:color w:val="1F2937"/>
                 <w:sz w:val="20"/>
               </w:rPr>
-              <w:t>ops module</w:t>
+              <w:t>sdk package</w:t>
             </w:r>
           </w:p>
         </w:tc>
@@ -9341,7 +9341,7 @@
                 <w:color w:val="1F2937"/>
                 <w:sz w:val="20"/>
               </w:rPr>
-              <w:t>Ops toolkit (support/maintenance tasks).</w:t>
+              <w:t>Public SDK (customers integrate kar sakein).</w:t>
             </w:r>
           </w:p>
         </w:tc>
@@ -9396,7 +9396,7 @@
                 <w:color w:val="1F2937"/>
                 <w:sz w:val="20"/>
               </w:rPr>
-              <w:t>desk module</w:t>
+              <w:t>ops module</w:t>
             </w:r>
           </w:p>
         </w:tc>
@@ -9422,7 +9422,7 @@
                 <w:color w:val="1F2937"/>
                 <w:sz w:val="20"/>
               </w:rPr>
-              <w:t>Agent Desk — human live call takeover.</w:t>
+              <w:t>Ops toolkit (support/maintenance tasks).</w:t>
             </w:r>
           </w:p>
         </w:tc>
@@ -9477,7 +9477,7 @@
                 <w:color w:val="1F2937"/>
                 <w:sz w:val="20"/>
               </w:rPr>
-              <w:t>latency</w:t>
+              <w:t>desk module</w:t>
             </w:r>
           </w:p>
         </w:tc>
@@ -9504,7 +9504,7 @@
                 <w:color w:val="1F2937"/>
                 <w:sz w:val="20"/>
               </w:rPr>
-              <w:t>Latency monitoring/hardening.</w:t>
+              <w:t>Agent Desk — human live call takeover.</w:t>
             </w:r>
           </w:p>
         </w:tc>
@@ -9559,7 +9559,7 @@
                 <w:color w:val="1F2937"/>
                 <w:sz w:val="20"/>
               </w:rPr>
-              <w:t>scale</w:t>
+              <w:t>latency</w:t>
             </w:r>
           </w:p>
         </w:tc>
@@ -9585,7 +9585,7 @@
                 <w:color w:val="1F2937"/>
                 <w:sz w:val="20"/>
               </w:rPr>
-              <w:t>Scaling infra controls.</w:t>
+              <w:t>Latency monitoring/hardening.</w:t>
             </w:r>
           </w:p>
         </w:tc>
@@ -9640,7 +9640,7 @@
                 <w:color w:val="1F2937"/>
                 <w:sz w:val="20"/>
               </w:rPr>
-              <w:t>launch</w:t>
+              <w:t>scale</w:t>
             </w:r>
           </w:p>
         </w:tc>
@@ -9667,7 +9667,7 @@
                 <w:color w:val="1F2937"/>
                 <w:sz w:val="20"/>
               </w:rPr>
-              <w:t>Launch-readiness checks.</w:t>
+              <w:t>Scaling infra controls.</w:t>
             </w:r>
           </w:p>
         </w:tc>
@@ -9722,7 +9722,7 @@
                 <w:color w:val="1F2937"/>
                 <w:sz w:val="20"/>
               </w:rPr>
-              <w:t>observability</w:t>
+              <w:t>launch</w:t>
             </w:r>
           </w:p>
         </w:tc>
@@ -9748,7 +9748,7 @@
                 <w:color w:val="1F2937"/>
                 <w:sz w:val="20"/>
               </w:rPr>
-              <w:t>Logs/metrics/traces.</w:t>
+              <w:t>Launch-readiness checks.</w:t>
             </w:r>
           </w:p>
         </w:tc>
@@ -9774,7 +9774,7 @@
                 <w:color w:val="1F2937"/>
                 <w:sz w:val="20"/>
               </w:rPr>
-              <w:t>🔀 Hybrid (Sentry/Prometheus)</w:t>
+              <w:t>🏠 Native</w:t>
             </w:r>
           </w:p>
         </w:tc>
@@ -9803,7 +9803,7 @@
                 <w:color w:val="1F2937"/>
                 <w:sz w:val="20"/>
               </w:rPr>
-              <w:t>health</w:t>
+              <w:t>observability</w:t>
             </w:r>
           </w:p>
         </w:tc>
@@ -9830,7 +9830,7 @@
                 <w:color w:val="1F2937"/>
                 <w:sz w:val="20"/>
               </w:rPr>
-              <w:t>Health-check endpoints.</w:t>
+              <w:t>Logs/metrics/traces.</w:t>
             </w:r>
           </w:p>
         </w:tc>
@@ -9838,6 +9838,86 @@
           <w:tcPr>
             <w:tcW w:type="dxa" w:w="2880"/>
             <w:shd w:val="clear" w:color="auto" w:fill="EEF2FF"/>
+            <w:tcBorders>
+              <w:top w:val="single" w:sz="4" w:space="0" w:color="C7D2FE"/>
+              <w:left w:val="single" w:sz="4" w:space="0" w:color="C7D2FE"/>
+              <w:bottom w:val="single" w:sz="4" w:space="0" w:color="C7D2FE"/>
+              <w:right w:val="single" w:sz="4" w:space="0" w:color="C7D2FE"/>
+            </w:tcBorders>
+          </w:tcPr>
+          <w:p>
+            <w:pPr>
+              <w:spacing w:before="40" w:after="40"/>
+            </w:pPr>
+            <w:r/>
+            <w:r>
+              <w:rPr>
+                <w:b w:val="0"/>
+                <w:i w:val="0"/>
+                <w:color w:val="1F2937"/>
+                <w:sz w:val="20"/>
+              </w:rPr>
+              <w:t>🔀 Hybrid (Sentry/Prometheus)</w:t>
+            </w:r>
+          </w:p>
+        </w:tc>
+      </w:tr>
+      <w:tr>
+        <w:tc>
+          <w:tcPr>
+            <w:tcW w:type="dxa" w:w="2880"/>
+            <w:tcBorders>
+              <w:top w:val="single" w:sz="4" w:space="0" w:color="C7D2FE"/>
+              <w:left w:val="single" w:sz="4" w:space="0" w:color="C7D2FE"/>
+              <w:bottom w:val="single" w:sz="4" w:space="0" w:color="C7D2FE"/>
+              <w:right w:val="single" w:sz="4" w:space="0" w:color="C7D2FE"/>
+            </w:tcBorders>
+          </w:tcPr>
+          <w:p>
+            <w:pPr>
+              <w:spacing w:before="40" w:after="40"/>
+            </w:pPr>
+            <w:r/>
+            <w:r>
+              <w:rPr>
+                <w:b w:val="0"/>
+                <w:i w:val="0"/>
+                <w:color w:val="1F2937"/>
+                <w:sz w:val="20"/>
+              </w:rPr>
+              <w:t>health</w:t>
+            </w:r>
+          </w:p>
+        </w:tc>
+        <w:tc>
+          <w:tcPr>
+            <w:tcW w:type="dxa" w:w="2880"/>
+            <w:tcBorders>
+              <w:top w:val="single" w:sz="4" w:space="0" w:color="C7D2FE"/>
+              <w:left w:val="single" w:sz="4" w:space="0" w:color="C7D2FE"/>
+              <w:bottom w:val="single" w:sz="4" w:space="0" w:color="C7D2FE"/>
+              <w:right w:val="single" w:sz="4" w:space="0" w:color="C7D2FE"/>
+            </w:tcBorders>
+          </w:tcPr>
+          <w:p>
+            <w:pPr>
+              <w:spacing w:before="40" w:after="40"/>
+            </w:pPr>
+            <w:r/>
+            <w:r>
+              <w:rPr>
+                <w:b w:val="0"/>
+                <w:i w:val="0"/>
+                <w:color w:val="1F2937"/>
+                <w:sz w:val="20"/>
+              </w:rPr>
+              <w:t>Health-check endpoints.</w:t>
+            </w:r>
+          </w:p>
+        </w:tc>
+        <w:tc>
+          <w:tcPr>
+            <w:tcW w:type="dxa" w:w="2880"/>
             <w:tcBorders>
               <w:top w:val="single" w:sz="4" w:space="0" w:color="C7D2FE"/>
               <w:left w:val="single" w:sz="4" w:space="0" w:color="C7D2FE"/>
@@ -11116,7 +11196,7 @@
           <w:color w:val="4F46E5"/>
           <w:sz w:val="30"/>
         </w:rPr>
-        <w:t>📝 Status Summary — kya bacha hai (Competitor-Parity phase)</w:t>
+        <w:t>📝 Status Summary — Competitor-Parity phase ✅ COMPLETE</w:t>
       </w:r>
     </w:p>
     <w:p>
@@ -11148,7 +11228,43 @@
           <w:color w:val="1F2937"/>
           <w:sz w:val="21"/>
         </w:rPr>
-        <w:t xml:space="preserve"> hai. Sirf yeh parity features baaki:</w:t>
+        <w:t xml:space="preserve"> hai, aur </w:t>
+      </w:r>
+      <w:r>
+        <w:rPr>
+          <w:b/>
+          <w:i w:val="0"/>
+          <w:color w:val="1F2937"/>
+          <w:sz w:val="21"/>
+        </w:rPr>
+        <w:t>Competitor-Parity phase bhi ab complete</w:t>
+      </w:r>
+      <w:r>
+        <w:rPr>
+          <w:b w:val="0"/>
+          <w:i w:val="0"/>
+          <w:color w:val="1F2937"/>
+          <w:sz w:val="21"/>
+        </w:rPr>
+        <w:t xml:space="preserve"> hai — VocalIQ ab IntelliCall AI + AgentLabs AI ka strict </w:t>
+      </w:r>
+      <w:r>
+        <w:rPr>
+          <w:b/>
+          <w:i w:val="0"/>
+          <w:color w:val="1F2937"/>
+          <w:sz w:val="21"/>
+        </w:rPr>
+        <w:t>superset</w:t>
+      </w:r>
+      <w:r>
+        <w:rPr>
+          <w:b w:val="0"/>
+          <w:i w:val="0"/>
+          <w:color w:val="1F2937"/>
+          <w:sz w:val="21"/>
+        </w:rPr>
+        <w:t xml:space="preserve"> hai.</w:t>
       </w:r>
     </w:p>
     <w:tbl>
@@ -11241,7 +11357,7 @@
                 <w:color w:val="1F2937"/>
                 <w:sz w:val="20"/>
               </w:rPr>
-              <w:t>PARITY-07 Broadcast announcements</w:t>
+              <w:t>PARITY-01 Plivo + OpenRouter adapters</w:t>
             </w:r>
           </w:p>
         </w:tc>
@@ -11267,7 +11383,7 @@
                 <w:color w:val="1F2937"/>
                 <w:sz w:val="20"/>
               </w:rPr>
-              <w:t>🔄 in-progress (uncommitted)</w:t>
+              <w:t>✅ merged (#136)</w:t>
             </w:r>
           </w:p>
         </w:tc>
@@ -11296,7 +11412,7 @@
                 <w:color w:val="1F2937"/>
                 <w:sz w:val="20"/>
               </w:rPr>
-              <w:t>PARITY-08 Promo/bonus credits</w:t>
+              <w:t>PARITY-02 Instant-dial API</w:t>
             </w:r>
           </w:p>
         </w:tc>
@@ -11323,7 +11439,7 @@
                 <w:color w:val="1F2937"/>
                 <w:sz w:val="20"/>
               </w:rPr>
-              <w:t>⏳ baaki</w:t>
+              <w:t>✅ merged (#137)</w:t>
             </w:r>
           </w:p>
         </w:tc>
@@ -11351,7 +11467,7 @@
                 <w:color w:val="1F2937"/>
                 <w:sz w:val="20"/>
               </w:rPr>
-              <w:t>PARITY-09 In-app API reference</w:t>
+              <w:t>PARITY-03 AI Form Builder</w:t>
             </w:r>
           </w:p>
         </w:tc>
@@ -11377,7 +11493,7 @@
                 <w:color w:val="1F2937"/>
                 <w:sz w:val="20"/>
               </w:rPr>
-              <w:t>⏳ baaki</w:t>
+              <w:t>✅ (Day-37 delivered)</w:t>
             </w:r>
           </w:p>
         </w:tc>
@@ -11406,7 +11522,7 @@
                 <w:color w:val="1F2937"/>
                 <w:sz w:val="20"/>
               </w:rPr>
-              <w:t>PARITY-10 Enhancements batch (5 UI/export items)</w:t>
+              <w:t>PARITY-04 Form-to-Call</w:t>
             </w:r>
           </w:p>
         </w:tc>
@@ -11433,7 +11549,7 @@
                 <w:color w:val="1F2937"/>
                 <w:sz w:val="20"/>
               </w:rPr>
-              <w:t>⏳ baaki</w:t>
+              <w:t>✅ merged (#138)</w:t>
             </w:r>
           </w:p>
         </w:tc>
@@ -11461,6 +11577,336 @@
                 <w:color w:val="1F2937"/>
                 <w:sz w:val="20"/>
               </w:rPr>
+              <w:t>PARITY-05 n8n connector</w:t>
+            </w:r>
+          </w:p>
+        </w:tc>
+        <w:tc>
+          <w:tcPr>
+            <w:tcW w:type="dxa" w:w="4320"/>
+            <w:tcBorders>
+              <w:top w:val="single" w:sz="4" w:space="0" w:color="C7D2FE"/>
+              <w:left w:val="single" w:sz="4" w:space="0" w:color="C7D2FE"/>
+              <w:bottom w:val="single" w:sz="4" w:space="0" w:color="C7D2FE"/>
+              <w:right w:val="single" w:sz="4" w:space="0" w:color="C7D2FE"/>
+            </w:tcBorders>
+          </w:tcPr>
+          <w:p>
+            <w:pPr>
+              <w:spacing w:before="40" w:after="40"/>
+            </w:pPr>
+            <w:r/>
+            <w:r>
+              <w:rPr>
+                <w:b w:val="0"/>
+                <w:i w:val="0"/>
+                <w:color w:val="1F2937"/>
+                <w:sz w:val="20"/>
+              </w:rPr>
+              <w:t>✅ merged (#139)</w:t>
+            </w:r>
+          </w:p>
+        </w:tc>
+      </w:tr>
+      <w:tr>
+        <w:tc>
+          <w:tcPr>
+            <w:tcW w:type="dxa" w:w="4320"/>
+            <w:shd w:val="clear" w:color="auto" w:fill="EEF2FF"/>
+            <w:tcBorders>
+              <w:top w:val="single" w:sz="4" w:space="0" w:color="C7D2FE"/>
+              <w:left w:val="single" w:sz="4" w:space="0" w:color="C7D2FE"/>
+              <w:bottom w:val="single" w:sz="4" w:space="0" w:color="C7D2FE"/>
+              <w:right w:val="single" w:sz="4" w:space="0" w:color="C7D2FE"/>
+            </w:tcBorders>
+          </w:tcPr>
+          <w:p>
+            <w:pPr>
+              <w:spacing w:before="40" w:after="40"/>
+            </w:pPr>
+            <w:r/>
+            <w:r>
+              <w:rPr>
+                <w:b w:val="0"/>
+                <w:i w:val="0"/>
+                <w:color w:val="1F2937"/>
+                <w:sz w:val="20"/>
+              </w:rPr>
+              <w:t>PARITY-06 Slack connector</w:t>
+            </w:r>
+          </w:p>
+        </w:tc>
+        <w:tc>
+          <w:tcPr>
+            <w:tcW w:type="dxa" w:w="4320"/>
+            <w:shd w:val="clear" w:color="auto" w:fill="EEF2FF"/>
+            <w:tcBorders>
+              <w:top w:val="single" w:sz="4" w:space="0" w:color="C7D2FE"/>
+              <w:left w:val="single" w:sz="4" w:space="0" w:color="C7D2FE"/>
+              <w:bottom w:val="single" w:sz="4" w:space="0" w:color="C7D2FE"/>
+              <w:right w:val="single" w:sz="4" w:space="0" w:color="C7D2FE"/>
+            </w:tcBorders>
+          </w:tcPr>
+          <w:p>
+            <w:pPr>
+              <w:spacing w:before="40" w:after="40"/>
+            </w:pPr>
+            <w:r/>
+            <w:r>
+              <w:rPr>
+                <w:b w:val="0"/>
+                <w:i w:val="0"/>
+                <w:color w:val="1F2937"/>
+                <w:sz w:val="20"/>
+              </w:rPr>
+              <w:t>✅ merged (#140)</w:t>
+            </w:r>
+          </w:p>
+        </w:tc>
+      </w:tr>
+      <w:tr>
+        <w:tc>
+          <w:tcPr>
+            <w:tcW w:type="dxa" w:w="4320"/>
+            <w:tcBorders>
+              <w:top w:val="single" w:sz="4" w:space="0" w:color="C7D2FE"/>
+              <w:left w:val="single" w:sz="4" w:space="0" w:color="C7D2FE"/>
+              <w:bottom w:val="single" w:sz="4" w:space="0" w:color="C7D2FE"/>
+              <w:right w:val="single" w:sz="4" w:space="0" w:color="C7D2FE"/>
+            </w:tcBorders>
+          </w:tcPr>
+          <w:p>
+            <w:pPr>
+              <w:spacing w:before="40" w:after="40"/>
+            </w:pPr>
+            <w:r/>
+            <w:r>
+              <w:rPr>
+                <w:b w:val="0"/>
+                <w:i w:val="0"/>
+                <w:color w:val="1F2937"/>
+                <w:sz w:val="20"/>
+              </w:rPr>
+              <w:t>PARITY-07 Broadcast announcements</w:t>
+            </w:r>
+          </w:p>
+        </w:tc>
+        <w:tc>
+          <w:tcPr>
+            <w:tcW w:type="dxa" w:w="4320"/>
+            <w:tcBorders>
+              <w:top w:val="single" w:sz="4" w:space="0" w:color="C7D2FE"/>
+              <w:left w:val="single" w:sz="4" w:space="0" w:color="C7D2FE"/>
+              <w:bottom w:val="single" w:sz="4" w:space="0" w:color="C7D2FE"/>
+              <w:right w:val="single" w:sz="4" w:space="0" w:color="C7D2FE"/>
+            </w:tcBorders>
+          </w:tcPr>
+          <w:p>
+            <w:pPr>
+              <w:spacing w:before="40" w:after="40"/>
+            </w:pPr>
+            <w:r/>
+            <w:r>
+              <w:rPr>
+                <w:b w:val="0"/>
+                <w:i w:val="0"/>
+                <w:color w:val="1F2937"/>
+                <w:sz w:val="20"/>
+              </w:rPr>
+              <w:t>✅ merged (#142)</w:t>
+            </w:r>
+          </w:p>
+        </w:tc>
+      </w:tr>
+      <w:tr>
+        <w:tc>
+          <w:tcPr>
+            <w:tcW w:type="dxa" w:w="4320"/>
+            <w:shd w:val="clear" w:color="auto" w:fill="EEF2FF"/>
+            <w:tcBorders>
+              <w:top w:val="single" w:sz="4" w:space="0" w:color="C7D2FE"/>
+              <w:left w:val="single" w:sz="4" w:space="0" w:color="C7D2FE"/>
+              <w:bottom w:val="single" w:sz="4" w:space="0" w:color="C7D2FE"/>
+              <w:right w:val="single" w:sz="4" w:space="0" w:color="C7D2FE"/>
+            </w:tcBorders>
+          </w:tcPr>
+          <w:p>
+            <w:pPr>
+              <w:spacing w:before="40" w:after="40"/>
+            </w:pPr>
+            <w:r/>
+            <w:r>
+              <w:rPr>
+                <w:b w:val="0"/>
+                <w:i w:val="0"/>
+                <w:color w:val="1F2937"/>
+                <w:sz w:val="20"/>
+              </w:rPr>
+              <w:t>PARITY-08 Promo/bonus credits</w:t>
+            </w:r>
+          </w:p>
+        </w:tc>
+        <w:tc>
+          <w:tcPr>
+            <w:tcW w:type="dxa" w:w="4320"/>
+            <w:shd w:val="clear" w:color="auto" w:fill="EEF2FF"/>
+            <w:tcBorders>
+              <w:top w:val="single" w:sz="4" w:space="0" w:color="C7D2FE"/>
+              <w:left w:val="single" w:sz="4" w:space="0" w:color="C7D2FE"/>
+              <w:bottom w:val="single" w:sz="4" w:space="0" w:color="C7D2FE"/>
+              <w:right w:val="single" w:sz="4" w:space="0" w:color="C7D2FE"/>
+            </w:tcBorders>
+          </w:tcPr>
+          <w:p>
+            <w:pPr>
+              <w:spacing w:before="40" w:after="40"/>
+            </w:pPr>
+            <w:r/>
+            <w:r>
+              <w:rPr>
+                <w:b w:val="0"/>
+                <w:i w:val="0"/>
+                <w:color w:val="1F2937"/>
+                <w:sz w:val="20"/>
+              </w:rPr>
+              <w:t>✅ merged (#143)</w:t>
+            </w:r>
+          </w:p>
+        </w:tc>
+      </w:tr>
+      <w:tr>
+        <w:tc>
+          <w:tcPr>
+            <w:tcW w:type="dxa" w:w="4320"/>
+            <w:tcBorders>
+              <w:top w:val="single" w:sz="4" w:space="0" w:color="C7D2FE"/>
+              <w:left w:val="single" w:sz="4" w:space="0" w:color="C7D2FE"/>
+              <w:bottom w:val="single" w:sz="4" w:space="0" w:color="C7D2FE"/>
+              <w:right w:val="single" w:sz="4" w:space="0" w:color="C7D2FE"/>
+            </w:tcBorders>
+          </w:tcPr>
+          <w:p>
+            <w:pPr>
+              <w:spacing w:before="40" w:after="40"/>
+            </w:pPr>
+            <w:r/>
+            <w:r>
+              <w:rPr>
+                <w:b w:val="0"/>
+                <w:i w:val="0"/>
+                <w:color w:val="1F2937"/>
+                <w:sz w:val="20"/>
+              </w:rPr>
+              <w:t>PARITY-09 In-app API reference</w:t>
+            </w:r>
+          </w:p>
+        </w:tc>
+        <w:tc>
+          <w:tcPr>
+            <w:tcW w:type="dxa" w:w="4320"/>
+            <w:tcBorders>
+              <w:top w:val="single" w:sz="4" w:space="0" w:color="C7D2FE"/>
+              <w:left w:val="single" w:sz="4" w:space="0" w:color="C7D2FE"/>
+              <w:bottom w:val="single" w:sz="4" w:space="0" w:color="C7D2FE"/>
+              <w:right w:val="single" w:sz="4" w:space="0" w:color="C7D2FE"/>
+            </w:tcBorders>
+          </w:tcPr>
+          <w:p>
+            <w:pPr>
+              <w:spacing w:before="40" w:after="40"/>
+            </w:pPr>
+            <w:r/>
+            <w:r>
+              <w:rPr>
+                <w:b w:val="0"/>
+                <w:i w:val="0"/>
+                <w:color w:val="1F2937"/>
+                <w:sz w:val="20"/>
+              </w:rPr>
+              <w:t>✅ merged (#144)</w:t>
+            </w:r>
+          </w:p>
+        </w:tc>
+      </w:tr>
+      <w:tr>
+        <w:tc>
+          <w:tcPr>
+            <w:tcW w:type="dxa" w:w="4320"/>
+            <w:shd w:val="clear" w:color="auto" w:fill="EEF2FF"/>
+            <w:tcBorders>
+              <w:top w:val="single" w:sz="4" w:space="0" w:color="C7D2FE"/>
+              <w:left w:val="single" w:sz="4" w:space="0" w:color="C7D2FE"/>
+              <w:bottom w:val="single" w:sz="4" w:space="0" w:color="C7D2FE"/>
+              <w:right w:val="single" w:sz="4" w:space="0" w:color="C7D2FE"/>
+            </w:tcBorders>
+          </w:tcPr>
+          <w:p>
+            <w:pPr>
+              <w:spacing w:before="40" w:after="40"/>
+            </w:pPr>
+            <w:r/>
+            <w:r>
+              <w:rPr>
+                <w:b w:val="0"/>
+                <w:i w:val="0"/>
+                <w:color w:val="1F2937"/>
+                <w:sz w:val="20"/>
+              </w:rPr>
+              <w:t>PARITY-10 Campaign retry (enhancements batch)</w:t>
+            </w:r>
+          </w:p>
+        </w:tc>
+        <w:tc>
+          <w:tcPr>
+            <w:tcW w:type="dxa" w:w="4320"/>
+            <w:shd w:val="clear" w:color="auto" w:fill="EEF2FF"/>
+            <w:tcBorders>
+              <w:top w:val="single" w:sz="4" w:space="0" w:color="C7D2FE"/>
+              <w:left w:val="single" w:sz="4" w:space="0" w:color="C7D2FE"/>
+              <w:bottom w:val="single" w:sz="4" w:space="0" w:color="C7D2FE"/>
+              <w:right w:val="single" w:sz="4" w:space="0" w:color="C7D2FE"/>
+            </w:tcBorders>
+          </w:tcPr>
+          <w:p>
+            <w:pPr>
+              <w:spacing w:before="40" w:after="40"/>
+            </w:pPr>
+            <w:r/>
+            <w:r>
+              <w:rPr>
+                <w:b w:val="0"/>
+                <w:i w:val="0"/>
+                <w:color w:val="1F2937"/>
+                <w:sz w:val="20"/>
+              </w:rPr>
+              <w:t>✅ merged (#145)</w:t>
+            </w:r>
+          </w:p>
+        </w:tc>
+      </w:tr>
+      <w:tr>
+        <w:tc>
+          <w:tcPr>
+            <w:tcW w:type="dxa" w:w="4320"/>
+            <w:tcBorders>
+              <w:top w:val="single" w:sz="4" w:space="0" w:color="C7D2FE"/>
+              <w:left w:val="single" w:sz="4" w:space="0" w:color="C7D2FE"/>
+              <w:bottom w:val="single" w:sz="4" w:space="0" w:color="C7D2FE"/>
+              <w:right w:val="single" w:sz="4" w:space="0" w:color="C7D2FE"/>
+            </w:tcBorders>
+          </w:tcPr>
+          <w:p>
+            <w:pPr>
+              <w:spacing w:before="40" w:after="40"/>
+            </w:pPr>
+            <w:r/>
+            <w:r>
+              <w:rPr>
+                <w:b w:val="0"/>
+                <w:i w:val="0"/>
+                <w:color w:val="1F2937"/>
+                <w:sz w:val="20"/>
+              </w:rPr>
               <w:t>PARITY-11 Self-host installer + update checker</w:t>
             </w:r>
           </w:p>
@@ -11487,7 +11933,7 @@
                 <w:color w:val="1F2937"/>
                 <w:sz w:val="20"/>
               </w:rPr>
-              <w:t>⏳ baaki</w:t>
+              <w:t>✅ merged (#146)</w:t>
             </w:r>
           </w:p>
         </w:tc>
@@ -11497,6 +11943,29 @@
       <w:pPr>
         <w:spacing w:after="40"/>
       </w:pPr>
+    </w:p>
+    <w:p>
+      <w:pPr>
+        <w:spacing w:after="80"/>
+      </w:pPr>
+      <w:r>
+        <w:rPr>
+          <w:b/>
+          <w:i w:val="0"/>
+          <w:color w:val="1F2937"/>
+          <w:sz w:val="21"/>
+        </w:rPr>
+        <w:t>Tracked follow-ups (PARITY-10, minor):</w:t>
+      </w:r>
+      <w:r>
+        <w:rPr>
+          <w:b w:val="0"/>
+          <w:i w:val="0"/>
+          <w:color w:val="1F2937"/>
+          <w:sz w:val="21"/>
+        </w:rPr>
+        <w:t xml:space="preserve"> unified notification matrix, analytics PDF + trend tiles, per-run manual retry.</w:t>
+      </w:r>
     </w:p>
     <w:p>
       <w:pPr>

</xml_diff>

<commit_message>
docs: refresh features catalog for the 3 PARITY-10 follow-ups
Mark the follow-ups as shipped in PROJECT-FEATURES-EXPLAINED.md (+ regenerated
.docx): analytics trend tiles + CSV/PDF export, workflow run-logs + failed-run
retry, and the unified event×channel notification matrix.

Co-Authored-By: Claude Opus 4.8 (1M context) <noreply@anthropic.com>
</commit_message>
<xml_diff>
--- a/docs/PROJECT-FEATURES-EXPLAINED.docx
+++ b/docs/PROJECT-FEATURES-EXPLAINED.docx
@@ -4720,7 +4720,7 @@
                 <w:color w:val="1F2937"/>
                 <w:sz w:val="20"/>
               </w:rPr>
-              <w:t>Call dashboards, metrics, trends.</w:t>
+              <w:t>Call dashboards, metrics, weekly trend tiles, CSV + PDF export.</w:t>
             </w:r>
           </w:p>
         </w:tc>
@@ -6150,7 +6150,7 @@
                 <w:color w:val="1F2937"/>
                 <w:sz w:val="20"/>
               </w:rPr>
-              <w:t>Automation workflow builder/execution.</w:t>
+              <w:t>Automation workflow builder/execution + run-logs + failed-run retry.</w:t>
             </w:r>
           </w:p>
         </w:tc>
@@ -6287,7 +6287,7 @@
                 <w:color w:val="1F2937"/>
                 <w:sz w:val="20"/>
               </w:rPr>
-              <w:t>marketplace</w:t>
+              <w:t>Notification matrix (followup)</w:t>
             </w:r>
           </w:p>
         </w:tc>
@@ -6313,7 +6313,7 @@
                 <w:color w:val="1F2937"/>
                 <w:sz w:val="20"/>
               </w:rPr>
-              <w:t>Integrations/automations marketplace.</w:t>
+              <w:t>Per-tenant event×channel grid — kaunsa event kaunse channel (webhook/Slack) ko notify kare.</w:t>
             </w:r>
           </w:p>
         </w:tc>
@@ -6368,7 +6368,7 @@
                 <w:color w:val="1F2937"/>
                 <w:sz w:val="20"/>
               </w:rPr>
-              <w:t>mcp module</w:t>
+              <w:t>marketplace</w:t>
             </w:r>
           </w:p>
         </w:tc>
@@ -6395,7 +6395,7 @@
                 <w:color w:val="1F2937"/>
                 <w:sz w:val="20"/>
               </w:rPr>
-              <w:t>Model Context Protocol — external tools agent ko dena.</w:t>
+              <w:t>Integrations/automations marketplace.</w:t>
             </w:r>
           </w:p>
         </w:tc>
@@ -6422,7 +6422,7 @@
                 <w:color w:val="1F2937"/>
                 <w:sz w:val="20"/>
               </w:rPr>
-              <w:t>🏠 Native (open standard)</w:t>
+              <w:t>🏠 Native</w:t>
             </w:r>
           </w:p>
         </w:tc>
@@ -6450,7 +6450,7 @@
                 <w:color w:val="1F2937"/>
                 <w:sz w:val="20"/>
               </w:rPr>
-              <w:t>avatars</w:t>
+              <w:t>mcp module</w:t>
             </w:r>
           </w:p>
         </w:tc>
@@ -6476,7 +6476,7 @@
                 <w:color w:val="1F2937"/>
                 <w:sz w:val="20"/>
               </w:rPr>
-              <w:t>Video avatar (HeyGen/D-ID/Tavus) — gated, voice fallback.</w:t>
+              <w:t>Model Context Protocol — external tools agent ko dena.</w:t>
             </w:r>
           </w:p>
         </w:tc>
@@ -6502,7 +6502,7 @@
                 <w:color w:val="1F2937"/>
                 <w:sz w:val="20"/>
               </w:rPr>
-              <w:t>🔌 3rd-party (gated)</w:t>
+              <w:t>🏠 Native (open standard)</w:t>
             </w:r>
           </w:p>
         </w:tc>
@@ -6531,7 +6531,7 @@
                 <w:color w:val="1F2937"/>
                 <w:sz w:val="20"/>
               </w:rPr>
-              <w:t>biometrics</w:t>
+              <w:t>avatars</w:t>
             </w:r>
           </w:p>
         </w:tc>
@@ -6558,7 +6558,7 @@
                 <w:color w:val="1F2937"/>
                 <w:sz w:val="20"/>
               </w:rPr>
-              <w:t>Voice biometrics / voiceprint auth — default-deny, gated.</w:t>
+              <w:t>Video avatar (HeyGen/D-ID/Tavus) — gated, voice fallback.</w:t>
             </w:r>
           </w:p>
         </w:tc>
@@ -6566,6 +6566,86 @@
           <w:tcPr>
             <w:tcW w:type="dxa" w:w="2880"/>
             <w:shd w:val="clear" w:color="auto" w:fill="EEF2FF"/>
+            <w:tcBorders>
+              <w:top w:val="single" w:sz="4" w:space="0" w:color="C7D2FE"/>
+              <w:left w:val="single" w:sz="4" w:space="0" w:color="C7D2FE"/>
+              <w:bottom w:val="single" w:sz="4" w:space="0" w:color="C7D2FE"/>
+              <w:right w:val="single" w:sz="4" w:space="0" w:color="C7D2FE"/>
+            </w:tcBorders>
+          </w:tcPr>
+          <w:p>
+            <w:pPr>
+              <w:spacing w:before="40" w:after="40"/>
+            </w:pPr>
+            <w:r/>
+            <w:r>
+              <w:rPr>
+                <w:b w:val="0"/>
+                <w:i w:val="0"/>
+                <w:color w:val="1F2937"/>
+                <w:sz w:val="20"/>
+              </w:rPr>
+              <w:t>🔌 3rd-party (gated)</w:t>
+            </w:r>
+          </w:p>
+        </w:tc>
+      </w:tr>
+      <w:tr>
+        <w:tc>
+          <w:tcPr>
+            <w:tcW w:type="dxa" w:w="2880"/>
+            <w:tcBorders>
+              <w:top w:val="single" w:sz="4" w:space="0" w:color="C7D2FE"/>
+              <w:left w:val="single" w:sz="4" w:space="0" w:color="C7D2FE"/>
+              <w:bottom w:val="single" w:sz="4" w:space="0" w:color="C7D2FE"/>
+              <w:right w:val="single" w:sz="4" w:space="0" w:color="C7D2FE"/>
+            </w:tcBorders>
+          </w:tcPr>
+          <w:p>
+            <w:pPr>
+              <w:spacing w:before="40" w:after="40"/>
+            </w:pPr>
+            <w:r/>
+            <w:r>
+              <w:rPr>
+                <w:b w:val="0"/>
+                <w:i w:val="0"/>
+                <w:color w:val="1F2937"/>
+                <w:sz w:val="20"/>
+              </w:rPr>
+              <w:t>biometrics</w:t>
+            </w:r>
+          </w:p>
+        </w:tc>
+        <w:tc>
+          <w:tcPr>
+            <w:tcW w:type="dxa" w:w="2880"/>
+            <w:tcBorders>
+              <w:top w:val="single" w:sz="4" w:space="0" w:color="C7D2FE"/>
+              <w:left w:val="single" w:sz="4" w:space="0" w:color="C7D2FE"/>
+              <w:bottom w:val="single" w:sz="4" w:space="0" w:color="C7D2FE"/>
+              <w:right w:val="single" w:sz="4" w:space="0" w:color="C7D2FE"/>
+            </w:tcBorders>
+          </w:tcPr>
+          <w:p>
+            <w:pPr>
+              <w:spacing w:before="40" w:after="40"/>
+            </w:pPr>
+            <w:r/>
+            <w:r>
+              <w:rPr>
+                <w:b w:val="0"/>
+                <w:i w:val="0"/>
+                <w:color w:val="1F2937"/>
+                <w:sz w:val="20"/>
+              </w:rPr>
+              <w:t>Voice biometrics / voiceprint auth — default-deny, gated.</w:t>
+            </w:r>
+          </w:p>
+        </w:tc>
+        <w:tc>
+          <w:tcPr>
+            <w:tcW w:type="dxa" w:w="2880"/>
             <w:tcBorders>
               <w:top w:val="single" w:sz="4" w:space="0" w:color="C7D2FE"/>
               <w:left w:val="single" w:sz="4" w:space="0" w:color="C7D2FE"/>
@@ -11955,7 +12035,7 @@
           <w:color w:val="1F2937"/>
           <w:sz w:val="21"/>
         </w:rPr>
-        <w:t>Tracked follow-ups (PARITY-10, minor):</w:t>
+        <w:t>PARITY-10 follow-ups — ✅ all shipped:</w:t>
       </w:r>
       <w:r>
         <w:rPr>
@@ -11964,7 +12044,7 @@
           <w:color w:val="1F2937"/>
           <w:sz w:val="21"/>
         </w:rPr>
-        <w:t xml:space="preserve"> unified notification matrix, analytics PDF + trend tiles, per-run manual retry.</w:t>
+        <w:t xml:space="preserve"> workflow failed-run retry (#148), analytics trend tiles + PDF export (#149), unified notification matrix (#150).</w:t>
       </w:r>
     </w:p>
     <w:p>

</xml_diff>

<commit_message>
docs: refresh features catalog for the 3 PARITY-10 follow-ups (#151)
Mark the follow-ups as shipped in PROJECT-FEATURES-EXPLAINED.md (+ regenerated
.docx): analytics trend tiles + CSV/PDF export, workflow run-logs + failed-run
retry, and the unified event×channel notification matrix.

Co-authored-by: thequantcoder <guptaarpita1702@gmail.com>
Co-authored-by: Claude Opus 4.8 (1M context) <noreply@anthropic.com>
</commit_message>
<xml_diff>
--- a/docs/PROJECT-FEATURES-EXPLAINED.docx
+++ b/docs/PROJECT-FEATURES-EXPLAINED.docx
@@ -4720,7 +4720,7 @@
                 <w:color w:val="1F2937"/>
                 <w:sz w:val="20"/>
               </w:rPr>
-              <w:t>Call dashboards, metrics, trends.</w:t>
+              <w:t>Call dashboards, metrics, weekly trend tiles, CSV + PDF export.</w:t>
             </w:r>
           </w:p>
         </w:tc>
@@ -6150,7 +6150,7 @@
                 <w:color w:val="1F2937"/>
                 <w:sz w:val="20"/>
               </w:rPr>
-              <w:t>Automation workflow builder/execution.</w:t>
+              <w:t>Automation workflow builder/execution + run-logs + failed-run retry.</w:t>
             </w:r>
           </w:p>
         </w:tc>
@@ -6287,7 +6287,7 @@
                 <w:color w:val="1F2937"/>
                 <w:sz w:val="20"/>
               </w:rPr>
-              <w:t>marketplace</w:t>
+              <w:t>Notification matrix (followup)</w:t>
             </w:r>
           </w:p>
         </w:tc>
@@ -6313,7 +6313,7 @@
                 <w:color w:val="1F2937"/>
                 <w:sz w:val="20"/>
               </w:rPr>
-              <w:t>Integrations/automations marketplace.</w:t>
+              <w:t>Per-tenant event×channel grid — kaunsa event kaunse channel (webhook/Slack) ko notify kare.</w:t>
             </w:r>
           </w:p>
         </w:tc>
@@ -6368,7 +6368,7 @@
                 <w:color w:val="1F2937"/>
                 <w:sz w:val="20"/>
               </w:rPr>
-              <w:t>mcp module</w:t>
+              <w:t>marketplace</w:t>
             </w:r>
           </w:p>
         </w:tc>
@@ -6395,7 +6395,7 @@
                 <w:color w:val="1F2937"/>
                 <w:sz w:val="20"/>
               </w:rPr>
-              <w:t>Model Context Protocol — external tools agent ko dena.</w:t>
+              <w:t>Integrations/automations marketplace.</w:t>
             </w:r>
           </w:p>
         </w:tc>
@@ -6422,7 +6422,7 @@
                 <w:color w:val="1F2937"/>
                 <w:sz w:val="20"/>
               </w:rPr>
-              <w:t>🏠 Native (open standard)</w:t>
+              <w:t>🏠 Native</w:t>
             </w:r>
           </w:p>
         </w:tc>
@@ -6450,7 +6450,7 @@
                 <w:color w:val="1F2937"/>
                 <w:sz w:val="20"/>
               </w:rPr>
-              <w:t>avatars</w:t>
+              <w:t>mcp module</w:t>
             </w:r>
           </w:p>
         </w:tc>
@@ -6476,7 +6476,7 @@
                 <w:color w:val="1F2937"/>
                 <w:sz w:val="20"/>
               </w:rPr>
-              <w:t>Video avatar (HeyGen/D-ID/Tavus) — gated, voice fallback.</w:t>
+              <w:t>Model Context Protocol — external tools agent ko dena.</w:t>
             </w:r>
           </w:p>
         </w:tc>
@@ -6502,7 +6502,7 @@
                 <w:color w:val="1F2937"/>
                 <w:sz w:val="20"/>
               </w:rPr>
-              <w:t>🔌 3rd-party (gated)</w:t>
+              <w:t>🏠 Native (open standard)</w:t>
             </w:r>
           </w:p>
         </w:tc>
@@ -6531,7 +6531,7 @@
                 <w:color w:val="1F2937"/>
                 <w:sz w:val="20"/>
               </w:rPr>
-              <w:t>biometrics</w:t>
+              <w:t>avatars</w:t>
             </w:r>
           </w:p>
         </w:tc>
@@ -6558,7 +6558,7 @@
                 <w:color w:val="1F2937"/>
                 <w:sz w:val="20"/>
               </w:rPr>
-              <w:t>Voice biometrics / voiceprint auth — default-deny, gated.</w:t>
+              <w:t>Video avatar (HeyGen/D-ID/Tavus) — gated, voice fallback.</w:t>
             </w:r>
           </w:p>
         </w:tc>
@@ -6566,6 +6566,86 @@
           <w:tcPr>
             <w:tcW w:type="dxa" w:w="2880"/>
             <w:shd w:val="clear" w:color="auto" w:fill="EEF2FF"/>
+            <w:tcBorders>
+              <w:top w:val="single" w:sz="4" w:space="0" w:color="C7D2FE"/>
+              <w:left w:val="single" w:sz="4" w:space="0" w:color="C7D2FE"/>
+              <w:bottom w:val="single" w:sz="4" w:space="0" w:color="C7D2FE"/>
+              <w:right w:val="single" w:sz="4" w:space="0" w:color="C7D2FE"/>
+            </w:tcBorders>
+          </w:tcPr>
+          <w:p>
+            <w:pPr>
+              <w:spacing w:before="40" w:after="40"/>
+            </w:pPr>
+            <w:r/>
+            <w:r>
+              <w:rPr>
+                <w:b w:val="0"/>
+                <w:i w:val="0"/>
+                <w:color w:val="1F2937"/>
+                <w:sz w:val="20"/>
+              </w:rPr>
+              <w:t>🔌 3rd-party (gated)</w:t>
+            </w:r>
+          </w:p>
+        </w:tc>
+      </w:tr>
+      <w:tr>
+        <w:tc>
+          <w:tcPr>
+            <w:tcW w:type="dxa" w:w="2880"/>
+            <w:tcBorders>
+              <w:top w:val="single" w:sz="4" w:space="0" w:color="C7D2FE"/>
+              <w:left w:val="single" w:sz="4" w:space="0" w:color="C7D2FE"/>
+              <w:bottom w:val="single" w:sz="4" w:space="0" w:color="C7D2FE"/>
+              <w:right w:val="single" w:sz="4" w:space="0" w:color="C7D2FE"/>
+            </w:tcBorders>
+          </w:tcPr>
+          <w:p>
+            <w:pPr>
+              <w:spacing w:before="40" w:after="40"/>
+            </w:pPr>
+            <w:r/>
+            <w:r>
+              <w:rPr>
+                <w:b w:val="0"/>
+                <w:i w:val="0"/>
+                <w:color w:val="1F2937"/>
+                <w:sz w:val="20"/>
+              </w:rPr>
+              <w:t>biometrics</w:t>
+            </w:r>
+          </w:p>
+        </w:tc>
+        <w:tc>
+          <w:tcPr>
+            <w:tcW w:type="dxa" w:w="2880"/>
+            <w:tcBorders>
+              <w:top w:val="single" w:sz="4" w:space="0" w:color="C7D2FE"/>
+              <w:left w:val="single" w:sz="4" w:space="0" w:color="C7D2FE"/>
+              <w:bottom w:val="single" w:sz="4" w:space="0" w:color="C7D2FE"/>
+              <w:right w:val="single" w:sz="4" w:space="0" w:color="C7D2FE"/>
+            </w:tcBorders>
+          </w:tcPr>
+          <w:p>
+            <w:pPr>
+              <w:spacing w:before="40" w:after="40"/>
+            </w:pPr>
+            <w:r/>
+            <w:r>
+              <w:rPr>
+                <w:b w:val="0"/>
+                <w:i w:val="0"/>
+                <w:color w:val="1F2937"/>
+                <w:sz w:val="20"/>
+              </w:rPr>
+              <w:t>Voice biometrics / voiceprint auth — default-deny, gated.</w:t>
+            </w:r>
+          </w:p>
+        </w:tc>
+        <w:tc>
+          <w:tcPr>
+            <w:tcW w:type="dxa" w:w="2880"/>
             <w:tcBorders>
               <w:top w:val="single" w:sz="4" w:space="0" w:color="C7D2FE"/>
               <w:left w:val="single" w:sz="4" w:space="0" w:color="C7D2FE"/>
@@ -11955,7 +12035,7 @@
           <w:color w:val="1F2937"/>
           <w:sz w:val="21"/>
         </w:rPr>
-        <w:t>Tracked follow-ups (PARITY-10, minor):</w:t>
+        <w:t>PARITY-10 follow-ups — ✅ all shipped:</w:t>
       </w:r>
       <w:r>
         <w:rPr>
@@ -11964,7 +12044,7 @@
           <w:color w:val="1F2937"/>
           <w:sz w:val="21"/>
         </w:rPr>
-        <w:t xml:space="preserve"> unified notification matrix, analytics PDF + trend tiles, per-run manual retry.</w:t>
+        <w:t xml:space="preserve"> workflow failed-run retry (#148), analytics trend tiles + PDF export (#149), unified notification matrix (#150).</w:t>
       </w:r>
     </w:p>
     <w:p>

</xml_diff>

<commit_message>
docs: catalog WhatsApp inbound AI answering GA + live-call view (WAC-04)
Append the WAC-04 feature row to PROJECT-FEATURES-EXPLAINED.md (Hinglish, the
living catalog convention) + regenerate the .docx.

Co-Authored-By: Claude Opus 4.8 (1M context) <noreply@anthropic.com>
</commit_message>
<xml_diff>
--- a/docs/PROJECT-FEATURES-EXPLAINED.docx
+++ b/docs/PROJECT-FEATURES-EXPLAINED.docx
@@ -3129,6 +3129,165 @@
                 <w:sz w:val="20"/>
               </w:rPr>
               <w:t>🔀 Hybrid (aiortc)</w:t>
+            </w:r>
+          </w:p>
+        </w:tc>
+      </w:tr>
+      <w:tr>
+        <w:tc>
+          <w:tcPr>
+            <w:tcW w:type="dxa" w:w="2880"/>
+            <w:shd w:val="clear" w:color="auto" w:fill="EEF2FF"/>
+            <w:tcBorders>
+              <w:top w:val="single" w:sz="4" w:space="0" w:color="C7D2FE"/>
+              <w:left w:val="single" w:sz="4" w:space="0" w:color="C7D2FE"/>
+              <w:bottom w:val="single" w:sz="4" w:space="0" w:color="C7D2FE"/>
+              <w:right w:val="single" w:sz="4" w:space="0" w:color="C7D2FE"/>
+            </w:tcBorders>
+          </w:tcPr>
+          <w:p>
+            <w:pPr>
+              <w:spacing w:before="40" w:after="40"/>
+            </w:pPr>
+            <w:r/>
+            <w:r>
+              <w:rPr>
+                <w:b w:val="0"/>
+                <w:i w:val="0"/>
+                <w:color w:val="1F2937"/>
+                <w:sz w:val="20"/>
+              </w:rPr>
+              <w:t>WhatsApp Calling — inbound AI answering GA + live-call view (WAC-04)</w:t>
+            </w:r>
+          </w:p>
+        </w:tc>
+        <w:tc>
+          <w:tcPr>
+            <w:tcW w:type="dxa" w:w="2880"/>
+            <w:shd w:val="clear" w:color="auto" w:fill="EEF2FF"/>
+            <w:tcBorders>
+              <w:top w:val="single" w:sz="4" w:space="0" w:color="C7D2FE"/>
+              <w:left w:val="single" w:sz="4" w:space="0" w:color="C7D2FE"/>
+              <w:bottom w:val="single" w:sz="4" w:space="0" w:color="C7D2FE"/>
+              <w:right w:val="single" w:sz="4" w:space="0" w:color="C7D2FE"/>
+            </w:tcBorders>
+          </w:tcPr>
+          <w:p>
+            <w:pPr>
+              <w:spacing w:before="40" w:after="40"/>
+            </w:pPr>
+            <w:r/>
+            <w:r>
+              <w:rPr>
+                <w:b w:val="0"/>
+                <w:i w:val="0"/>
+                <w:color w:val="1F2937"/>
+                <w:sz w:val="20"/>
+              </w:rPr>
+              <w:t>Customer WhatsApp par "call" tap kare → sahi agent context ke saath answer kare: number→agent routing (PhoneNumber assignment reuse), tapped-button context (</w:t>
+            </w:r>
+            <w:r>
+              <w:rPr>
+                <w:rFonts w:ascii="Consolas" w:hAnsi="Consolas"/>
+                <w:b w:val="0"/>
+                <w:i w:val="0"/>
+                <w:color w:val="1F2937"/>
+                <w:sz w:val="20"/>
+              </w:rPr>
+              <w:t>intent</w:t>
+            </w:r>
+            <w:r>
+              <w:rPr>
+                <w:b w:val="0"/>
+                <w:i w:val="0"/>
+                <w:color w:val="1F2937"/>
+                <w:sz w:val="20"/>
+              </w:rPr>
+              <w:t>/</w:t>
+            </w:r>
+            <w:r>
+              <w:rPr>
+                <w:rFonts w:ascii="Consolas" w:hAnsi="Consolas"/>
+                <w:b w:val="0"/>
+                <w:i w:val="0"/>
+                <w:color w:val="1F2937"/>
+                <w:sz w:val="20"/>
+              </w:rPr>
+              <w:t>campaign</w:t>
+            </w:r>
+            <w:r>
+              <w:rPr>
+                <w:b w:val="0"/>
+                <w:i w:val="0"/>
+                <w:color w:val="1F2937"/>
+                <w:sz w:val="20"/>
+              </w:rPr>
+              <w:t>/</w:t>
+            </w:r>
+            <w:r>
+              <w:rPr>
+                <w:rFonts w:ascii="Consolas" w:hAnsi="Consolas"/>
+                <w:b w:val="0"/>
+                <w:i w:val="0"/>
+                <w:color w:val="1F2937"/>
+                <w:sz w:val="20"/>
+              </w:rPr>
+              <w:t>reference</w:t>
+            </w:r>
+            <w:r>
+              <w:rPr>
+                <w:b w:val="0"/>
+                <w:i w:val="0"/>
+                <w:color w:val="1F2937"/>
+                <w:sz w:val="20"/>
+              </w:rPr>
+              <w:t xml:space="preserve">) agent ke system prompt mein inject, calling-hours gate (tz-correct, band ho to graceful reject), aur ek unified </w:t>
+            </w:r>
+            <w:r>
+              <w:rPr>
+                <w:rFonts w:ascii="Consolas" w:hAnsi="Consolas"/>
+                <w:b w:val="0"/>
+                <w:i w:val="0"/>
+                <w:color w:val="1F2937"/>
+                <w:sz w:val="20"/>
+              </w:rPr>
+              <w:t>Call(channel=WHATSAPP)</w:t>
+            </w:r>
+            <w:r>
+              <w:rPr>
+                <w:b w:val="0"/>
+                <w:i w:val="0"/>
+                <w:color w:val="1F2937"/>
+                <w:sz w:val="20"/>
+              </w:rPr>
+              <w:t xml:space="preserve"> khul ke recording/transcription/analytics/cost mein flow kare. Web: signature cyan waveform wala live-call view (reduced-motion safe) + Calls feed channel filter (All·Phone·Web·WhatsApp) + WhatsApp badge.</w:t>
+            </w:r>
+          </w:p>
+        </w:tc>
+        <w:tc>
+          <w:tcPr>
+            <w:tcW w:type="dxa" w:w="2880"/>
+            <w:shd w:val="clear" w:color="auto" w:fill="EEF2FF"/>
+            <w:tcBorders>
+              <w:top w:val="single" w:sz="4" w:space="0" w:color="C7D2FE"/>
+              <w:left w:val="single" w:sz="4" w:space="0" w:color="C7D2FE"/>
+              <w:bottom w:val="single" w:sz="4" w:space="0" w:color="C7D2FE"/>
+              <w:right w:val="single" w:sz="4" w:space="0" w:color="C7D2FE"/>
+            </w:tcBorders>
+          </w:tcPr>
+          <w:p>
+            <w:pPr>
+              <w:spacing w:before="40" w:after="40"/>
+            </w:pPr>
+            <w:r/>
+            <w:r>
+              <w:rPr>
+                <w:b w:val="0"/>
+                <w:i w:val="0"/>
+                <w:color w:val="1F2937"/>
+                <w:sz w:val="20"/>
+              </w:rPr>
+              <w:t>🏠 Native (media gated)</w:t>
             </w:r>
           </w:p>
         </w:tc>

</xml_diff>

<commit_message>
docs: catalog WhatsApp consented outbound + permission governor (WAC-08)
Co-Authored-By: Claude Opus 4.8 (1M context) <noreply@anthropic.com>
</commit_message>
<xml_diff>
--- a/docs/PROJECT-FEATURES-EXPLAINED.docx
+++ b/docs/PROJECT-FEATURES-EXPLAINED.docx
@@ -3268,6 +3268,123 @@
           <w:tcPr>
             <w:tcW w:type="dxa" w:w="2880"/>
             <w:shd w:val="clear" w:color="auto" w:fill="EEF2FF"/>
+            <w:tcBorders>
+              <w:top w:val="single" w:sz="4" w:space="0" w:color="C7D2FE"/>
+              <w:left w:val="single" w:sz="4" w:space="0" w:color="C7D2FE"/>
+              <w:bottom w:val="single" w:sz="4" w:space="0" w:color="C7D2FE"/>
+              <w:right w:val="single" w:sz="4" w:space="0" w:color="C7D2FE"/>
+            </w:tcBorders>
+          </w:tcPr>
+          <w:p>
+            <w:pPr>
+              <w:spacing w:before="40" w:after="40"/>
+            </w:pPr>
+            <w:r/>
+            <w:r>
+              <w:rPr>
+                <w:b w:val="0"/>
+                <w:i w:val="0"/>
+                <w:color w:val="1F2937"/>
+                <w:sz w:val="20"/>
+              </w:rPr>
+              <w:t>🏠 Native (media gated)</w:t>
+            </w:r>
+          </w:p>
+        </w:tc>
+      </w:tr>
+      <w:tr>
+        <w:tc>
+          <w:tcPr>
+            <w:tcW w:type="dxa" w:w="2880"/>
+            <w:tcBorders>
+              <w:top w:val="single" w:sz="4" w:space="0" w:color="C7D2FE"/>
+              <w:left w:val="single" w:sz="4" w:space="0" w:color="C7D2FE"/>
+              <w:bottom w:val="single" w:sz="4" w:space="0" w:color="C7D2FE"/>
+              <w:right w:val="single" w:sz="4" w:space="0" w:color="C7D2FE"/>
+            </w:tcBorders>
+          </w:tcPr>
+          <w:p>
+            <w:pPr>
+              <w:spacing w:before="40" w:after="40"/>
+            </w:pPr>
+            <w:r/>
+            <w:r>
+              <w:rPr>
+                <w:b w:val="0"/>
+                <w:i w:val="0"/>
+                <w:color w:val="1F2937"/>
+                <w:sz w:val="20"/>
+              </w:rPr>
+              <w:t>WhatsApp Calling — consented outbound + permission governor (WAC-08)</w:t>
+            </w:r>
+          </w:p>
+        </w:tc>
+        <w:tc>
+          <w:tcPr>
+            <w:tcW w:type="dxa" w:w="2880"/>
+            <w:tcBorders>
+              <w:top w:val="single" w:sz="4" w:space="0" w:color="C7D2FE"/>
+              <w:left w:val="single" w:sz="4" w:space="0" w:color="C7D2FE"/>
+              <w:bottom w:val="single" w:sz="4" w:space="0" w:color="C7D2FE"/>
+              <w:right w:val="single" w:sz="4" w:space="0" w:color="C7D2FE"/>
+            </w:tcBorders>
+          </w:tcPr>
+          <w:p>
+            <w:pPr>
+              <w:spacing w:before="40" w:after="40"/>
+            </w:pPr>
+            <w:r/>
+            <w:r>
+              <w:rPr>
+                <w:b w:val="0"/>
+                <w:i w:val="0"/>
+                <w:color w:val="1F2937"/>
+                <w:sz w:val="20"/>
+              </w:rPr>
+              <w:t xml:space="preserve">AI agent business→user WhatsApp call kar sake — par sirf consent ke saath, poori tarah guard-railed. Permission engine: temporary(7d)/permanent grant track (Meta ka expiry webhook nahi → local clock se lazily expire), 4-unanswered auto-revoke back-off, 1/24h+2/7d request send-caps, ≤100 connected/24h cap, US/CA/EG/VN/NG business-number block, DNC — sab </w:t>
+            </w:r>
+            <w:r>
+              <w:rPr>
+                <w:b/>
+                <w:i w:val="0"/>
+                <w:color w:val="1F2937"/>
+                <w:sz w:val="20"/>
+              </w:rPr>
+              <w:t>dial se PEHLE</w:t>
+            </w:r>
+            <w:r>
+              <w:rPr>
+                <w:b w:val="0"/>
+                <w:i w:val="0"/>
+                <w:color w:val="1F2937"/>
+                <w:sz w:val="20"/>
+              </w:rPr>
+              <w:t xml:space="preserve"> enforce (</w:t>
+            </w:r>
+            <w:r>
+              <w:rPr>
+                <w:rFonts w:ascii="Consolas" w:hAnsi="Consolas"/>
+                <w:b w:val="0"/>
+                <w:i w:val="0"/>
+                <w:color w:val="1F2937"/>
+                <w:sz w:val="20"/>
+              </w:rPr>
+              <w:t>canCall</w:t>
+            </w:r>
+            <w:r>
+              <w:rPr>
+                <w:b w:val="0"/>
+                <w:i w:val="0"/>
+                <w:color w:val="1F2937"/>
+                <w:sz w:val="20"/>
+              </w:rPr>
+              <w:t xml:space="preserve"> gate). Outbound placeCall: gate → business SDP offer → adapter dial → answer apply → terminate meter. Web: permission inspector + "Call now" (sirf allowed hone pe enabled) — koi cold/bulk dialing nahi.</w:t>
+            </w:r>
+          </w:p>
+        </w:tc>
+        <w:tc>
+          <w:tcPr>
+            <w:tcW w:type="dxa" w:w="2880"/>
             <w:tcBorders>
               <w:top w:val="single" w:sz="4" w:space="0" w:color="C7D2FE"/>
               <w:left w:val="single" w:sz="4" w:space="0" w:color="C7D2FE"/>

</xml_diff>

<commit_message>
docs: catalog WhatsApp least-cost routing + guardrails (WAC-09)
Co-Authored-By: Claude Opus 4.8 (1M context) <noreply@anthropic.com>
</commit_message>
<xml_diff>
--- a/docs/PROJECT-FEATURES-EXPLAINED.docx
+++ b/docs/PROJECT-FEATURES-EXPLAINED.docx
@@ -3405,6 +3405,144 @@
                 <w:sz w:val="20"/>
               </w:rPr>
               <w:t>🏠 Native (media gated)</w:t>
+            </w:r>
+          </w:p>
+        </w:tc>
+      </w:tr>
+      <w:tr>
+        <w:tc>
+          <w:tcPr>
+            <w:tcW w:type="dxa" w:w="2880"/>
+            <w:shd w:val="clear" w:color="auto" w:fill="EEF2FF"/>
+            <w:tcBorders>
+              <w:top w:val="single" w:sz="4" w:space="0" w:color="C7D2FE"/>
+              <w:left w:val="single" w:sz="4" w:space="0" w:color="C7D2FE"/>
+              <w:bottom w:val="single" w:sz="4" w:space="0" w:color="C7D2FE"/>
+              <w:right w:val="single" w:sz="4" w:space="0" w:color="C7D2FE"/>
+            </w:tcBorders>
+          </w:tcPr>
+          <w:p>
+            <w:pPr>
+              <w:spacing w:before="40" w:after="40"/>
+            </w:pPr>
+            <w:r/>
+            <w:r>
+              <w:rPr>
+                <w:b w:val="0"/>
+                <w:i w:val="0"/>
+                <w:color w:val="1F2937"/>
+                <w:sz w:val="20"/>
+              </w:rPr>
+              <w:t>WhatsApp Calling — least-cost routing + guardrails (WAC-09)</w:t>
+            </w:r>
+          </w:p>
+        </w:tc>
+        <w:tc>
+          <w:tcPr>
+            <w:tcW w:type="dxa" w:w="2880"/>
+            <w:shd w:val="clear" w:color="auto" w:fill="EEF2FF"/>
+            <w:tcBorders>
+              <w:top w:val="single" w:sz="4" w:space="0" w:color="C7D2FE"/>
+              <w:left w:val="single" w:sz="4" w:space="0" w:color="C7D2FE"/>
+              <w:bottom w:val="single" w:sz="4" w:space="0" w:color="C7D2FE"/>
+              <w:right w:val="single" w:sz="4" w:space="0" w:color="C7D2FE"/>
+            </w:tcBorders>
+          </w:tcPr>
+          <w:p>
+            <w:pPr>
+              <w:spacing w:before="40" w:after="40"/>
+            </w:pPr>
+            <w:r/>
+            <w:r>
+              <w:rPr>
+                <w:b w:val="0"/>
+                <w:i w:val="0"/>
+                <w:color w:val="1F2937"/>
+                <w:sz w:val="20"/>
+              </w:rPr>
+              <w:t xml:space="preserve">Ek outbound intent apne aap </w:t>
+            </w:r>
+            <w:r>
+              <w:rPr>
+                <w:b/>
+                <w:i w:val="0"/>
+                <w:color w:val="1F2937"/>
+                <w:sz w:val="20"/>
+              </w:rPr>
+              <w:t>sabse sasta ALLOWED route</w:t>
+            </w:r>
+            <w:r>
+              <w:rPr>
+                <w:b w:val="0"/>
+                <w:i w:val="0"/>
+                <w:color w:val="1F2937"/>
+                <w:sz w:val="20"/>
+              </w:rPr>
+              <w:t xml:space="preserve"> chune — WhatsApp vs PSTN — per-tenant policy (whatsapp-preferred / pstn-preferred / cheapest / if-permitted) se, par kabhi permission-gate / restriction / low-pickup ke against nahi; decision ka transparent reason record. Pickup-rate (7d) gire to </w:t>
+            </w:r>
+            <w:r>
+              <w:rPr>
+                <w:b/>
+                <w:i w:val="0"/>
+                <w:color w:val="1F2937"/>
+                <w:sz w:val="20"/>
+              </w:rPr>
+              <w:t>auto-throttle</w:t>
+            </w:r>
+            <w:r>
+              <w:rPr>
+                <w:b w:val="0"/>
+                <w:i w:val="0"/>
+                <w:color w:val="1F2937"/>
+                <w:sz w:val="20"/>
+              </w:rPr>
+              <w:t xml:space="preserve"> (Meta ke low-pickup RESTRICTED_* se pehle) + Meta ka </w:t>
+            </w:r>
+            <w:r>
+              <w:rPr>
+                <w:rFonts w:ascii="Consolas" w:hAnsi="Consolas"/>
+                <w:b w:val="0"/>
+                <w:i w:val="0"/>
+                <w:color w:val="1F2937"/>
+                <w:sz w:val="20"/>
+              </w:rPr>
+              <w:t>account_update</w:t>
+            </w:r>
+            <w:r>
+              <w:rPr>
+                <w:b w:val="0"/>
+                <w:i w:val="0"/>
+                <w:color w:val="1F2937"/>
+                <w:sz w:val="20"/>
+              </w:rPr>
+              <w:t xml:space="preserve"> restriction persist (local 7-day expiry) → us direction ko route-around + health banner. Web: "Calling health" widget (pickup, throttle, restriction+remediation, tier).</w:t>
+            </w:r>
+          </w:p>
+        </w:tc>
+        <w:tc>
+          <w:tcPr>
+            <w:tcW w:type="dxa" w:w="2880"/>
+            <w:shd w:val="clear" w:color="auto" w:fill="EEF2FF"/>
+            <w:tcBorders>
+              <w:top w:val="single" w:sz="4" w:space="0" w:color="C7D2FE"/>
+              <w:left w:val="single" w:sz="4" w:space="0" w:color="C7D2FE"/>
+              <w:bottom w:val="single" w:sz="4" w:space="0" w:color="C7D2FE"/>
+              <w:right w:val="single" w:sz="4" w:space="0" w:color="C7D2FE"/>
+            </w:tcBorders>
+          </w:tcPr>
+          <w:p>
+            <w:pPr>
+              <w:spacing w:before="40" w:after="40"/>
+            </w:pPr>
+            <w:r/>
+            <w:r>
+              <w:rPr>
+                <w:b w:val="0"/>
+                <w:i w:val="0"/>
+                <w:color w:val="1F2937"/>
+                <w:sz w:val="20"/>
+              </w:rPr>
+              <w:t>🏠 Native</w:t>
             </w:r>
           </w:p>
         </w:tc>

</xml_diff>

<commit_message>
docs: catalog WhatsApp SIP mode for PBX tenants (WAC-10)
Co-Authored-By: Claude Opus 4.8 (1M context) <noreply@anthropic.com>
</commit_message>
<xml_diff>
--- a/docs/PROJECT-FEATURES-EXPLAINED.docx
+++ b/docs/PROJECT-FEATURES-EXPLAINED.docx
@@ -3543,6 +3543,179 @@
                 <w:sz w:val="20"/>
               </w:rPr>
               <w:t>🏠 Native</w:t>
+            </w:r>
+          </w:p>
+        </w:tc>
+      </w:tr>
+      <w:tr>
+        <w:tc>
+          <w:tcPr>
+            <w:tcW w:type="dxa" w:w="2880"/>
+            <w:tcBorders>
+              <w:top w:val="single" w:sz="4" w:space="0" w:color="C7D2FE"/>
+              <w:left w:val="single" w:sz="4" w:space="0" w:color="C7D2FE"/>
+              <w:bottom w:val="single" w:sz="4" w:space="0" w:color="C7D2FE"/>
+              <w:right w:val="single" w:sz="4" w:space="0" w:color="C7D2FE"/>
+            </w:tcBorders>
+          </w:tcPr>
+          <w:p>
+            <w:pPr>
+              <w:spacing w:before="40" w:after="40"/>
+            </w:pPr>
+            <w:r/>
+            <w:r>
+              <w:rPr>
+                <w:b w:val="0"/>
+                <w:i w:val="0"/>
+                <w:color w:val="1F2937"/>
+                <w:sz w:val="20"/>
+              </w:rPr>
+              <w:t>WhatsApp Calling — SIP mode for PBX tenants (WAC-10, optional)</w:t>
+            </w:r>
+          </w:p>
+        </w:tc>
+        <w:tc>
+          <w:tcPr>
+            <w:tcW w:type="dxa" w:w="2880"/>
+            <w:tcBorders>
+              <w:top w:val="single" w:sz="4" w:space="0" w:color="C7D2FE"/>
+              <w:left w:val="single" w:sz="4" w:space="0" w:color="C7D2FE"/>
+              <w:bottom w:val="single" w:sz="4" w:space="0" w:color="C7D2FE"/>
+              <w:right w:val="single" w:sz="4" w:space="0" w:color="C7D2FE"/>
+            </w:tcBorders>
+          </w:tcPr>
+          <w:p>
+            <w:pPr>
+              <w:spacing w:before="40" w:after="40"/>
+            </w:pPr>
+            <w:r/>
+            <w:r>
+              <w:rPr>
+                <w:b w:val="0"/>
+                <w:i w:val="0"/>
+                <w:color w:val="1F2937"/>
+                <w:sz w:val="20"/>
+              </w:rPr>
+              <w:t xml:space="preserve">Jo tenant apna SIP PBX (Asterisk/Kamailio) chalata hai, uska WhatsApp number </w:t>
+            </w:r>
+            <w:r>
+              <w:rPr>
+                <w:b/>
+                <w:i w:val="0"/>
+                <w:color w:val="1F2937"/>
+                <w:sz w:val="20"/>
+              </w:rPr>
+              <w:t>SIP-over-TLS</w:t>
+            </w:r>
+            <w:r>
+              <w:rPr>
+                <w:b w:val="0"/>
+                <w:i w:val="0"/>
+                <w:color w:val="1F2937"/>
+                <w:sz w:val="20"/>
+              </w:rPr>
+              <w:t xml:space="preserve"> se apne PBX ke through bridge kar sake (Graph-API+WebRTC ke bajaye) — per-number opt-in, Graph tenants ko chhua nahi jaata (mixing guard). </w:t>
+            </w:r>
+            <w:r>
+              <w:rPr>
+                <w:rFonts w:ascii="Consolas" w:hAnsi="Consolas"/>
+                <w:b w:val="0"/>
+                <w:i w:val="0"/>
+                <w:color w:val="1F2937"/>
+                <w:sz w:val="20"/>
+              </w:rPr>
+              <w:t>sip</w:t>
+            </w:r>
+            <w:r>
+              <w:rPr>
+                <w:b w:val="0"/>
+                <w:i w:val="0"/>
+                <w:color w:val="1F2937"/>
+                <w:sz w:val="20"/>
+              </w:rPr>
+              <w:t xml:space="preserve"> settings block Meta se sync (servers/SDES-ya-DTLS/webhook_delivery), Meta-generated digest creds fetch (gated). SIP mode mein </w:t>
+            </w:r>
+            <w:r>
+              <w:rPr>
+                <w:rFonts w:ascii="Consolas" w:hAnsi="Consolas"/>
+                <w:b w:val="0"/>
+                <w:i w:val="0"/>
+                <w:color w:val="1F2937"/>
+                <w:sz w:val="20"/>
+              </w:rPr>
+              <w:t>calls</w:t>
+            </w:r>
+            <w:r>
+              <w:rPr>
+                <w:b w:val="0"/>
+                <w:i w:val="0"/>
+                <w:color w:val="1F2937"/>
+                <w:sz w:val="20"/>
+              </w:rPr>
+              <w:t xml:space="preserve"> webhook nahi → call ko </w:t>
+            </w:r>
+            <w:r>
+              <w:rPr>
+                <w:rFonts w:ascii="Consolas" w:hAnsi="Consolas"/>
+                <w:b w:val="0"/>
+                <w:i w:val="0"/>
+                <w:color w:val="1F2937"/>
+                <w:sz w:val="20"/>
+              </w:rPr>
+              <w:t>x-wa-meta-*</w:t>
+            </w:r>
+            <w:r>
+              <w:rPr>
+                <w:b w:val="0"/>
+                <w:i w:val="0"/>
+                <w:color w:val="1F2937"/>
+                <w:sz w:val="20"/>
+              </w:rPr>
+              <w:t xml:space="preserve"> headers (WACID + duration) se correlate + meter (WAC-06). Asterisk runbook diya — </w:t>
+            </w:r>
+            <w:r>
+              <w:rPr>
+                <w:b/>
+                <w:i w:val="0"/>
+                <w:color w:val="1F2937"/>
+                <w:sz w:val="20"/>
+              </w:rPr>
+              <w:t>Record-Route/`rewrite_contact=no` ACK fix</w:t>
+            </w:r>
+            <w:r>
+              <w:rPr>
+                <w:b w:val="0"/>
+                <w:i w:val="0"/>
+                <w:color w:val="1F2937"/>
+                <w:sz w:val="20"/>
+              </w:rPr>
+              <w:t xml:space="preserve"> (warna ~32s pe call drop) + no-mTLS. Live SIP signaling/media real TLS SIP server aane pe.</w:t>
+            </w:r>
+          </w:p>
+        </w:tc>
+        <w:tc>
+          <w:tcPr>
+            <w:tcW w:type="dxa" w:w="2880"/>
+            <w:tcBorders>
+              <w:top w:val="single" w:sz="4" w:space="0" w:color="C7D2FE"/>
+              <w:left w:val="single" w:sz="4" w:space="0" w:color="C7D2FE"/>
+              <w:bottom w:val="single" w:sz="4" w:space="0" w:color="C7D2FE"/>
+              <w:right w:val="single" w:sz="4" w:space="0" w:color="C7D2FE"/>
+            </w:tcBorders>
+          </w:tcPr>
+          <w:p>
+            <w:pPr>
+              <w:spacing w:before="40" w:after="40"/>
+            </w:pPr>
+            <w:r/>
+            <w:r>
+              <w:rPr>
+                <w:b w:val="0"/>
+                <w:i w:val="0"/>
+                <w:color w:val="1F2937"/>
+                <w:sz w:val="20"/>
+              </w:rPr>
+              <w:t>🔀 Hybrid (gated)</w:t>
             </w:r>
           </w:p>
         </w:tc>

</xml_diff>

<commit_message>
docs: catalog WhatsApp video/screen-share GA-gate (WAC-11)
Co-Authored-By: Claude Opus 4.8 (1M context) <noreply@anthropic.com>
</commit_message>
<xml_diff>
--- a/docs/PROJECT-FEATURES-EXPLAINED.docx
+++ b/docs/PROJECT-FEATURES-EXPLAINED.docx
@@ -3716,6 +3716,192 @@
                 <w:sz w:val="20"/>
               </w:rPr>
               <w:t>🔀 Hybrid (gated)</w:t>
+            </w:r>
+          </w:p>
+        </w:tc>
+      </w:tr>
+      <w:tr>
+        <w:tc>
+          <w:tcPr>
+            <w:tcW w:type="dxa" w:w="2880"/>
+            <w:shd w:val="clear" w:color="auto" w:fill="EEF2FF"/>
+            <w:tcBorders>
+              <w:top w:val="single" w:sz="4" w:space="0" w:color="C7D2FE"/>
+              <w:left w:val="single" w:sz="4" w:space="0" w:color="C7D2FE"/>
+              <w:bottom w:val="single" w:sz="4" w:space="0" w:color="C7D2FE"/>
+              <w:right w:val="single" w:sz="4" w:space="0" w:color="C7D2FE"/>
+            </w:tcBorders>
+          </w:tcPr>
+          <w:p>
+            <w:pPr>
+              <w:spacing w:before="40" w:after="40"/>
+            </w:pPr>
+            <w:r/>
+            <w:r>
+              <w:rPr>
+                <w:b w:val="0"/>
+                <w:i w:val="0"/>
+                <w:color w:val="1F2937"/>
+                <w:sz w:val="20"/>
+              </w:rPr>
+              <w:t>WhatsApp Calling — video/screen-share GA-gate (WAC-11, optional)</w:t>
+            </w:r>
+          </w:p>
+        </w:tc>
+        <w:tc>
+          <w:tcPr>
+            <w:tcW w:type="dxa" w:w="2880"/>
+            <w:shd w:val="clear" w:color="auto" w:fill="EEF2FF"/>
+            <w:tcBorders>
+              <w:top w:val="single" w:sz="4" w:space="0" w:color="C7D2FE"/>
+              <w:left w:val="single" w:sz="4" w:space="0" w:color="C7D2FE"/>
+              <w:bottom w:val="single" w:sz="4" w:space="0" w:color="C7D2FE"/>
+              <w:right w:val="single" w:sz="4" w:space="0" w:color="C7D2FE"/>
+            </w:tcBorders>
+          </w:tcPr>
+          <w:p>
+            <w:pPr>
+              <w:spacing w:before="40" w:after="40"/>
+            </w:pPr>
+            <w:r/>
+            <w:r>
+              <w:rPr>
+                <w:b w:val="0"/>
+                <w:i w:val="0"/>
+                <w:color w:val="1F2937"/>
+                <w:sz w:val="20"/>
+              </w:rPr>
+              <w:t xml:space="preserve">Meta ne WhatsApp video/screen-share abhi GA nahi kiya ("in development") — to hum unpublished spec pe SDP negotiate nahi karte (golden rule #15). Honest seam ship kiya: </w:t>
+            </w:r>
+            <w:r>
+              <w:rPr>
+                <w:rFonts w:ascii="Consolas" w:hAnsi="Consolas"/>
+                <w:b w:val="0"/>
+                <w:i w:val="0"/>
+                <w:color w:val="1F2937"/>
+                <w:sz w:val="20"/>
+              </w:rPr>
+              <w:t>WHATSAPP_VIDEO_GA=false</w:t>
+            </w:r>
+            <w:r>
+              <w:rPr>
+                <w:b w:val="0"/>
+                <w:i w:val="0"/>
+                <w:color w:val="1F2937"/>
+                <w:sz w:val="20"/>
+              </w:rPr>
+              <w:t xml:space="preserve"> + </w:t>
+            </w:r>
+            <w:r>
+              <w:rPr>
+                <w:rFonts w:ascii="Consolas" w:hAnsi="Consolas"/>
+                <w:b w:val="0"/>
+                <w:i w:val="0"/>
+                <w:color w:val="1F2937"/>
+                <w:sz w:val="20"/>
+              </w:rPr>
+              <w:t>whatsappCallMediaMode()</w:t>
+            </w:r>
+            <w:r>
+              <w:rPr>
+                <w:b w:val="0"/>
+                <w:i w:val="0"/>
+                <w:color w:val="1F2937"/>
+                <w:sz w:val="20"/>
+              </w:rPr>
+              <w:t xml:space="preserve"> jo har call ko </w:t>
+            </w:r>
+            <w:r>
+              <w:rPr>
+                <w:b/>
+                <w:i w:val="0"/>
+                <w:color w:val="1F2937"/>
+                <w:sz w:val="20"/>
+              </w:rPr>
+              <w:t>audio-only</w:t>
+            </w:r>
+            <w:r>
+              <w:rPr>
+                <w:b w:val="0"/>
+                <w:i w:val="0"/>
+                <w:color w:val="1F2937"/>
+                <w:sz w:val="20"/>
+              </w:rPr>
+              <w:t xml:space="preserve"> rakhta hai (video request safely voice pe degrade), api/voice mein </w:t>
+            </w:r>
+            <w:r>
+              <w:rPr>
+                <w:rFonts w:ascii="Consolas" w:hAnsi="Consolas"/>
+                <w:b w:val="0"/>
+                <w:i w:val="0"/>
+                <w:color w:val="1F2937"/>
+                <w:sz w:val="20"/>
+              </w:rPr>
+              <w:t>video</w:t>
+            </w:r>
+            <w:r>
+              <w:rPr>
+                <w:b w:val="0"/>
+                <w:i w:val="0"/>
+                <w:color w:val="1F2937"/>
+                <w:sz w:val="20"/>
+              </w:rPr>
+              <w:t xml:space="preserve"> field plumbed-par-inert (gated), aur ek GA-ready design note (</w:t>
+            </w:r>
+            <w:r>
+              <w:rPr>
+                <w:rFonts w:ascii="Consolas" w:hAnsi="Consolas"/>
+                <w:b w:val="0"/>
+                <w:i w:val="0"/>
+                <w:color w:val="1F2937"/>
+                <w:sz w:val="20"/>
+              </w:rPr>
+              <w:t>docs/runbooks/whatsapp-calling-video-design.md</w:t>
+            </w:r>
+            <w:r>
+              <w:rPr>
+                <w:b w:val="0"/>
+                <w:i w:val="0"/>
+                <w:color w:val="1F2937"/>
+                <w:sz w:val="20"/>
+              </w:rPr>
+              <w:t xml:space="preserve">: flag flip → m=video negotiation → avatar/Agent-Desk → live-call video pane + audio-only fallback → metering). Live video Meta GA pe. </w:t>
+            </w:r>
+            <w:r>
+              <w:rPr>
+                <w:b/>
+                <w:i w:val="0"/>
+                <w:color w:val="1F2937"/>
+                <w:sz w:val="20"/>
+              </w:rPr>
+              <w:t>Ye WhatsApp Calling module complete karta hai.</w:t>
+            </w:r>
+          </w:p>
+        </w:tc>
+        <w:tc>
+          <w:tcPr>
+            <w:tcW w:type="dxa" w:w="2880"/>
+            <w:shd w:val="clear" w:color="auto" w:fill="EEF2FF"/>
+            <w:tcBorders>
+              <w:top w:val="single" w:sz="4" w:space="0" w:color="C7D2FE"/>
+              <w:left w:val="single" w:sz="4" w:space="0" w:color="C7D2FE"/>
+              <w:bottom w:val="single" w:sz="4" w:space="0" w:color="C7D2FE"/>
+              <w:right w:val="single" w:sz="4" w:space="0" w:color="C7D2FE"/>
+            </w:tcBorders>
+          </w:tcPr>
+          <w:p>
+            <w:pPr>
+              <w:spacing w:before="40" w:after="40"/>
+            </w:pPr>
+            <w:r/>
+            <w:r>
+              <w:rPr>
+                <w:b w:val="0"/>
+                <w:i w:val="0"/>
+                <w:color w:val="1F2937"/>
+                <w:sz w:val="20"/>
+              </w:rPr>
+              <w:t>⛔ Gated (not GA)</w:t>
             </w:r>
           </w:p>
         </w:tc>

</xml_diff>

<commit_message>
docs: regenerate PROJECT-FEATURES-EXPLAINED.docx from current .md
The styled Word doc had gone stale (built Jul 24; the .md source of
truth was current to Jul 30). The regen was previously blocked on
python-docx/lxml being unavailable in the sandbox — both are present
now, so ran scripts/gen-features-docx.py to rebuild from the Markdown
(55,005 → 58,203 bytes; 66 paragraphs / 17 tables). Faithful render of
the existing .md (no new feature text) — just re-syncs the pair per the
features-doc convention (.md stays the single source of truth).

Co-Authored-By: Claude Opus 4.8 (1M context) <noreply@anthropic.com>
</commit_message>
<xml_diff>
--- a/docs/PROJECT-FEATURES-EXPLAINED.docx
+++ b/docs/PROJECT-FEATURES-EXPLAINED.docx
@@ -16332,6 +16332,2608 @@
           <w:sz w:val="21"/>
         </w:rPr>
         <w:t xml:space="preserve"> Twilio, Stripe, SIP, Google Calendar/Sheets, voice biometrics, avatar, messaging channels.</w:t>
+      </w:r>
+    </w:p>
+    <w:p>
+      <w:pPr>
+        <w:pBdr>
+          <w:bottom w:val="single" w:sz="6" w:space="1" w:color="C7D2FE"/>
+        </w:pBdr>
+        <w:spacing w:after="80"/>
+      </w:pPr>
+    </w:p>
+    <w:p>
+      <w:pPr>
+        <w:spacing w:before="280" w:after="120"/>
+        <w:pBdr>
+          <w:bottom w:val="single" w:sz="10" w:space="2" w:color="0EA5E9"/>
+        </w:pBdr>
+      </w:pPr>
+      <w:r>
+        <w:rPr>
+          <w:b/>
+          <w:i w:val="0"/>
+          <w:color w:val="4F46E5"/>
+          <w:sz w:val="30"/>
+        </w:rPr>
+        <w:t>🇮🇳 India Voice (Sarvam AI) — India-first calling</w:t>
+      </w:r>
+    </w:p>
+    <w:p>
+      <w:pPr>
+        <w:spacing w:after="80"/>
+      </w:pPr>
+      <w:r>
+        <w:rPr>
+          <w:b w:val="0"/>
+          <w:i w:val="0"/>
+          <w:color w:val="1F2937"/>
+          <w:sz w:val="21"/>
+        </w:rPr>
+        <w:t xml:space="preserve">VocalIQ ka India play: ek </w:t>
+      </w:r>
+      <w:r>
+        <w:rPr>
+          <w:b/>
+          <w:i w:val="0"/>
+          <w:color w:val="1F2937"/>
+          <w:sz w:val="21"/>
+        </w:rPr>
+        <w:t>Indian-language agent</w:t>
+      </w:r>
+      <w:r>
+        <w:rPr>
+          <w:b w:val="0"/>
+          <w:i w:val="0"/>
+          <w:color w:val="1F2937"/>
+          <w:sz w:val="21"/>
+        </w:rPr>
+        <w:t xml:space="preserve"> ki poori call </w:t>
+      </w:r>
+      <w:r>
+        <w:rPr>
+          <w:b/>
+          <w:i w:val="0"/>
+          <w:color w:val="1F2937"/>
+          <w:sz w:val="21"/>
+        </w:rPr>
+        <w:t>Sarvam AI</w:t>
+      </w:r>
+      <w:r>
+        <w:rPr>
+          <w:b w:val="0"/>
+          <w:i w:val="0"/>
+          <w:color w:val="1F2937"/>
+          <w:sz w:val="21"/>
+        </w:rPr>
+        <w:t xml:space="preserve"> pe chalti hai — STT (Saaras v3), LLM (sarvam-30b), TTS (Bulbul v3) — best Hindi + regional accuracy ke liye. Sab kuch provider-router seam ke peeche hai aur </w:t>
+      </w:r>
+      <w:r>
+        <w:rPr>
+          <w:b/>
+          <w:i w:val="0"/>
+          <w:color w:val="1F2937"/>
+          <w:sz w:val="21"/>
+        </w:rPr>
+        <w:t>`SARVAM_API_KEY` set hone tak gated</w:t>
+      </w:r>
+      <w:r>
+        <w:rPr>
+          <w:b w:val="0"/>
+          <w:i w:val="0"/>
+          <w:color w:val="1F2937"/>
+          <w:sz w:val="21"/>
+        </w:rPr>
+        <w:t xml:space="preserve"> (key na ho to default stack pe fall back).</w:t>
+      </w:r>
+    </w:p>
+    <w:p>
+      <w:pPr>
+        <w:spacing w:after="80"/>
+      </w:pPr>
+      <w:r>
+        <w:rPr>
+          <w:b/>
+          <w:i w:val="0"/>
+          <w:color w:val="1F2937"/>
+          <w:sz w:val="21"/>
+        </w:rPr>
+        <w:t>Kaise kaam karta hai (end-to-end):</w:t>
+      </w:r>
+      <w:r>
+        <w:rPr>
+          <w:b w:val="0"/>
+          <w:i w:val="0"/>
+          <w:color w:val="1F2937"/>
+          <w:sz w:val="21"/>
+        </w:rPr>
+        <w:t xml:space="preserve"> Agent builder me aap </w:t>
+      </w:r>
+      <w:r>
+        <w:rPr>
+          <w:b/>
+          <w:i w:val="0"/>
+          <w:color w:val="1F2937"/>
+          <w:sz w:val="21"/>
+        </w:rPr>
+        <w:t>languages</w:t>
+      </w:r>
+      <w:r>
+        <w:rPr>
+          <w:b w:val="0"/>
+          <w:i w:val="0"/>
+          <w:color w:val="1F2937"/>
+          <w:sz w:val="21"/>
+        </w:rPr>
+        <w:t xml:space="preserve"> chunte ho — pehli (Primary) language call ki voice routing decide karti hai. Agar Primary koi Indian language hai (Hindi, Tamil, Marathi, Bengali, …) to loop apne aap Sarvam pe route ho jaata hai. Indian-language agent ke liye ek </w:t>
+      </w:r>
+      <w:r>
+        <w:rPr>
+          <w:b/>
+          <w:i w:val="0"/>
+          <w:color w:val="1F2937"/>
+          <w:sz w:val="21"/>
+        </w:rPr>
+        <w:t>Bulbul voice-picker</w:t>
+      </w:r>
+      <w:r>
+        <w:rPr>
+          <w:b w:val="0"/>
+          <w:i w:val="0"/>
+          <w:color w:val="1F2937"/>
+          <w:sz w:val="21"/>
+        </w:rPr>
+        <w:t xml:space="preserve"> bhi dikhta hai (39 speakers, gender-wise) — chuni hui awaaz agent ke </w:t>
+      </w:r>
+      <w:r>
+        <w:rPr>
+          <w:rFonts w:ascii="Consolas" w:hAnsi="Consolas"/>
+          <w:b w:val="0"/>
+          <w:i w:val="0"/>
+          <w:color w:val="1F2937"/>
+          <w:sz w:val="21"/>
+        </w:rPr>
+        <w:t>persona</w:t>
+      </w:r>
+      <w:r>
+        <w:rPr>
+          <w:b w:val="0"/>
+          <w:i w:val="0"/>
+          <w:color w:val="1F2937"/>
+          <w:sz w:val="21"/>
+        </w:rPr>
+        <w:t xml:space="preserve"> me store hoke Sarvam TTS ko drive karti hai.</w:t>
+      </w:r>
+    </w:p>
+    <w:tbl>
+      <w:tblPr>
+        <w:tblW w:type="auto" w:w="0"/>
+        <w:jc w:val="center"/>
+        <w:tblLayout w:type="autofit"/>
+        <w:tblLook w:firstColumn="1" w:firstRow="1" w:lastColumn="0" w:lastRow="0" w:noHBand="0" w:noVBand="1" w:val="04A0"/>
+      </w:tblPr>
+      <w:tblGrid>
+        <w:gridCol w:w="2880"/>
+        <w:gridCol w:w="2880"/>
+        <w:gridCol w:w="2880"/>
+      </w:tblGrid>
+      <w:tr>
+        <w:tc>
+          <w:tcPr>
+            <w:tcW w:type="dxa" w:w="2880"/>
+            <w:shd w:val="clear" w:color="auto" w:fill="4F46E5"/>
+            <w:tcBorders>
+              <w:top w:val="single" w:sz="4" w:space="0" w:color="C7D2FE"/>
+              <w:left w:val="single" w:sz="4" w:space="0" w:color="C7D2FE"/>
+              <w:bottom w:val="single" w:sz="4" w:space="0" w:color="C7D2FE"/>
+              <w:right w:val="single" w:sz="4" w:space="0" w:color="C7D2FE"/>
+            </w:tcBorders>
+          </w:tcPr>
+          <w:p>
+            <w:pPr>
+              <w:spacing w:before="40" w:after="40"/>
+            </w:pPr>
+            <w:r/>
+            <w:r>
+              <w:rPr>
+                <w:b/>
+                <w:i w:val="0"/>
+                <w:color w:val="FFFFFF"/>
+                <w:sz w:val="20"/>
+              </w:rPr>
+              <w:t>Feature</w:t>
+            </w:r>
+          </w:p>
+        </w:tc>
+        <w:tc>
+          <w:tcPr>
+            <w:tcW w:type="dxa" w:w="2880"/>
+            <w:shd w:val="clear" w:color="auto" w:fill="4F46E5"/>
+            <w:tcBorders>
+              <w:top w:val="single" w:sz="4" w:space="0" w:color="C7D2FE"/>
+              <w:left w:val="single" w:sz="4" w:space="0" w:color="C7D2FE"/>
+              <w:bottom w:val="single" w:sz="4" w:space="0" w:color="C7D2FE"/>
+              <w:right w:val="single" w:sz="4" w:space="0" w:color="C7D2FE"/>
+            </w:tcBorders>
+          </w:tcPr>
+          <w:p>
+            <w:pPr>
+              <w:spacing w:before="40" w:after="40"/>
+            </w:pPr>
+            <w:r/>
+            <w:r>
+              <w:rPr>
+                <w:b/>
+                <w:i w:val="0"/>
+                <w:color w:val="FFFFFF"/>
+                <w:sz w:val="20"/>
+              </w:rPr>
+              <w:t>Kya hai</w:t>
+            </w:r>
+          </w:p>
+        </w:tc>
+        <w:tc>
+          <w:tcPr>
+            <w:tcW w:type="dxa" w:w="2880"/>
+            <w:shd w:val="clear" w:color="auto" w:fill="4F46E5"/>
+            <w:tcBorders>
+              <w:top w:val="single" w:sz="4" w:space="0" w:color="C7D2FE"/>
+              <w:left w:val="single" w:sz="4" w:space="0" w:color="C7D2FE"/>
+              <w:bottom w:val="single" w:sz="4" w:space="0" w:color="C7D2FE"/>
+              <w:right w:val="single" w:sz="4" w:space="0" w:color="C7D2FE"/>
+            </w:tcBorders>
+          </w:tcPr>
+          <w:p>
+            <w:pPr>
+              <w:spacing w:before="40" w:after="40"/>
+            </w:pPr>
+            <w:r/>
+            <w:r>
+              <w:rPr>
+                <w:b/>
+                <w:i w:val="0"/>
+                <w:color w:val="FFFFFF"/>
+                <w:sz w:val="20"/>
+              </w:rPr>
+              <w:t>Status</w:t>
+            </w:r>
+          </w:p>
+        </w:tc>
+      </w:tr>
+      <w:tr>
+        <w:tc>
+          <w:tcPr>
+            <w:tcW w:type="dxa" w:w="2880"/>
+            <w:tcBorders>
+              <w:top w:val="single" w:sz="4" w:space="0" w:color="C7D2FE"/>
+              <w:left w:val="single" w:sz="4" w:space="0" w:color="C7D2FE"/>
+              <w:bottom w:val="single" w:sz="4" w:space="0" w:color="C7D2FE"/>
+              <w:right w:val="single" w:sz="4" w:space="0" w:color="C7D2FE"/>
+            </w:tcBorders>
+          </w:tcPr>
+          <w:p>
+            <w:pPr>
+              <w:spacing w:before="40" w:after="40"/>
+            </w:pPr>
+            <w:r/>
+            <w:r>
+              <w:rPr>
+                <w:b w:val="0"/>
+                <w:i w:val="0"/>
+                <w:color w:val="1F2937"/>
+                <w:sz w:val="20"/>
+              </w:rPr>
+              <w:t>Sarvam adapters (STT/LLM/TTS)</w:t>
+            </w:r>
+          </w:p>
+        </w:tc>
+        <w:tc>
+          <w:tcPr>
+            <w:tcW w:type="dxa" w:w="2880"/>
+            <w:tcBorders>
+              <w:top w:val="single" w:sz="4" w:space="0" w:color="C7D2FE"/>
+              <w:left w:val="single" w:sz="4" w:space="0" w:color="C7D2FE"/>
+              <w:bottom w:val="single" w:sz="4" w:space="0" w:color="C7D2FE"/>
+              <w:right w:val="single" w:sz="4" w:space="0" w:color="C7D2FE"/>
+            </w:tcBorders>
+          </w:tcPr>
+          <w:p>
+            <w:pPr>
+              <w:spacing w:before="40" w:after="40"/>
+            </w:pPr>
+            <w:r/>
+            <w:r>
+              <w:rPr>
+                <w:b w:val="0"/>
+                <w:i w:val="0"/>
+                <w:color w:val="1F2937"/>
+                <w:sz w:val="20"/>
+              </w:rPr>
+              <w:t>Saaras v3 + sarvam-30b + Bulbul v3, provider-router ke peeche</w:t>
+            </w:r>
+          </w:p>
+        </w:tc>
+        <w:tc>
+          <w:tcPr>
+            <w:tcW w:type="dxa" w:w="2880"/>
+            <w:tcBorders>
+              <w:top w:val="single" w:sz="4" w:space="0" w:color="C7D2FE"/>
+              <w:left w:val="single" w:sz="4" w:space="0" w:color="C7D2FE"/>
+              <w:bottom w:val="single" w:sz="4" w:space="0" w:color="C7D2FE"/>
+              <w:right w:val="single" w:sz="4" w:space="0" w:color="C7D2FE"/>
+            </w:tcBorders>
+          </w:tcPr>
+          <w:p>
+            <w:pPr>
+              <w:spacing w:before="40" w:after="40"/>
+            </w:pPr>
+            <w:r/>
+            <w:r>
+              <w:rPr>
+                <w:b w:val="0"/>
+                <w:i w:val="0"/>
+                <w:color w:val="1F2937"/>
+                <w:sz w:val="20"/>
+              </w:rPr>
+              <w:t>✅ merged (#190–192)</w:t>
+            </w:r>
+          </w:p>
+        </w:tc>
+      </w:tr>
+      <w:tr>
+        <w:tc>
+          <w:tcPr>
+            <w:tcW w:type="dxa" w:w="2880"/>
+            <w:shd w:val="clear" w:color="auto" w:fill="EEF2FF"/>
+            <w:tcBorders>
+              <w:top w:val="single" w:sz="4" w:space="0" w:color="C7D2FE"/>
+              <w:left w:val="single" w:sz="4" w:space="0" w:color="C7D2FE"/>
+              <w:bottom w:val="single" w:sz="4" w:space="0" w:color="C7D2FE"/>
+              <w:right w:val="single" w:sz="4" w:space="0" w:color="C7D2FE"/>
+            </w:tcBorders>
+          </w:tcPr>
+          <w:p>
+            <w:pPr>
+              <w:spacing w:before="40" w:after="40"/>
+            </w:pPr>
+            <w:r/>
+            <w:r>
+              <w:rPr>
+                <w:b w:val="0"/>
+                <w:i w:val="0"/>
+                <w:color w:val="1F2937"/>
+                <w:sz w:val="20"/>
+              </w:rPr>
+              <w:t>Indic auto-routing</w:t>
+            </w:r>
+          </w:p>
+        </w:tc>
+        <w:tc>
+          <w:tcPr>
+            <w:tcW w:type="dxa" w:w="2880"/>
+            <w:shd w:val="clear" w:color="auto" w:fill="EEF2FF"/>
+            <w:tcBorders>
+              <w:top w:val="single" w:sz="4" w:space="0" w:color="C7D2FE"/>
+              <w:left w:val="single" w:sz="4" w:space="0" w:color="C7D2FE"/>
+              <w:bottom w:val="single" w:sz="4" w:space="0" w:color="C7D2FE"/>
+              <w:right w:val="single" w:sz="4" w:space="0" w:color="C7D2FE"/>
+            </w:tcBorders>
+          </w:tcPr>
+          <w:p>
+            <w:pPr>
+              <w:spacing w:before="40" w:after="40"/>
+            </w:pPr>
+            <w:r/>
+            <w:r>
+              <w:rPr>
+                <w:b w:val="0"/>
+                <w:i w:val="0"/>
+                <w:color w:val="1F2937"/>
+                <w:sz w:val="20"/>
+              </w:rPr>
+              <w:t>Indic primary language ⇒ poori call Sarvam pe</w:t>
+            </w:r>
+          </w:p>
+        </w:tc>
+        <w:tc>
+          <w:tcPr>
+            <w:tcW w:type="dxa" w:w="2880"/>
+            <w:shd w:val="clear" w:color="auto" w:fill="EEF2FF"/>
+            <w:tcBorders>
+              <w:top w:val="single" w:sz="4" w:space="0" w:color="C7D2FE"/>
+              <w:left w:val="single" w:sz="4" w:space="0" w:color="C7D2FE"/>
+              <w:bottom w:val="single" w:sz="4" w:space="0" w:color="C7D2FE"/>
+              <w:right w:val="single" w:sz="4" w:space="0" w:color="C7D2FE"/>
+            </w:tcBorders>
+          </w:tcPr>
+          <w:p>
+            <w:pPr>
+              <w:spacing w:before="40" w:after="40"/>
+            </w:pPr>
+            <w:r/>
+            <w:r>
+              <w:rPr>
+                <w:b w:val="0"/>
+                <w:i w:val="0"/>
+                <w:color w:val="1F2937"/>
+                <w:sz w:val="20"/>
+              </w:rPr>
+              <w:t>✅ merged (#191)</w:t>
+            </w:r>
+          </w:p>
+        </w:tc>
+      </w:tr>
+      <w:tr>
+        <w:tc>
+          <w:tcPr>
+            <w:tcW w:type="dxa" w:w="2880"/>
+            <w:tcBorders>
+              <w:top w:val="single" w:sz="4" w:space="0" w:color="C7D2FE"/>
+              <w:left w:val="single" w:sz="4" w:space="0" w:color="C7D2FE"/>
+              <w:bottom w:val="single" w:sz="4" w:space="0" w:color="C7D2FE"/>
+              <w:right w:val="single" w:sz="4" w:space="0" w:color="C7D2FE"/>
+            </w:tcBorders>
+          </w:tcPr>
+          <w:p>
+            <w:pPr>
+              <w:spacing w:before="40" w:after="40"/>
+            </w:pPr>
+            <w:r/>
+            <w:r>
+              <w:rPr>
+                <w:b w:val="0"/>
+                <w:i w:val="0"/>
+                <w:color w:val="1F2937"/>
+                <w:sz w:val="20"/>
+              </w:rPr>
+              <w:t>Language picker + primary-language plumbing</w:t>
+            </w:r>
+          </w:p>
+        </w:tc>
+        <w:tc>
+          <w:tcPr>
+            <w:tcW w:type="dxa" w:w="2880"/>
+            <w:tcBorders>
+              <w:top w:val="single" w:sz="4" w:space="0" w:color="C7D2FE"/>
+              <w:left w:val="single" w:sz="4" w:space="0" w:color="C7D2FE"/>
+              <w:bottom w:val="single" w:sz="4" w:space="0" w:color="C7D2FE"/>
+              <w:right w:val="single" w:sz="4" w:space="0" w:color="C7D2FE"/>
+            </w:tcBorders>
+          </w:tcPr>
+          <w:p>
+            <w:pPr>
+              <w:spacing w:before="40" w:after="40"/>
+            </w:pPr>
+            <w:r/>
+            <w:r>
+              <w:rPr>
+                <w:b w:val="0"/>
+                <w:i w:val="0"/>
+                <w:color w:val="1F2937"/>
+                <w:sz w:val="20"/>
+              </w:rPr>
+              <w:t>Native-script picker; primary language web→api→voice tak jaata hai</w:t>
+            </w:r>
+          </w:p>
+        </w:tc>
+        <w:tc>
+          <w:tcPr>
+            <w:tcW w:type="dxa" w:w="2880"/>
+            <w:tcBorders>
+              <w:top w:val="single" w:sz="4" w:space="0" w:color="C7D2FE"/>
+              <w:left w:val="single" w:sz="4" w:space="0" w:color="C7D2FE"/>
+              <w:bottom w:val="single" w:sz="4" w:space="0" w:color="C7D2FE"/>
+              <w:right w:val="single" w:sz="4" w:space="0" w:color="C7D2FE"/>
+            </w:tcBorders>
+          </w:tcPr>
+          <w:p>
+            <w:pPr>
+              <w:spacing w:before="40" w:after="40"/>
+            </w:pPr>
+            <w:r/>
+            <w:r>
+              <w:rPr>
+                <w:b w:val="0"/>
+                <w:i w:val="0"/>
+                <w:color w:val="1F2937"/>
+                <w:sz w:val="20"/>
+              </w:rPr>
+              <w:t>✅ merged (#193)</w:t>
+            </w:r>
+          </w:p>
+        </w:tc>
+      </w:tr>
+      <w:tr>
+        <w:tc>
+          <w:tcPr>
+            <w:tcW w:type="dxa" w:w="2880"/>
+            <w:shd w:val="clear" w:color="auto" w:fill="EEF2FF"/>
+            <w:tcBorders>
+              <w:top w:val="single" w:sz="4" w:space="0" w:color="C7D2FE"/>
+              <w:left w:val="single" w:sz="4" w:space="0" w:color="C7D2FE"/>
+              <w:bottom w:val="single" w:sz="4" w:space="0" w:color="C7D2FE"/>
+              <w:right w:val="single" w:sz="4" w:space="0" w:color="C7D2FE"/>
+            </w:tcBorders>
+          </w:tcPr>
+          <w:p>
+            <w:pPr>
+              <w:spacing w:before="40" w:after="40"/>
+            </w:pPr>
+            <w:r/>
+            <w:r>
+              <w:rPr>
+                <w:b w:val="0"/>
+                <w:i w:val="0"/>
+                <w:color w:val="1F2937"/>
+                <w:sz w:val="20"/>
+              </w:rPr>
+              <w:t>22 Indian languages + 4 India agent templates</w:t>
+            </w:r>
+          </w:p>
+        </w:tc>
+        <w:tc>
+          <w:tcPr>
+            <w:tcW w:type="dxa" w:w="2880"/>
+            <w:shd w:val="clear" w:color="auto" w:fill="EEF2FF"/>
+            <w:tcBorders>
+              <w:top w:val="single" w:sz="4" w:space="0" w:color="C7D2FE"/>
+              <w:left w:val="single" w:sz="4" w:space="0" w:color="C7D2FE"/>
+              <w:bottom w:val="single" w:sz="4" w:space="0" w:color="C7D2FE"/>
+              <w:right w:val="single" w:sz="4" w:space="0" w:color="C7D2FE"/>
+            </w:tcBorders>
+          </w:tcPr>
+          <w:p>
+            <w:pPr>
+              <w:spacing w:before="40" w:after="40"/>
+            </w:pPr>
+            <w:r/>
+            <w:r>
+              <w:rPr>
+                <w:b w:val="0"/>
+                <w:i w:val="0"/>
+                <w:color w:val="1F2937"/>
+                <w:sz w:val="20"/>
+              </w:rPr>
+              <w:t>Scheduled languages catalog + Hindi/Tamil/Marathi/Bengali starters</w:t>
+            </w:r>
+          </w:p>
+        </w:tc>
+        <w:tc>
+          <w:tcPr>
+            <w:tcW w:type="dxa" w:w="2880"/>
+            <w:shd w:val="clear" w:color="auto" w:fill="EEF2FF"/>
+            <w:tcBorders>
+              <w:top w:val="single" w:sz="4" w:space="0" w:color="C7D2FE"/>
+              <w:left w:val="single" w:sz="4" w:space="0" w:color="C7D2FE"/>
+              <w:bottom w:val="single" w:sz="4" w:space="0" w:color="C7D2FE"/>
+              <w:right w:val="single" w:sz="4" w:space="0" w:color="C7D2FE"/>
+            </w:tcBorders>
+          </w:tcPr>
+          <w:p>
+            <w:pPr>
+              <w:spacing w:before="40" w:after="40"/>
+            </w:pPr>
+            <w:r/>
+            <w:r>
+              <w:rPr>
+                <w:b w:val="0"/>
+                <w:i w:val="0"/>
+                <w:color w:val="1F2937"/>
+                <w:sz w:val="20"/>
+              </w:rPr>
+              <w:t>✅ merged (#193)</w:t>
+            </w:r>
+          </w:p>
+        </w:tc>
+      </w:tr>
+      <w:tr>
+        <w:tc>
+          <w:tcPr>
+            <w:tcW w:type="dxa" w:w="2880"/>
+            <w:tcBorders>
+              <w:top w:val="single" w:sz="4" w:space="0" w:color="C7D2FE"/>
+              <w:left w:val="single" w:sz="4" w:space="0" w:color="C7D2FE"/>
+              <w:bottom w:val="single" w:sz="4" w:space="0" w:color="C7D2FE"/>
+              <w:right w:val="single" w:sz="4" w:space="0" w:color="C7D2FE"/>
+            </w:tcBorders>
+          </w:tcPr>
+          <w:p>
+            <w:pPr>
+              <w:spacing w:before="40" w:after="40"/>
+            </w:pPr>
+            <w:r/>
+            <w:r>
+              <w:rPr>
+                <w:b w:val="0"/>
+                <w:i w:val="0"/>
+                <w:color w:val="1F2937"/>
+                <w:sz w:val="20"/>
+              </w:rPr>
+              <w:t>Bulbul voice-picker (39 voices)</w:t>
+            </w:r>
+          </w:p>
+        </w:tc>
+        <w:tc>
+          <w:tcPr>
+            <w:tcW w:type="dxa" w:w="2880"/>
+            <w:tcBorders>
+              <w:top w:val="single" w:sz="4" w:space="0" w:color="C7D2FE"/>
+              <w:left w:val="single" w:sz="4" w:space="0" w:color="C7D2FE"/>
+              <w:bottom w:val="single" w:sz="4" w:space="0" w:color="C7D2FE"/>
+              <w:right w:val="single" w:sz="4" w:space="0" w:color="C7D2FE"/>
+            </w:tcBorders>
+          </w:tcPr>
+          <w:p>
+            <w:pPr>
+              <w:spacing w:before="40" w:after="40"/>
+            </w:pPr>
+            <w:r/>
+            <w:r>
+              <w:rPr>
+                <w:b w:val="0"/>
+                <w:i w:val="0"/>
+                <w:color w:val="1F2937"/>
+                <w:sz w:val="20"/>
+              </w:rPr>
+              <w:t>Indic agent ke liye speaker chuno → Sarvam TTS voice (</w:t>
+            </w:r>
+            <w:r>
+              <w:rPr>
+                <w:rFonts w:ascii="Consolas" w:hAnsi="Consolas"/>
+                <w:b w:val="0"/>
+                <w:i w:val="0"/>
+                <w:color w:val="1F2937"/>
+                <w:sz w:val="20"/>
+              </w:rPr>
+              <w:t>voiceId</w:t>
+            </w:r>
+            <w:r>
+              <w:rPr>
+                <w:b w:val="0"/>
+                <w:i w:val="0"/>
+                <w:color w:val="1F2937"/>
+                <w:sz w:val="20"/>
+              </w:rPr>
+              <w:t>→</w:t>
+            </w:r>
+            <w:r>
+              <w:rPr>
+                <w:rFonts w:ascii="Consolas" w:hAnsi="Consolas"/>
+                <w:b w:val="0"/>
+                <w:i w:val="0"/>
+                <w:color w:val="1F2937"/>
+                <w:sz w:val="20"/>
+              </w:rPr>
+              <w:t>voice_id</w:t>
+            </w:r>
+            <w:r>
+              <w:rPr>
+                <w:b w:val="0"/>
+                <w:i w:val="0"/>
+                <w:color w:val="1F2937"/>
+                <w:sz w:val="20"/>
+              </w:rPr>
+              <w:t>)</w:t>
+            </w:r>
+          </w:p>
+        </w:tc>
+        <w:tc>
+          <w:tcPr>
+            <w:tcW w:type="dxa" w:w="2880"/>
+            <w:tcBorders>
+              <w:top w:val="single" w:sz="4" w:space="0" w:color="C7D2FE"/>
+              <w:left w:val="single" w:sz="4" w:space="0" w:color="C7D2FE"/>
+              <w:bottom w:val="single" w:sz="4" w:space="0" w:color="C7D2FE"/>
+              <w:right w:val="single" w:sz="4" w:space="0" w:color="C7D2FE"/>
+            </w:tcBorders>
+          </w:tcPr>
+          <w:p>
+            <w:pPr>
+              <w:spacing w:before="40" w:after="40"/>
+            </w:pPr>
+            <w:r/>
+            <w:r>
+              <w:rPr>
+                <w:b w:val="0"/>
+                <w:i w:val="0"/>
+                <w:color w:val="1F2937"/>
+                <w:sz w:val="20"/>
+              </w:rPr>
+              <w:t>✅ (is PR me)</w:t>
+            </w:r>
+          </w:p>
+        </w:tc>
+      </w:tr>
+      <w:tr>
+        <w:tc>
+          <w:tcPr>
+            <w:tcW w:type="dxa" w:w="2880"/>
+            <w:shd w:val="clear" w:color="auto" w:fill="EEF2FF"/>
+            <w:tcBorders>
+              <w:top w:val="single" w:sz="4" w:space="0" w:color="C7D2FE"/>
+              <w:left w:val="single" w:sz="4" w:space="0" w:color="C7D2FE"/>
+              <w:bottom w:val="single" w:sz="4" w:space="0" w:color="C7D2FE"/>
+              <w:right w:val="single" w:sz="4" w:space="0" w:color="C7D2FE"/>
+            </w:tcBorders>
+          </w:tcPr>
+          <w:p>
+            <w:pPr>
+              <w:spacing w:before="40" w:after="40"/>
+            </w:pPr>
+            <w:r/>
+            <w:r>
+              <w:rPr>
+                <w:b w:val="0"/>
+                <w:i w:val="0"/>
+                <w:color w:val="1F2937"/>
+                <w:sz w:val="20"/>
+              </w:rPr>
+              <w:t>WhatsApp/Messenger bridges → Sarvam</w:t>
+            </w:r>
+          </w:p>
+        </w:tc>
+        <w:tc>
+          <w:tcPr>
+            <w:tcW w:type="dxa" w:w="2880"/>
+            <w:shd w:val="clear" w:color="auto" w:fill="EEF2FF"/>
+            <w:tcBorders>
+              <w:top w:val="single" w:sz="4" w:space="0" w:color="C7D2FE"/>
+              <w:left w:val="single" w:sz="4" w:space="0" w:color="C7D2FE"/>
+              <w:bottom w:val="single" w:sz="4" w:space="0" w:color="C7D2FE"/>
+              <w:right w:val="single" w:sz="4" w:space="0" w:color="C7D2FE"/>
+            </w:tcBorders>
+          </w:tcPr>
+          <w:p>
+            <w:pPr>
+              <w:spacing w:before="40" w:after="40"/>
+            </w:pPr>
+            <w:r/>
+            <w:r>
+              <w:rPr>
+                <w:b w:val="0"/>
+                <w:i w:val="0"/>
+                <w:color w:val="1F2937"/>
+                <w:sz w:val="20"/>
+              </w:rPr>
+              <w:t>Dono WebRTC bridges Sarvam pe wired</w:t>
+            </w:r>
+          </w:p>
+        </w:tc>
+        <w:tc>
+          <w:tcPr>
+            <w:tcW w:type="dxa" w:w="2880"/>
+            <w:shd w:val="clear" w:color="auto" w:fill="EEF2FF"/>
+            <w:tcBorders>
+              <w:top w:val="single" w:sz="4" w:space="0" w:color="C7D2FE"/>
+              <w:left w:val="single" w:sz="4" w:space="0" w:color="C7D2FE"/>
+              <w:bottom w:val="single" w:sz="4" w:space="0" w:color="C7D2FE"/>
+              <w:right w:val="single" w:sz="4" w:space="0" w:color="C7D2FE"/>
+            </w:tcBorders>
+          </w:tcPr>
+          <w:p>
+            <w:pPr>
+              <w:spacing w:before="40" w:after="40"/>
+            </w:pPr>
+            <w:r/>
+            <w:r>
+              <w:rPr>
+                <w:b w:val="0"/>
+                <w:i w:val="0"/>
+                <w:color w:val="1F2937"/>
+                <w:sz w:val="20"/>
+              </w:rPr>
+              <w:t>✅ merged (#192)</w:t>
+            </w:r>
+          </w:p>
+        </w:tc>
+      </w:tr>
+      <w:tr>
+        <w:tc>
+          <w:tcPr>
+            <w:tcW w:type="dxa" w:w="2880"/>
+            <w:tcBorders>
+              <w:top w:val="single" w:sz="4" w:space="0" w:color="C7D2FE"/>
+              <w:left w:val="single" w:sz="4" w:space="0" w:color="C7D2FE"/>
+              <w:bottom w:val="single" w:sz="4" w:space="0" w:color="C7D2FE"/>
+              <w:right w:val="single" w:sz="4" w:space="0" w:color="C7D2FE"/>
+            </w:tcBorders>
+          </w:tcPr>
+          <w:p>
+            <w:pPr>
+              <w:spacing w:before="40" w:after="40"/>
+            </w:pPr>
+            <w:r/>
+            <w:r>
+              <w:rPr>
+                <w:b w:val="0"/>
+                <w:i w:val="0"/>
+                <w:color w:val="1F2937"/>
+                <w:sz w:val="20"/>
+              </w:rPr>
+              <w:t>WhatsApp + Messenger language+voice plumbing</w:t>
+            </w:r>
+          </w:p>
+        </w:tc>
+        <w:tc>
+          <w:tcPr>
+            <w:tcW w:type="dxa" w:w="2880"/>
+            <w:tcBorders>
+              <w:top w:val="single" w:sz="4" w:space="0" w:color="C7D2FE"/>
+              <w:left w:val="single" w:sz="4" w:space="0" w:color="C7D2FE"/>
+              <w:bottom w:val="single" w:sz="4" w:space="0" w:color="C7D2FE"/>
+              <w:right w:val="single" w:sz="4" w:space="0" w:color="C7D2FE"/>
+            </w:tcBorders>
+          </w:tcPr>
+          <w:p>
+            <w:pPr>
+              <w:spacing w:before="40" w:after="40"/>
+            </w:pPr>
+            <w:r/>
+            <w:r>
+              <w:rPr>
+                <w:b w:val="0"/>
+                <w:i w:val="0"/>
+                <w:color w:val="1F2937"/>
+                <w:sz w:val="20"/>
+              </w:rPr>
+              <w:t>Inbound/outbound WA + Messenger call ab agent ki primary language + Bulbul voice pe chalti hai (Indic ⇒ Sarvam)</w:t>
+            </w:r>
+          </w:p>
+        </w:tc>
+        <w:tc>
+          <w:tcPr>
+            <w:tcW w:type="dxa" w:w="2880"/>
+            <w:tcBorders>
+              <w:top w:val="single" w:sz="4" w:space="0" w:color="C7D2FE"/>
+              <w:left w:val="single" w:sz="4" w:space="0" w:color="C7D2FE"/>
+              <w:bottom w:val="single" w:sz="4" w:space="0" w:color="C7D2FE"/>
+              <w:right w:val="single" w:sz="4" w:space="0" w:color="C7D2FE"/>
+            </w:tcBorders>
+          </w:tcPr>
+          <w:p>
+            <w:pPr>
+              <w:spacing w:before="40" w:after="40"/>
+            </w:pPr>
+            <w:r/>
+            <w:r>
+              <w:rPr>
+                <w:b w:val="0"/>
+                <w:i w:val="0"/>
+                <w:color w:val="1F2937"/>
+                <w:sz w:val="20"/>
+              </w:rPr>
+              <w:t>✅ merged (#195)</w:t>
+            </w:r>
+          </w:p>
+        </w:tc>
+      </w:tr>
+      <w:tr>
+        <w:tc>
+          <w:tcPr>
+            <w:tcW w:type="dxa" w:w="2880"/>
+            <w:shd w:val="clear" w:color="auto" w:fill="EEF2FF"/>
+            <w:tcBorders>
+              <w:top w:val="single" w:sz="4" w:space="0" w:color="C7D2FE"/>
+              <w:left w:val="single" w:sz="4" w:space="0" w:color="C7D2FE"/>
+              <w:bottom w:val="single" w:sz="4" w:space="0" w:color="C7D2FE"/>
+              <w:right w:val="single" w:sz="4" w:space="0" w:color="C7D2FE"/>
+            </w:tcBorders>
+          </w:tcPr>
+          <w:p>
+            <w:pPr>
+              <w:spacing w:before="40" w:after="40"/>
+            </w:pPr>
+            <w:r/>
+            <w:r>
+              <w:rPr>
+                <w:b w:val="0"/>
+                <w:i w:val="0"/>
+                <w:color w:val="1F2937"/>
+                <w:sz w:val="20"/>
+              </w:rPr>
+              <w:t>PSTN dialer language+voice plumbing (API side)</w:t>
+            </w:r>
+          </w:p>
+        </w:tc>
+        <w:tc>
+          <w:tcPr>
+            <w:tcW w:type="dxa" w:w="2880"/>
+            <w:shd w:val="clear" w:color="auto" w:fill="EEF2FF"/>
+            <w:tcBorders>
+              <w:top w:val="single" w:sz="4" w:space="0" w:color="C7D2FE"/>
+              <w:left w:val="single" w:sz="4" w:space="0" w:color="C7D2FE"/>
+              <w:bottom w:val="single" w:sz="4" w:space="0" w:color="C7D2FE"/>
+              <w:right w:val="single" w:sz="4" w:space="0" w:color="C7D2FE"/>
+            </w:tcBorders>
+          </w:tcPr>
+          <w:p>
+            <w:pPr>
+              <w:spacing w:before="40" w:after="40"/>
+            </w:pPr>
+            <w:r/>
+            <w:r>
+              <w:rPr>
+                <w:b w:val="0"/>
+                <w:i w:val="0"/>
+                <w:color w:val="1F2937"/>
+                <w:sz w:val="20"/>
+              </w:rPr>
+              <w:t xml:space="preserve">Outbound PSTN dial ab agent ki language + Bulbul voice </w:t>
+            </w:r>
+            <w:r>
+              <w:rPr>
+                <w:rFonts w:ascii="Consolas" w:hAnsi="Consolas"/>
+                <w:b w:val="0"/>
+                <w:i w:val="0"/>
+                <w:color w:val="1F2937"/>
+                <w:sz w:val="20"/>
+              </w:rPr>
+              <w:t>/calls/dial</w:t>
+            </w:r>
+            <w:r>
+              <w:rPr>
+                <w:b w:val="0"/>
+                <w:i w:val="0"/>
+                <w:color w:val="1F2937"/>
+                <w:sz w:val="20"/>
+              </w:rPr>
+              <w:t xml:space="preserve"> body me bhejta hai — ready for voice-side go-live</w:t>
+            </w:r>
+          </w:p>
+        </w:tc>
+        <w:tc>
+          <w:tcPr>
+            <w:tcW w:type="dxa" w:w="2880"/>
+            <w:shd w:val="clear" w:color="auto" w:fill="EEF2FF"/>
+            <w:tcBorders>
+              <w:top w:val="single" w:sz="4" w:space="0" w:color="C7D2FE"/>
+              <w:left w:val="single" w:sz="4" w:space="0" w:color="C7D2FE"/>
+              <w:bottom w:val="single" w:sz="4" w:space="0" w:color="C7D2FE"/>
+              <w:right w:val="single" w:sz="4" w:space="0" w:color="C7D2FE"/>
+            </w:tcBorders>
+          </w:tcPr>
+          <w:p>
+            <w:pPr>
+              <w:spacing w:before="40" w:after="40"/>
+            </w:pPr>
+            <w:r/>
+            <w:r>
+              <w:rPr>
+                <w:b w:val="0"/>
+                <w:i w:val="0"/>
+                <w:color w:val="1F2937"/>
+                <w:sz w:val="20"/>
+              </w:rPr>
+              <w:t>✅ (is PR me)</w:t>
+            </w:r>
+          </w:p>
+        </w:tc>
+      </w:tr>
+    </w:tbl>
+    <w:p>
+      <w:pPr>
+        <w:spacing w:after="40"/>
+      </w:pPr>
+    </w:p>
+    <w:p>
+      <w:pPr>
+        <w:spacing w:after="80"/>
+      </w:pPr>
+      <w:r>
+        <w:rPr>
+          <w:b/>
+          <w:i w:val="0"/>
+          <w:color w:val="1F2937"/>
+          <w:sz w:val="21"/>
+        </w:rPr>
+        <w:t>Live test pending (`SARVAM_API_KEY` chahiye):</w:t>
+      </w:r>
+      <w:r>
+        <w:rPr>
+          <w:b w:val="0"/>
+          <w:i w:val="0"/>
+          <w:color w:val="1F2937"/>
+          <w:sz w:val="21"/>
+        </w:rPr>
+        <w:t xml:space="preserve"> real Sarvam call verify (STT frame-encoding confirm). </w:t>
+      </w:r>
+      <w:r>
+        <w:rPr>
+          <w:b/>
+          <w:i w:val="0"/>
+          <w:color w:val="1F2937"/>
+          <w:sz w:val="21"/>
+        </w:rPr>
+        <w:t>Baaki:</w:t>
+      </w:r>
+      <w:r>
+        <w:rPr>
+          <w:b w:val="0"/>
+          <w:i w:val="0"/>
+          <w:color w:val="1F2937"/>
+          <w:sz w:val="21"/>
+        </w:rPr>
+        <w:t xml:space="preserve"> voice-side </w:t>
+      </w:r>
+      <w:r>
+        <w:rPr>
+          <w:rFonts w:ascii="Consolas" w:hAnsi="Consolas"/>
+          <w:b w:val="0"/>
+          <w:i w:val="0"/>
+          <w:color w:val="1F2937"/>
+          <w:sz w:val="21"/>
+        </w:rPr>
+        <w:t>POST /calls/dial</w:t>
+      </w:r>
+      <w:r>
+        <w:rPr>
+          <w:b w:val="0"/>
+          <w:i w:val="0"/>
+          <w:color w:val="1F2937"/>
+          <w:sz w:val="21"/>
+        </w:rPr>
+        <w:t xml:space="preserve"> endpoint (carrier-gated Twilio go-live — API side ready), full dashboard UI localization (translation content). *(Language+voice ab chaaro calling paths pe: web widget + WhatsApp + Messenger live, PSTN API-side ready.)*</w:t>
+      </w:r>
+    </w:p>
+    <w:p>
+      <w:pPr>
+        <w:pBdr>
+          <w:bottom w:val="single" w:sz="6" w:space="1" w:color="C7D2FE"/>
+        </w:pBdr>
+        <w:spacing w:after="80"/>
+      </w:pPr>
+    </w:p>
+    <w:p>
+      <w:pPr>
+        <w:spacing w:before="280" w:after="120"/>
+        <w:pBdr>
+          <w:bottom w:val="single" w:sz="10" w:space="2" w:color="0EA5E9"/>
+        </w:pBdr>
+      </w:pPr>
+      <w:r>
+        <w:rPr>
+          <w:b/>
+          <w:i w:val="0"/>
+          <w:color w:val="4F46E5"/>
+          <w:sz w:val="30"/>
+        </w:rPr>
+        <w:t>📝 In-call FORM node — call ke dauraan form bharwana (PARITY-03 residual → complete)</w:t>
+      </w:r>
+    </w:p>
+    <w:p>
+      <w:pPr>
+        <w:spacing w:after="80"/>
+      </w:pPr>
+      <w:r>
+        <w:rPr>
+          <w:b w:val="0"/>
+          <w:i w:val="0"/>
+          <w:color w:val="1F2937"/>
+          <w:sz w:val="21"/>
+        </w:rPr>
+        <w:t xml:space="preserve">Flow builder me ek naya </w:t>
+      </w:r>
+      <w:r>
+        <w:rPr>
+          <w:b/>
+          <w:i w:val="0"/>
+          <w:color w:val="1F2937"/>
+          <w:sz w:val="21"/>
+        </w:rPr>
+        <w:t>"Form" node</w:t>
+      </w:r>
+      <w:r>
+        <w:rPr>
+          <w:b w:val="0"/>
+          <w:i w:val="0"/>
+          <w:color w:val="1F2937"/>
+          <w:sz w:val="21"/>
+        </w:rPr>
+        <w:t xml:space="preserve">: author canvas pe drag karke tenant ki koi </w:t>
+      </w:r>
+      <w:r>
+        <w:rPr>
+          <w:b/>
+          <w:i w:val="0"/>
+          <w:color w:val="1F2937"/>
+          <w:sz w:val="21"/>
+        </w:rPr>
+        <w:t>saved Form</w:t>
+      </w:r>
+      <w:r>
+        <w:rPr>
+          <w:b w:val="0"/>
+          <w:i w:val="0"/>
+          <w:color w:val="1F2937"/>
+          <w:sz w:val="21"/>
+        </w:rPr>
+        <w:t xml:space="preserve"> (Day 37) chunta hai — call/chat ke dauraan agent har field poochta hai, jawab capture karta hai, aur end pe </w:t>
+      </w:r>
+      <w:r>
+        <w:rPr>
+          <w:b/>
+          <w:i w:val="0"/>
+          <w:color w:val="1F2937"/>
+          <w:sz w:val="21"/>
+        </w:rPr>
+        <w:t>FormSubmission + Contact + Lead</w:t>
+      </w:r>
+      <w:r>
+        <w:rPr>
+          <w:b w:val="0"/>
+          <w:i w:val="0"/>
+          <w:color w:val="1F2937"/>
+          <w:sz w:val="21"/>
+        </w:rPr>
+        <w:t xml:space="preserve"> save hota hai (webhook/Sheet routing samet). Non-technical users ke liye — no JSON.</w:t>
+      </w:r>
+    </w:p>
+    <w:tbl>
+      <w:tblPr>
+        <w:tblW w:type="auto" w:w="0"/>
+        <w:jc w:val="center"/>
+        <w:tblLayout w:type="autofit"/>
+        <w:tblLook w:firstColumn="1" w:firstRow="1" w:lastColumn="0" w:lastRow="0" w:noHBand="0" w:noVBand="1" w:val="04A0"/>
+      </w:tblPr>
+      <w:tblGrid>
+        <w:gridCol w:w="2880"/>
+        <w:gridCol w:w="2880"/>
+        <w:gridCol w:w="2880"/>
+      </w:tblGrid>
+      <w:tr>
+        <w:tc>
+          <w:tcPr>
+            <w:tcW w:type="dxa" w:w="2880"/>
+            <w:shd w:val="clear" w:color="auto" w:fill="4F46E5"/>
+            <w:tcBorders>
+              <w:top w:val="single" w:sz="4" w:space="0" w:color="C7D2FE"/>
+              <w:left w:val="single" w:sz="4" w:space="0" w:color="C7D2FE"/>
+              <w:bottom w:val="single" w:sz="4" w:space="0" w:color="C7D2FE"/>
+              <w:right w:val="single" w:sz="4" w:space="0" w:color="C7D2FE"/>
+            </w:tcBorders>
+          </w:tcPr>
+          <w:p>
+            <w:pPr>
+              <w:spacing w:before="40" w:after="40"/>
+            </w:pPr>
+            <w:r/>
+            <w:r>
+              <w:rPr>
+                <w:b/>
+                <w:i w:val="0"/>
+                <w:color w:val="FFFFFF"/>
+                <w:sz w:val="20"/>
+              </w:rPr>
+              <w:t>Piece</w:t>
+            </w:r>
+          </w:p>
+        </w:tc>
+        <w:tc>
+          <w:tcPr>
+            <w:tcW w:type="dxa" w:w="2880"/>
+            <w:shd w:val="clear" w:color="auto" w:fill="4F46E5"/>
+            <w:tcBorders>
+              <w:top w:val="single" w:sz="4" w:space="0" w:color="C7D2FE"/>
+              <w:left w:val="single" w:sz="4" w:space="0" w:color="C7D2FE"/>
+              <w:bottom w:val="single" w:sz="4" w:space="0" w:color="C7D2FE"/>
+              <w:right w:val="single" w:sz="4" w:space="0" w:color="C7D2FE"/>
+            </w:tcBorders>
+          </w:tcPr>
+          <w:p>
+            <w:pPr>
+              <w:spacing w:before="40" w:after="40"/>
+            </w:pPr>
+            <w:r/>
+            <w:r>
+              <w:rPr>
+                <w:b/>
+                <w:i w:val="0"/>
+                <w:color w:val="FFFFFF"/>
+                <w:sz w:val="20"/>
+              </w:rPr>
+              <w:t>Kya hai</w:t>
+            </w:r>
+          </w:p>
+        </w:tc>
+        <w:tc>
+          <w:tcPr>
+            <w:tcW w:type="dxa" w:w="2880"/>
+            <w:shd w:val="clear" w:color="auto" w:fill="4F46E5"/>
+            <w:tcBorders>
+              <w:top w:val="single" w:sz="4" w:space="0" w:color="C7D2FE"/>
+              <w:left w:val="single" w:sz="4" w:space="0" w:color="C7D2FE"/>
+              <w:bottom w:val="single" w:sz="4" w:space="0" w:color="C7D2FE"/>
+              <w:right w:val="single" w:sz="4" w:space="0" w:color="C7D2FE"/>
+            </w:tcBorders>
+          </w:tcPr>
+          <w:p>
+            <w:pPr>
+              <w:spacing w:before="40" w:after="40"/>
+            </w:pPr>
+            <w:r/>
+            <w:r>
+              <w:rPr>
+                <w:b/>
+                <w:i w:val="0"/>
+                <w:color w:val="FFFFFF"/>
+                <w:sz w:val="20"/>
+              </w:rPr>
+              <w:t>Status</w:t>
+            </w:r>
+          </w:p>
+        </w:tc>
+      </w:tr>
+      <w:tr>
+        <w:tc>
+          <w:tcPr>
+            <w:tcW w:type="dxa" w:w="2880"/>
+            <w:tcBorders>
+              <w:top w:val="single" w:sz="4" w:space="0" w:color="C7D2FE"/>
+              <w:left w:val="single" w:sz="4" w:space="0" w:color="C7D2FE"/>
+              <w:bottom w:val="single" w:sz="4" w:space="0" w:color="C7D2FE"/>
+              <w:right w:val="single" w:sz="4" w:space="0" w:color="C7D2FE"/>
+            </w:tcBorders>
+          </w:tcPr>
+          <w:p>
+            <w:pPr>
+              <w:spacing w:before="40" w:after="40"/>
+            </w:pPr>
+            <w:r/>
+            <w:r>
+              <w:rPr>
+                <w:b w:val="0"/>
+                <w:i w:val="0"/>
+                <w:color w:val="1F2937"/>
+                <w:sz w:val="20"/>
+              </w:rPr>
+              <w:t>Shared foundation</w:t>
+            </w:r>
+          </w:p>
+        </w:tc>
+        <w:tc>
+          <w:tcPr>
+            <w:tcW w:type="dxa" w:w="2880"/>
+            <w:tcBorders>
+              <w:top w:val="single" w:sz="4" w:space="0" w:color="C7D2FE"/>
+              <w:left w:val="single" w:sz="4" w:space="0" w:color="C7D2FE"/>
+              <w:bottom w:val="single" w:sz="4" w:space="0" w:color="C7D2FE"/>
+              <w:right w:val="single" w:sz="4" w:space="0" w:color="C7D2FE"/>
+            </w:tcBorders>
+          </w:tcPr>
+          <w:p>
+            <w:pPr>
+              <w:spacing w:before="40" w:after="40"/>
+            </w:pPr>
+            <w:r/>
+            <w:r>
+              <w:rPr>
+                <w:rFonts w:ascii="Consolas" w:hAnsi="Consolas"/>
+                <w:b w:val="0"/>
+                <w:i w:val="0"/>
+                <w:color w:val="1F2937"/>
+                <w:sz w:val="20"/>
+              </w:rPr>
+              <w:t>FlowNodeType.FORM</w:t>
+            </w:r>
+            <w:r>
+              <w:rPr>
+                <w:b w:val="0"/>
+                <w:i w:val="0"/>
+                <w:color w:val="1F2937"/>
+                <w:sz w:val="20"/>
+              </w:rPr>
+              <w:t xml:space="preserve"> + config + </w:t>
+            </w:r>
+            <w:r>
+              <w:rPr>
+                <w:b/>
+                <w:i w:val="0"/>
+                <w:color w:val="1F2937"/>
+                <w:sz w:val="20"/>
+              </w:rPr>
+              <w:t>compile-time expansion</w:t>
+            </w:r>
+            <w:r>
+              <w:rPr>
+                <w:b w:val="0"/>
+                <w:i w:val="0"/>
+                <w:color w:val="1F2937"/>
+                <w:sz w:val="20"/>
+              </w:rPr>
+              <w:t xml:space="preserve"> (FORM → SAY/LISTEN chain) — koi runtime/voice-loop change nahi</w:t>
+            </w:r>
+          </w:p>
+        </w:tc>
+        <w:tc>
+          <w:tcPr>
+            <w:tcW w:type="dxa" w:w="2880"/>
+            <w:tcBorders>
+              <w:top w:val="single" w:sz="4" w:space="0" w:color="C7D2FE"/>
+              <w:left w:val="single" w:sz="4" w:space="0" w:color="C7D2FE"/>
+              <w:bottom w:val="single" w:sz="4" w:space="0" w:color="C7D2FE"/>
+              <w:right w:val="single" w:sz="4" w:space="0" w:color="C7D2FE"/>
+            </w:tcBorders>
+          </w:tcPr>
+          <w:p>
+            <w:pPr>
+              <w:spacing w:before="40" w:after="40"/>
+            </w:pPr>
+            <w:r/>
+            <w:r>
+              <w:rPr>
+                <w:b w:val="0"/>
+                <w:i w:val="0"/>
+                <w:color w:val="1F2937"/>
+                <w:sz w:val="20"/>
+              </w:rPr>
+              <w:t>✅ merged (#204)</w:t>
+            </w:r>
+          </w:p>
+        </w:tc>
+      </w:tr>
+      <w:tr>
+        <w:tc>
+          <w:tcPr>
+            <w:tcW w:type="dxa" w:w="2880"/>
+            <w:shd w:val="clear" w:color="auto" w:fill="EEF2FF"/>
+            <w:tcBorders>
+              <w:top w:val="single" w:sz="4" w:space="0" w:color="C7D2FE"/>
+              <w:left w:val="single" w:sz="4" w:space="0" w:color="C7D2FE"/>
+              <w:bottom w:val="single" w:sz="4" w:space="0" w:color="C7D2FE"/>
+              <w:right w:val="single" w:sz="4" w:space="0" w:color="C7D2FE"/>
+            </w:tcBorders>
+          </w:tcPr>
+          <w:p>
+            <w:pPr>
+              <w:spacing w:before="40" w:after="40"/>
+            </w:pPr>
+            <w:r/>
+            <w:r>
+              <w:rPr>
+                <w:b w:val="0"/>
+                <w:i w:val="0"/>
+                <w:color w:val="1F2937"/>
+                <w:sz w:val="20"/>
+              </w:rPr>
+              <w:t>API wiring (chat/messaging)</w:t>
+            </w:r>
+          </w:p>
+        </w:tc>
+        <w:tc>
+          <w:tcPr>
+            <w:tcW w:type="dxa" w:w="2880"/>
+            <w:shd w:val="clear" w:color="auto" w:fill="EEF2FF"/>
+            <w:tcBorders>
+              <w:top w:val="single" w:sz="4" w:space="0" w:color="C7D2FE"/>
+              <w:left w:val="single" w:sz="4" w:space="0" w:color="C7D2FE"/>
+              <w:bottom w:val="single" w:sz="4" w:space="0" w:color="C7D2FE"/>
+              <w:right w:val="single" w:sz="4" w:space="0" w:color="C7D2FE"/>
+            </w:tcBorders>
+          </w:tcPr>
+          <w:p>
+            <w:pPr>
+              <w:spacing w:before="40" w:after="40"/>
+            </w:pPr>
+            <w:r/>
+            <w:r>
+              <w:rPr>
+                <w:rFonts w:ascii="Consolas" w:hAnsi="Consolas"/>
+                <w:b w:val="0"/>
+                <w:i w:val="0"/>
+                <w:color w:val="1F2937"/>
+                <w:sz w:val="20"/>
+              </w:rPr>
+              <w:t>chat.service</w:t>
+            </w:r>
+            <w:r>
+              <w:rPr>
+                <w:b w:val="0"/>
+                <w:i w:val="0"/>
+                <w:color w:val="1F2937"/>
+                <w:sz w:val="20"/>
+              </w:rPr>
+              <w:t xml:space="preserve"> FORM nodes resolve+expand karta hai; conversation end pe </w:t>
+            </w:r>
+            <w:r>
+              <w:rPr>
+                <w:rFonts w:ascii="Consolas" w:hAnsi="Consolas"/>
+                <w:b w:val="0"/>
+                <w:i w:val="0"/>
+                <w:color w:val="1F2937"/>
+                <w:sz w:val="20"/>
+              </w:rPr>
+              <w:t>submitForCall</w:t>
+            </w:r>
+            <w:r>
+              <w:rPr>
+                <w:b w:val="0"/>
+                <w:i w:val="0"/>
+                <w:color w:val="1F2937"/>
+                <w:sz w:val="20"/>
+              </w:rPr>
+              <w:t xml:space="preserve"> se save (deterministic ask/capture)</w:t>
+            </w:r>
+          </w:p>
+        </w:tc>
+        <w:tc>
+          <w:tcPr>
+            <w:tcW w:type="dxa" w:w="2880"/>
+            <w:shd w:val="clear" w:color="auto" w:fill="EEF2FF"/>
+            <w:tcBorders>
+              <w:top w:val="single" w:sz="4" w:space="0" w:color="C7D2FE"/>
+              <w:left w:val="single" w:sz="4" w:space="0" w:color="C7D2FE"/>
+              <w:bottom w:val="single" w:sz="4" w:space="0" w:color="C7D2FE"/>
+              <w:right w:val="single" w:sz="4" w:space="0" w:color="C7D2FE"/>
+            </w:tcBorders>
+          </w:tcPr>
+          <w:p>
+            <w:pPr>
+              <w:spacing w:before="40" w:after="40"/>
+            </w:pPr>
+            <w:r/>
+            <w:r>
+              <w:rPr>
+                <w:b w:val="0"/>
+                <w:i w:val="0"/>
+                <w:color w:val="1F2937"/>
+                <w:sz w:val="20"/>
+              </w:rPr>
+              <w:t>✅ merged (#205)</w:t>
+            </w:r>
+          </w:p>
+        </w:tc>
+      </w:tr>
+      <w:tr>
+        <w:tc>
+          <w:tcPr>
+            <w:tcW w:type="dxa" w:w="2880"/>
+            <w:tcBorders>
+              <w:top w:val="single" w:sz="4" w:space="0" w:color="C7D2FE"/>
+              <w:left w:val="single" w:sz="4" w:space="0" w:color="C7D2FE"/>
+              <w:bottom w:val="single" w:sz="4" w:space="0" w:color="C7D2FE"/>
+              <w:right w:val="single" w:sz="4" w:space="0" w:color="C7D2FE"/>
+            </w:tcBorders>
+          </w:tcPr>
+          <w:p>
+            <w:pPr>
+              <w:spacing w:before="40" w:after="40"/>
+            </w:pPr>
+            <w:r/>
+            <w:r>
+              <w:rPr>
+                <w:b w:val="0"/>
+                <w:i w:val="0"/>
+                <w:color w:val="1F2937"/>
+                <w:sz w:val="20"/>
+              </w:rPr>
+              <w:t>Web builder node</w:t>
+            </w:r>
+          </w:p>
+        </w:tc>
+        <w:tc>
+          <w:tcPr>
+            <w:tcW w:type="dxa" w:w="2880"/>
+            <w:tcBorders>
+              <w:top w:val="single" w:sz="4" w:space="0" w:color="C7D2FE"/>
+              <w:left w:val="single" w:sz="4" w:space="0" w:color="C7D2FE"/>
+              <w:bottom w:val="single" w:sz="4" w:space="0" w:color="C7D2FE"/>
+              <w:right w:val="single" w:sz="4" w:space="0" w:color="C7D2FE"/>
+            </w:tcBorders>
+          </w:tcPr>
+          <w:p>
+            <w:pPr>
+              <w:spacing w:before="40" w:after="40"/>
+            </w:pPr>
+            <w:r/>
+            <w:r>
+              <w:rPr>
+                <w:b w:val="0"/>
+                <w:i w:val="0"/>
+                <w:color w:val="1F2937"/>
+                <w:sz w:val="20"/>
+              </w:rPr>
+              <w:t>Palette me "Form" + config panel (form picker, intro line, confirm toggle)</w:t>
+            </w:r>
+          </w:p>
+        </w:tc>
+        <w:tc>
+          <w:tcPr>
+            <w:tcW w:type="dxa" w:w="2880"/>
+            <w:tcBorders>
+              <w:top w:val="single" w:sz="4" w:space="0" w:color="C7D2FE"/>
+              <w:left w:val="single" w:sz="4" w:space="0" w:color="C7D2FE"/>
+              <w:bottom w:val="single" w:sz="4" w:space="0" w:color="C7D2FE"/>
+              <w:right w:val="single" w:sz="4" w:space="0" w:color="C7D2FE"/>
+            </w:tcBorders>
+          </w:tcPr>
+          <w:p>
+            <w:pPr>
+              <w:spacing w:before="40" w:after="40"/>
+            </w:pPr>
+            <w:r/>
+            <w:r>
+              <w:rPr>
+                <w:b w:val="0"/>
+                <w:i w:val="0"/>
+                <w:color w:val="1F2937"/>
+                <w:sz w:val="20"/>
+              </w:rPr>
+              <w:t>✅ merged (#206)</w:t>
+            </w:r>
+          </w:p>
+        </w:tc>
+      </w:tr>
+      <w:tr>
+        <w:tc>
+          <w:tcPr>
+            <w:tcW w:type="dxa" w:w="2880"/>
+            <w:shd w:val="clear" w:color="auto" w:fill="EEF2FF"/>
+            <w:tcBorders>
+              <w:top w:val="single" w:sz="4" w:space="0" w:color="C7D2FE"/>
+              <w:left w:val="single" w:sz="4" w:space="0" w:color="C7D2FE"/>
+              <w:bottom w:val="single" w:sz="4" w:space="0" w:color="C7D2FE"/>
+              <w:right w:val="single" w:sz="4" w:space="0" w:color="C7D2FE"/>
+            </w:tcBorders>
+          </w:tcPr>
+          <w:p>
+            <w:pPr>
+              <w:spacing w:before="40" w:after="40"/>
+            </w:pPr>
+            <w:r/>
+            <w:r>
+              <w:rPr>
+                <w:b w:val="0"/>
+                <w:i w:val="0"/>
+                <w:color w:val="1F2937"/>
+                <w:sz w:val="20"/>
+              </w:rPr>
+              <w:t>Voice leg</w:t>
+            </w:r>
+          </w:p>
+        </w:tc>
+        <w:tc>
+          <w:tcPr>
+            <w:tcW w:type="dxa" w:w="2880"/>
+            <w:shd w:val="clear" w:color="auto" w:fill="EEF2FF"/>
+            <w:tcBorders>
+              <w:top w:val="single" w:sz="4" w:space="0" w:color="C7D2FE"/>
+              <w:left w:val="single" w:sz="4" w:space="0" w:color="C7D2FE"/>
+              <w:bottom w:val="single" w:sz="4" w:space="0" w:color="C7D2FE"/>
+              <w:right w:val="single" w:sz="4" w:space="0" w:color="C7D2FE"/>
+            </w:tcBorders>
+          </w:tcPr>
+          <w:p>
+            <w:pPr>
+              <w:spacing w:before="40" w:after="40"/>
+            </w:pPr>
+            <w:r/>
+            <w:r>
+              <w:rPr>
+                <w:b w:val="0"/>
+                <w:i w:val="0"/>
+                <w:color w:val="1F2937"/>
+                <w:sz w:val="20"/>
+              </w:rPr>
+              <w:t xml:space="preserve">Dispatch pe </w:t>
+            </w:r>
+            <w:r>
+              <w:rPr>
+                <w:b/>
+                <w:i w:val="0"/>
+                <w:color w:val="1F2937"/>
+                <w:sz w:val="20"/>
+              </w:rPr>
+              <w:t>collection brief</w:t>
+            </w:r>
+            <w:r>
+              <w:rPr>
+                <w:b w:val="0"/>
+                <w:i w:val="0"/>
+                <w:color w:val="1F2937"/>
+                <w:sz w:val="20"/>
+              </w:rPr>
+              <w:t xml:space="preserve"> system prompt me (agent fields poochta hai) + post-call </w:t>
+            </w:r>
+            <w:r>
+              <w:rPr>
+                <w:b/>
+                <w:i w:val="0"/>
+                <w:color w:val="1F2937"/>
+                <w:sz w:val="20"/>
+              </w:rPr>
+              <w:t>metered LLM extraction</w:t>
+            </w:r>
+            <w:r>
+              <w:rPr>
+                <w:b w:val="0"/>
+                <w:i w:val="0"/>
+                <w:color w:val="1F2937"/>
+                <w:sz w:val="20"/>
+              </w:rPr>
+              <w:t xml:space="preserve"> transcript se (</w:t>
+            </w:r>
+            <w:r>
+              <w:rPr>
+                <w:rFonts w:ascii="Consolas" w:hAnsi="Consolas"/>
+                <w:b w:val="0"/>
+                <w:i w:val="0"/>
+                <w:color w:val="1F2937"/>
+                <w:sz w:val="20"/>
+              </w:rPr>
+              <w:t>FormExtractionService</w:t>
+            </w:r>
+            <w:r>
+              <w:rPr>
+                <w:b w:val="0"/>
+                <w:i w:val="0"/>
+                <w:color w:val="1F2937"/>
+                <w:sz w:val="20"/>
+              </w:rPr>
+              <w:t xml:space="preserve"> → </w:t>
+            </w:r>
+            <w:r>
+              <w:rPr>
+                <w:rFonts w:ascii="Consolas" w:hAnsi="Consolas"/>
+                <w:b w:val="0"/>
+                <w:i w:val="0"/>
+                <w:color w:val="1F2937"/>
+                <w:sz w:val="20"/>
+              </w:rPr>
+              <w:t>submitForCall</w:t>
+            </w:r>
+            <w:r>
+              <w:rPr>
+                <w:b w:val="0"/>
+                <w:i w:val="0"/>
+                <w:color w:val="1F2937"/>
+                <w:sz w:val="20"/>
+              </w:rPr>
+              <w:t xml:space="preserve">), </w:t>
+            </w:r>
+            <w:r>
+              <w:rPr>
+                <w:rFonts w:ascii="Consolas" w:hAnsi="Consolas"/>
+                <w:b w:val="0"/>
+                <w:i w:val="0"/>
+                <w:color w:val="1F2937"/>
+                <w:sz w:val="20"/>
+              </w:rPr>
+              <w:t>recordDisposition</w:t>
+            </w:r>
+            <w:r>
+              <w:rPr>
+                <w:b w:val="0"/>
+                <w:i w:val="0"/>
+                <w:color w:val="1F2937"/>
+                <w:sz w:val="20"/>
+              </w:rPr>
+              <w:t xml:space="preserve"> hook se trigger</w:t>
+            </w:r>
+          </w:p>
+        </w:tc>
+        <w:tc>
+          <w:tcPr>
+            <w:tcW w:type="dxa" w:w="2880"/>
+            <w:shd w:val="clear" w:color="auto" w:fill="EEF2FF"/>
+            <w:tcBorders>
+              <w:top w:val="single" w:sz="4" w:space="0" w:color="C7D2FE"/>
+              <w:left w:val="single" w:sz="4" w:space="0" w:color="C7D2FE"/>
+              <w:bottom w:val="single" w:sz="4" w:space="0" w:color="C7D2FE"/>
+              <w:right w:val="single" w:sz="4" w:space="0" w:color="C7D2FE"/>
+            </w:tcBorders>
+          </w:tcPr>
+          <w:p>
+            <w:pPr>
+              <w:spacing w:before="40" w:after="40"/>
+            </w:pPr>
+            <w:r/>
+            <w:r>
+              <w:rPr>
+                <w:b w:val="0"/>
+                <w:i w:val="0"/>
+                <w:color w:val="1F2937"/>
+                <w:sz w:val="20"/>
+              </w:rPr>
+              <w:t>✅ (is PR me)</w:t>
+            </w:r>
+          </w:p>
+        </w:tc>
+      </w:tr>
+    </w:tbl>
+    <w:p>
+      <w:pPr>
+        <w:spacing w:after="40"/>
+      </w:pPr>
+    </w:p>
+    <w:p>
+      <w:pPr>
+        <w:spacing w:after="80"/>
+      </w:pPr>
+      <w:r>
+        <w:rPr>
+          <w:b/>
+          <w:i w:val="0"/>
+          <w:color w:val="1F2937"/>
+          <w:sz w:val="21"/>
+        </w:rPr>
+        <w:t>Voice note (honest):</w:t>
+      </w:r>
+      <w:r>
+        <w:rPr>
+          <w:b w:val="0"/>
+          <w:i w:val="0"/>
+          <w:color w:val="1F2937"/>
+          <w:sz w:val="21"/>
+        </w:rPr>
+        <w:t xml:space="preserve"> voice loop LLM-driven hai (deterministic flow-nodes execute nahi karta), isliye voice pe Day-31 post-call-intel pattern use hota hai — prompt se collect, transcript se metered extraction. Extraction tab chalta hai jab call ka Transcript ho (widget leg ki transcript persistence voice go-live ke saath aati hai). FORM-less flow pe </w:t>
+      </w:r>
+      <w:r>
+        <w:rPr>
+          <w:b/>
+          <w:i w:val="0"/>
+          <w:color w:val="1F2937"/>
+          <w:sz w:val="21"/>
+        </w:rPr>
+        <w:t>zero LLM spend</w:t>
+      </w:r>
+      <w:r>
+        <w:rPr>
+          <w:b w:val="0"/>
+          <w:i w:val="0"/>
+          <w:color w:val="1F2937"/>
+          <w:sz w:val="21"/>
+        </w:rPr>
+        <w:t>.</w:t>
+      </w:r>
+    </w:p>
+    <w:p>
+      <w:pPr>
+        <w:pBdr>
+          <w:bottom w:val="single" w:sz="6" w:space="1" w:color="C7D2FE"/>
+        </w:pBdr>
+        <w:spacing w:after="80"/>
+      </w:pPr>
+    </w:p>
+    <w:p>
+      <w:pPr>
+        <w:spacing w:before="280" w:after="120"/>
+        <w:pBdr>
+          <w:bottom w:val="single" w:sz="10" w:space="2" w:color="0EA5E9"/>
+        </w:pBdr>
+      </w:pPr>
+      <w:r>
+        <w:rPr>
+          <w:b/>
+          <w:i w:val="0"/>
+          <w:color w:val="4F46E5"/>
+          <w:sz w:val="30"/>
+        </w:rPr>
+        <w:t>🔧 Post-audit hardening — "advertised but inert" seams ab real (P1/P2 sweep)</w:t>
+      </w:r>
+    </w:p>
+    <w:p>
+      <w:pPr>
+        <w:spacing w:after="80"/>
+      </w:pPr>
+      <w:r>
+        <w:rPr>
+          <w:rFonts w:ascii="Consolas" w:hAnsi="Consolas"/>
+          <w:b w:val="0"/>
+          <w:i w:val="0"/>
+          <w:color w:val="1F2937"/>
+          <w:sz w:val="21"/>
+        </w:rPr>
+        <w:t>docs/PENDING-AUDIT.md</w:t>
+      </w:r>
+      <w:r>
+        <w:rPr>
+          <w:b w:val="0"/>
+          <w:i w:val="0"/>
+          <w:color w:val="1F2937"/>
+          <w:sz w:val="21"/>
+        </w:rPr>
+        <w:t xml:space="preserve"> (4-way audit, #197) ne pakda tha ki kuch DI factories key set hone pe bhi Disabled/mock return karti thi. Ab ye sab </w:t>
+      </w:r>
+      <w:r>
+        <w:rPr>
+          <w:b/>
+          <w:i w:val="0"/>
+          <w:color w:val="1F2937"/>
+          <w:sz w:val="21"/>
+        </w:rPr>
+        <w:t>real adapters</w:t>
+      </w:r>
+      <w:r>
+        <w:rPr>
+          <w:b w:val="0"/>
+          <w:i w:val="0"/>
+          <w:color w:val="1F2937"/>
+          <w:sz w:val="21"/>
+        </w:rPr>
+        <w:t xml:space="preserve"> hain — key daalte hi live:</w:t>
+      </w:r>
+    </w:p>
+    <w:tbl>
+      <w:tblPr>
+        <w:tblW w:type="auto" w:w="0"/>
+        <w:jc w:val="center"/>
+        <w:tblLayout w:type="autofit"/>
+        <w:tblLook w:firstColumn="1" w:firstRow="1" w:lastColumn="0" w:lastRow="0" w:noHBand="0" w:noVBand="1" w:val="04A0"/>
+      </w:tblPr>
+      <w:tblGrid>
+        <w:gridCol w:w="2880"/>
+        <w:gridCol w:w="2880"/>
+        <w:gridCol w:w="2880"/>
+      </w:tblGrid>
+      <w:tr>
+        <w:tc>
+          <w:tcPr>
+            <w:tcW w:type="dxa" w:w="2880"/>
+            <w:shd w:val="clear" w:color="auto" w:fill="4F46E5"/>
+            <w:tcBorders>
+              <w:top w:val="single" w:sz="4" w:space="0" w:color="C7D2FE"/>
+              <w:left w:val="single" w:sz="4" w:space="0" w:color="C7D2FE"/>
+              <w:bottom w:val="single" w:sz="4" w:space="0" w:color="C7D2FE"/>
+              <w:right w:val="single" w:sz="4" w:space="0" w:color="C7D2FE"/>
+            </w:tcBorders>
+          </w:tcPr>
+          <w:p>
+            <w:pPr>
+              <w:spacing w:before="40" w:after="40"/>
+            </w:pPr>
+            <w:r/>
+            <w:r>
+              <w:rPr>
+                <w:b/>
+                <w:i w:val="0"/>
+                <w:color w:val="FFFFFF"/>
+                <w:sz w:val="20"/>
+              </w:rPr>
+              <w:t>Seam</w:t>
+            </w:r>
+          </w:p>
+        </w:tc>
+        <w:tc>
+          <w:tcPr>
+            <w:tcW w:type="dxa" w:w="2880"/>
+            <w:shd w:val="clear" w:color="auto" w:fill="4F46E5"/>
+            <w:tcBorders>
+              <w:top w:val="single" w:sz="4" w:space="0" w:color="C7D2FE"/>
+              <w:left w:val="single" w:sz="4" w:space="0" w:color="C7D2FE"/>
+              <w:bottom w:val="single" w:sz="4" w:space="0" w:color="C7D2FE"/>
+              <w:right w:val="single" w:sz="4" w:space="0" w:color="C7D2FE"/>
+            </w:tcBorders>
+          </w:tcPr>
+          <w:p>
+            <w:pPr>
+              <w:spacing w:before="40" w:after="40"/>
+            </w:pPr>
+            <w:r/>
+            <w:r>
+              <w:rPr>
+                <w:b/>
+                <w:i w:val="0"/>
+                <w:color w:val="FFFFFF"/>
+                <w:sz w:val="20"/>
+              </w:rPr>
+              <w:t>Live jab</w:t>
+            </w:r>
+          </w:p>
+        </w:tc>
+        <w:tc>
+          <w:tcPr>
+            <w:tcW w:type="dxa" w:w="2880"/>
+            <w:shd w:val="clear" w:color="auto" w:fill="4F46E5"/>
+            <w:tcBorders>
+              <w:top w:val="single" w:sz="4" w:space="0" w:color="C7D2FE"/>
+              <w:left w:val="single" w:sz="4" w:space="0" w:color="C7D2FE"/>
+              <w:bottom w:val="single" w:sz="4" w:space="0" w:color="C7D2FE"/>
+              <w:right w:val="single" w:sz="4" w:space="0" w:color="C7D2FE"/>
+            </w:tcBorders>
+          </w:tcPr>
+          <w:p>
+            <w:pPr>
+              <w:spacing w:before="40" w:after="40"/>
+            </w:pPr>
+            <w:r/>
+            <w:r>
+              <w:rPr>
+                <w:b/>
+                <w:i w:val="0"/>
+                <w:color w:val="FFFFFF"/>
+                <w:sz w:val="20"/>
+              </w:rPr>
+              <w:t>PR</w:t>
+            </w:r>
+          </w:p>
+        </w:tc>
+      </w:tr>
+      <w:tr>
+        <w:tc>
+          <w:tcPr>
+            <w:tcW w:type="dxa" w:w="2880"/>
+            <w:tcBorders>
+              <w:top w:val="single" w:sz="4" w:space="0" w:color="C7D2FE"/>
+              <w:left w:val="single" w:sz="4" w:space="0" w:color="C7D2FE"/>
+              <w:bottom w:val="single" w:sz="4" w:space="0" w:color="C7D2FE"/>
+              <w:right w:val="single" w:sz="4" w:space="0" w:color="C7D2FE"/>
+            </w:tcBorders>
+          </w:tcPr>
+          <w:p>
+            <w:pPr>
+              <w:spacing w:before="40" w:after="40"/>
+            </w:pPr>
+            <w:r/>
+            <w:r>
+              <w:rPr>
+                <w:b w:val="0"/>
+                <w:i w:val="0"/>
+                <w:color w:val="1F2937"/>
+                <w:sz w:val="20"/>
+              </w:rPr>
+              <w:t>SSO / SAML (WorkOS)</w:t>
+            </w:r>
+          </w:p>
+        </w:tc>
+        <w:tc>
+          <w:tcPr>
+            <w:tcW w:type="dxa" w:w="2880"/>
+            <w:tcBorders>
+              <w:top w:val="single" w:sz="4" w:space="0" w:color="C7D2FE"/>
+              <w:left w:val="single" w:sz="4" w:space="0" w:color="C7D2FE"/>
+              <w:bottom w:val="single" w:sz="4" w:space="0" w:color="C7D2FE"/>
+              <w:right w:val="single" w:sz="4" w:space="0" w:color="C7D2FE"/>
+            </w:tcBorders>
+          </w:tcPr>
+          <w:p>
+            <w:pPr>
+              <w:spacing w:before="40" w:after="40"/>
+            </w:pPr>
+            <w:r/>
+            <w:r>
+              <w:rPr>
+                <w:rFonts w:ascii="Consolas" w:hAnsi="Consolas"/>
+                <w:b w:val="0"/>
+                <w:i w:val="0"/>
+                <w:color w:val="1F2937"/>
+                <w:sz w:val="20"/>
+              </w:rPr>
+              <w:t>WORKOS_API_KEY</w:t>
+            </w:r>
+            <w:r>
+              <w:rPr>
+                <w:b w:val="0"/>
+                <w:i w:val="0"/>
+                <w:color w:val="1F2937"/>
+                <w:sz w:val="20"/>
+              </w:rPr>
+              <w:t xml:space="preserve"> + </w:t>
+            </w:r>
+            <w:r>
+              <w:rPr>
+                <w:rFonts w:ascii="Consolas" w:hAnsi="Consolas"/>
+                <w:b w:val="0"/>
+                <w:i w:val="0"/>
+                <w:color w:val="1F2937"/>
+                <w:sz w:val="20"/>
+              </w:rPr>
+              <w:t>WORKOS_CLIENT_ID</w:t>
+            </w:r>
+          </w:p>
+        </w:tc>
+        <w:tc>
+          <w:tcPr>
+            <w:tcW w:type="dxa" w:w="2880"/>
+            <w:tcBorders>
+              <w:top w:val="single" w:sz="4" w:space="0" w:color="C7D2FE"/>
+              <w:left w:val="single" w:sz="4" w:space="0" w:color="C7D2FE"/>
+              <w:bottom w:val="single" w:sz="4" w:space="0" w:color="C7D2FE"/>
+              <w:right w:val="single" w:sz="4" w:space="0" w:color="C7D2FE"/>
+            </w:tcBorders>
+          </w:tcPr>
+          <w:p>
+            <w:pPr>
+              <w:spacing w:before="40" w:after="40"/>
+            </w:pPr>
+            <w:r/>
+            <w:r>
+              <w:rPr>
+                <w:b w:val="0"/>
+                <w:i w:val="0"/>
+                <w:color w:val="1F2937"/>
+                <w:sz w:val="20"/>
+              </w:rPr>
+              <w:t>✅ #198</w:t>
+            </w:r>
+          </w:p>
+        </w:tc>
+      </w:tr>
+      <w:tr>
+        <w:tc>
+          <w:tcPr>
+            <w:tcW w:type="dxa" w:w="2880"/>
+            <w:shd w:val="clear" w:color="auto" w:fill="EEF2FF"/>
+            <w:tcBorders>
+              <w:top w:val="single" w:sz="4" w:space="0" w:color="C7D2FE"/>
+              <w:left w:val="single" w:sz="4" w:space="0" w:color="C7D2FE"/>
+              <w:bottom w:val="single" w:sz="4" w:space="0" w:color="C7D2FE"/>
+              <w:right w:val="single" w:sz="4" w:space="0" w:color="C7D2FE"/>
+            </w:tcBorders>
+          </w:tcPr>
+          <w:p>
+            <w:pPr>
+              <w:spacing w:before="40" w:after="40"/>
+            </w:pPr>
+            <w:r/>
+            <w:r>
+              <w:rPr>
+                <w:b w:val="0"/>
+                <w:i w:val="0"/>
+                <w:color w:val="1F2937"/>
+                <w:sz w:val="20"/>
+              </w:rPr>
+              <w:t>Marketing email (Resend)</w:t>
+            </w:r>
+          </w:p>
+        </w:tc>
+        <w:tc>
+          <w:tcPr>
+            <w:tcW w:type="dxa" w:w="2880"/>
+            <w:shd w:val="clear" w:color="auto" w:fill="EEF2FF"/>
+            <w:tcBorders>
+              <w:top w:val="single" w:sz="4" w:space="0" w:color="C7D2FE"/>
+              <w:left w:val="single" w:sz="4" w:space="0" w:color="C7D2FE"/>
+              <w:bottom w:val="single" w:sz="4" w:space="0" w:color="C7D2FE"/>
+              <w:right w:val="single" w:sz="4" w:space="0" w:color="C7D2FE"/>
+            </w:tcBorders>
+          </w:tcPr>
+          <w:p>
+            <w:pPr>
+              <w:spacing w:before="40" w:after="40"/>
+            </w:pPr>
+            <w:r/>
+            <w:r>
+              <w:rPr>
+                <w:rFonts w:ascii="Consolas" w:hAnsi="Consolas"/>
+                <w:b w:val="0"/>
+                <w:i w:val="0"/>
+                <w:color w:val="1F2937"/>
+                <w:sz w:val="20"/>
+              </w:rPr>
+              <w:t>RESEND_API_KEY</w:t>
+            </w:r>
+            <w:r>
+              <w:rPr>
+                <w:b w:val="0"/>
+                <w:i w:val="0"/>
+                <w:color w:val="1F2937"/>
+                <w:sz w:val="20"/>
+              </w:rPr>
+              <w:t xml:space="preserve"> + </w:t>
+            </w:r>
+            <w:r>
+              <w:rPr>
+                <w:rFonts w:ascii="Consolas" w:hAnsi="Consolas"/>
+                <w:b w:val="0"/>
+                <w:i w:val="0"/>
+                <w:color w:val="1F2937"/>
+                <w:sz w:val="20"/>
+              </w:rPr>
+              <w:t>MARKETING_EMAIL_FROM</w:t>
+            </w:r>
+          </w:p>
+        </w:tc>
+        <w:tc>
+          <w:tcPr>
+            <w:tcW w:type="dxa" w:w="2880"/>
+            <w:shd w:val="clear" w:color="auto" w:fill="EEF2FF"/>
+            <w:tcBorders>
+              <w:top w:val="single" w:sz="4" w:space="0" w:color="C7D2FE"/>
+              <w:left w:val="single" w:sz="4" w:space="0" w:color="C7D2FE"/>
+              <w:bottom w:val="single" w:sz="4" w:space="0" w:color="C7D2FE"/>
+              <w:right w:val="single" w:sz="4" w:space="0" w:color="C7D2FE"/>
+            </w:tcBorders>
+          </w:tcPr>
+          <w:p>
+            <w:pPr>
+              <w:spacing w:before="40" w:after="40"/>
+            </w:pPr>
+            <w:r/>
+            <w:r>
+              <w:rPr>
+                <w:b w:val="0"/>
+                <w:i w:val="0"/>
+                <w:color w:val="1F2937"/>
+                <w:sz w:val="20"/>
+              </w:rPr>
+              <w:t>✅ #198</w:t>
+            </w:r>
+          </w:p>
+        </w:tc>
+      </w:tr>
+      <w:tr>
+        <w:tc>
+          <w:tcPr>
+            <w:tcW w:type="dxa" w:w="2880"/>
+            <w:tcBorders>
+              <w:top w:val="single" w:sz="4" w:space="0" w:color="C7D2FE"/>
+              <w:left w:val="single" w:sz="4" w:space="0" w:color="C7D2FE"/>
+              <w:bottom w:val="single" w:sz="4" w:space="0" w:color="C7D2FE"/>
+              <w:right w:val="single" w:sz="4" w:space="0" w:color="C7D2FE"/>
+            </w:tcBorders>
+          </w:tcPr>
+          <w:p>
+            <w:pPr>
+              <w:spacing w:before="40" w:after="40"/>
+            </w:pPr>
+            <w:r/>
+            <w:r>
+              <w:rPr>
+                <w:b w:val="0"/>
+                <w:i w:val="0"/>
+                <w:color w:val="1F2937"/>
+                <w:sz w:val="20"/>
+              </w:rPr>
+              <w:t>Video avatars (HeyGen streaming)</w:t>
+            </w:r>
+          </w:p>
+        </w:tc>
+        <w:tc>
+          <w:tcPr>
+            <w:tcW w:type="dxa" w:w="2880"/>
+            <w:tcBorders>
+              <w:top w:val="single" w:sz="4" w:space="0" w:color="C7D2FE"/>
+              <w:left w:val="single" w:sz="4" w:space="0" w:color="C7D2FE"/>
+              <w:bottom w:val="single" w:sz="4" w:space="0" w:color="C7D2FE"/>
+              <w:right w:val="single" w:sz="4" w:space="0" w:color="C7D2FE"/>
+            </w:tcBorders>
+          </w:tcPr>
+          <w:p>
+            <w:pPr>
+              <w:spacing w:before="40" w:after="40"/>
+            </w:pPr>
+            <w:r/>
+            <w:r>
+              <w:rPr>
+                <w:rFonts w:ascii="Consolas" w:hAnsi="Consolas"/>
+                <w:b w:val="0"/>
+                <w:i w:val="0"/>
+                <w:color w:val="1F2937"/>
+                <w:sz w:val="20"/>
+              </w:rPr>
+              <w:t>AVATAR_PROVIDER_API_KEY</w:t>
+            </w:r>
+          </w:p>
+        </w:tc>
+        <w:tc>
+          <w:tcPr>
+            <w:tcW w:type="dxa" w:w="2880"/>
+            <w:tcBorders>
+              <w:top w:val="single" w:sz="4" w:space="0" w:color="C7D2FE"/>
+              <w:left w:val="single" w:sz="4" w:space="0" w:color="C7D2FE"/>
+              <w:bottom w:val="single" w:sz="4" w:space="0" w:color="C7D2FE"/>
+              <w:right w:val="single" w:sz="4" w:space="0" w:color="C7D2FE"/>
+            </w:tcBorders>
+          </w:tcPr>
+          <w:p>
+            <w:pPr>
+              <w:spacing w:before="40" w:after="40"/>
+            </w:pPr>
+            <w:r/>
+            <w:r>
+              <w:rPr>
+                <w:b w:val="0"/>
+                <w:i w:val="0"/>
+                <w:color w:val="1F2937"/>
+                <w:sz w:val="20"/>
+              </w:rPr>
+              <w:t>✅ #198</w:t>
+            </w:r>
+          </w:p>
+        </w:tc>
+      </w:tr>
+      <w:tr>
+        <w:tc>
+          <w:tcPr>
+            <w:tcW w:type="dxa" w:w="2880"/>
+            <w:shd w:val="clear" w:color="auto" w:fill="EEF2FF"/>
+            <w:tcBorders>
+              <w:top w:val="single" w:sz="4" w:space="0" w:color="C7D2FE"/>
+              <w:left w:val="single" w:sz="4" w:space="0" w:color="C7D2FE"/>
+              <w:bottom w:val="single" w:sz="4" w:space="0" w:color="C7D2FE"/>
+              <w:right w:val="single" w:sz="4" w:space="0" w:color="C7D2FE"/>
+            </w:tcBorders>
+          </w:tcPr>
+          <w:p>
+            <w:pPr>
+              <w:spacing w:before="40" w:after="40"/>
+            </w:pPr>
+            <w:r/>
+            <w:r>
+              <w:rPr>
+                <w:b w:val="0"/>
+                <w:i w:val="0"/>
+                <w:color w:val="1F2937"/>
+                <w:sz w:val="20"/>
+              </w:rPr>
+              <w:t>PCI payment receipts (email via Resend seam)</w:t>
+            </w:r>
+          </w:p>
+        </w:tc>
+        <w:tc>
+          <w:tcPr>
+            <w:tcW w:type="dxa" w:w="2880"/>
+            <w:shd w:val="clear" w:color="auto" w:fill="EEF2FF"/>
+            <w:tcBorders>
+              <w:top w:val="single" w:sz="4" w:space="0" w:color="C7D2FE"/>
+              <w:left w:val="single" w:sz="4" w:space="0" w:color="C7D2FE"/>
+              <w:bottom w:val="single" w:sz="4" w:space="0" w:color="C7D2FE"/>
+              <w:right w:val="single" w:sz="4" w:space="0" w:color="C7D2FE"/>
+            </w:tcBorders>
+          </w:tcPr>
+          <w:p>
+            <w:pPr>
+              <w:spacing w:before="40" w:after="40"/>
+            </w:pPr>
+            <w:r/>
+            <w:r>
+              <w:rPr>
+                <w:b w:val="0"/>
+                <w:i w:val="0"/>
+                <w:color w:val="1F2937"/>
+                <w:sz w:val="20"/>
+              </w:rPr>
+              <w:t>Resend configured</w:t>
+            </w:r>
+          </w:p>
+        </w:tc>
+        <w:tc>
+          <w:tcPr>
+            <w:tcW w:type="dxa" w:w="2880"/>
+            <w:shd w:val="clear" w:color="auto" w:fill="EEF2FF"/>
+            <w:tcBorders>
+              <w:top w:val="single" w:sz="4" w:space="0" w:color="C7D2FE"/>
+              <w:left w:val="single" w:sz="4" w:space="0" w:color="C7D2FE"/>
+              <w:bottom w:val="single" w:sz="4" w:space="0" w:color="C7D2FE"/>
+              <w:right w:val="single" w:sz="4" w:space="0" w:color="C7D2FE"/>
+            </w:tcBorders>
+          </w:tcPr>
+          <w:p>
+            <w:pPr>
+              <w:spacing w:before="40" w:after="40"/>
+            </w:pPr>
+            <w:r/>
+            <w:r>
+              <w:rPr>
+                <w:b w:val="0"/>
+                <w:i w:val="0"/>
+                <w:color w:val="1F2937"/>
+                <w:sz w:val="20"/>
+              </w:rPr>
+              <w:t>✅ #199</w:t>
+            </w:r>
+          </w:p>
+        </w:tc>
+      </w:tr>
+      <w:tr>
+        <w:tc>
+          <w:tcPr>
+            <w:tcW w:type="dxa" w:w="2880"/>
+            <w:tcBorders>
+              <w:top w:val="single" w:sz="4" w:space="0" w:color="C7D2FE"/>
+              <w:left w:val="single" w:sz="4" w:space="0" w:color="C7D2FE"/>
+              <w:bottom w:val="single" w:sz="4" w:space="0" w:color="C7D2FE"/>
+              <w:right w:val="single" w:sz="4" w:space="0" w:color="C7D2FE"/>
+            </w:tcBorders>
+          </w:tcPr>
+          <w:p>
+            <w:pPr>
+              <w:spacing w:before="40" w:after="40"/>
+            </w:pPr>
+            <w:r/>
+            <w:r>
+              <w:rPr>
+                <w:b w:val="0"/>
+                <w:i w:val="0"/>
+                <w:color w:val="1F2937"/>
+                <w:sz w:val="20"/>
+              </w:rPr>
+              <w:t>Provider fine-tune (OpenAI JSONL upload + job)</w:t>
+            </w:r>
+          </w:p>
+        </w:tc>
+        <w:tc>
+          <w:tcPr>
+            <w:tcW w:type="dxa" w:w="2880"/>
+            <w:tcBorders>
+              <w:top w:val="single" w:sz="4" w:space="0" w:color="C7D2FE"/>
+              <w:left w:val="single" w:sz="4" w:space="0" w:color="C7D2FE"/>
+              <w:bottom w:val="single" w:sz="4" w:space="0" w:color="C7D2FE"/>
+              <w:right w:val="single" w:sz="4" w:space="0" w:color="C7D2FE"/>
+            </w:tcBorders>
+          </w:tcPr>
+          <w:p>
+            <w:pPr>
+              <w:spacing w:before="40" w:after="40"/>
+            </w:pPr>
+            <w:r/>
+            <w:r>
+              <w:rPr>
+                <w:rFonts w:ascii="Consolas" w:hAnsi="Consolas"/>
+                <w:b w:val="0"/>
+                <w:i w:val="0"/>
+                <w:color w:val="1F2937"/>
+                <w:sz w:val="20"/>
+              </w:rPr>
+              <w:t>OPENAI_API_KEY</w:t>
+            </w:r>
+          </w:p>
+        </w:tc>
+        <w:tc>
+          <w:tcPr>
+            <w:tcW w:type="dxa" w:w="2880"/>
+            <w:tcBorders>
+              <w:top w:val="single" w:sz="4" w:space="0" w:color="C7D2FE"/>
+              <w:left w:val="single" w:sz="4" w:space="0" w:color="C7D2FE"/>
+              <w:bottom w:val="single" w:sz="4" w:space="0" w:color="C7D2FE"/>
+              <w:right w:val="single" w:sz="4" w:space="0" w:color="C7D2FE"/>
+            </w:tcBorders>
+          </w:tcPr>
+          <w:p>
+            <w:pPr>
+              <w:spacing w:before="40" w:after="40"/>
+            </w:pPr>
+            <w:r/>
+            <w:r>
+              <w:rPr>
+                <w:b w:val="0"/>
+                <w:i w:val="0"/>
+                <w:color w:val="1F2937"/>
+                <w:sz w:val="20"/>
+              </w:rPr>
+              <w:t>✅ #200</w:t>
+            </w:r>
+          </w:p>
+        </w:tc>
+      </w:tr>
+      <w:tr>
+        <w:tc>
+          <w:tcPr>
+            <w:tcW w:type="dxa" w:w="2880"/>
+            <w:shd w:val="clear" w:color="auto" w:fill="EEF2FF"/>
+            <w:tcBorders>
+              <w:top w:val="single" w:sz="4" w:space="0" w:color="C7D2FE"/>
+              <w:left w:val="single" w:sz="4" w:space="0" w:color="C7D2FE"/>
+              <w:bottom w:val="single" w:sz="4" w:space="0" w:color="C7D2FE"/>
+              <w:right w:val="single" w:sz="4" w:space="0" w:color="C7D2FE"/>
+            </w:tcBorders>
+          </w:tcPr>
+          <w:p>
+            <w:pPr>
+              <w:spacing w:before="40" w:after="40"/>
+            </w:pPr>
+            <w:r/>
+            <w:r>
+              <w:rPr>
+                <w:b w:val="0"/>
+                <w:i w:val="0"/>
+                <w:color w:val="1F2937"/>
+                <w:sz w:val="20"/>
+              </w:rPr>
+              <w:t>Qdrant vector store (REST client, tenant-filtered)</w:t>
+            </w:r>
+          </w:p>
+        </w:tc>
+        <w:tc>
+          <w:tcPr>
+            <w:tcW w:type="dxa" w:w="2880"/>
+            <w:shd w:val="clear" w:color="auto" w:fill="EEF2FF"/>
+            <w:tcBorders>
+              <w:top w:val="single" w:sz="4" w:space="0" w:color="C7D2FE"/>
+              <w:left w:val="single" w:sz="4" w:space="0" w:color="C7D2FE"/>
+              <w:bottom w:val="single" w:sz="4" w:space="0" w:color="C7D2FE"/>
+              <w:right w:val="single" w:sz="4" w:space="0" w:color="C7D2FE"/>
+            </w:tcBorders>
+          </w:tcPr>
+          <w:p>
+            <w:pPr>
+              <w:spacing w:before="40" w:after="40"/>
+            </w:pPr>
+            <w:r/>
+            <w:r>
+              <w:rPr>
+                <w:rFonts w:ascii="Consolas" w:hAnsi="Consolas"/>
+                <w:b w:val="0"/>
+                <w:i w:val="0"/>
+                <w:color w:val="1F2937"/>
+                <w:sz w:val="20"/>
+              </w:rPr>
+              <w:t>QDRANT_URL</w:t>
+            </w:r>
+            <w:r>
+              <w:rPr>
+                <w:b w:val="0"/>
+                <w:i w:val="0"/>
+                <w:color w:val="1F2937"/>
+                <w:sz w:val="20"/>
+              </w:rPr>
+              <w:t xml:space="preserve"> (+</w:t>
+            </w:r>
+            <w:r>
+              <w:rPr>
+                <w:rFonts w:ascii="Consolas" w:hAnsi="Consolas"/>
+                <w:b w:val="0"/>
+                <w:i w:val="0"/>
+                <w:color w:val="1F2937"/>
+                <w:sz w:val="20"/>
+              </w:rPr>
+              <w:t>QDRANT_API_KEY</w:t>
+            </w:r>
+            <w:r>
+              <w:rPr>
+                <w:b w:val="0"/>
+                <w:i w:val="0"/>
+                <w:color w:val="1F2937"/>
+                <w:sz w:val="20"/>
+              </w:rPr>
+              <w:t>)</w:t>
+            </w:r>
+          </w:p>
+        </w:tc>
+        <w:tc>
+          <w:tcPr>
+            <w:tcW w:type="dxa" w:w="2880"/>
+            <w:shd w:val="clear" w:color="auto" w:fill="EEF2FF"/>
+            <w:tcBorders>
+              <w:top w:val="single" w:sz="4" w:space="0" w:color="C7D2FE"/>
+              <w:left w:val="single" w:sz="4" w:space="0" w:color="C7D2FE"/>
+              <w:bottom w:val="single" w:sz="4" w:space="0" w:color="C7D2FE"/>
+              <w:right w:val="single" w:sz="4" w:space="0" w:color="C7D2FE"/>
+            </w:tcBorders>
+          </w:tcPr>
+          <w:p>
+            <w:pPr>
+              <w:spacing w:before="40" w:after="40"/>
+            </w:pPr>
+            <w:r/>
+            <w:r>
+              <w:rPr>
+                <w:b w:val="0"/>
+                <w:i w:val="0"/>
+                <w:color w:val="1F2937"/>
+                <w:sz w:val="20"/>
+              </w:rPr>
+              <w:t>✅ #201</w:t>
+            </w:r>
+          </w:p>
+        </w:tc>
+      </w:tr>
+      <w:tr>
+        <w:tc>
+          <w:tcPr>
+            <w:tcW w:type="dxa" w:w="2880"/>
+            <w:tcBorders>
+              <w:top w:val="single" w:sz="4" w:space="0" w:color="C7D2FE"/>
+              <w:left w:val="single" w:sz="4" w:space="0" w:color="C7D2FE"/>
+              <w:bottom w:val="single" w:sz="4" w:space="0" w:color="C7D2FE"/>
+              <w:right w:val="single" w:sz="4" w:space="0" w:color="C7D2FE"/>
+            </w:tcBorders>
+          </w:tcPr>
+          <w:p>
+            <w:pPr>
+              <w:spacing w:before="40" w:after="40"/>
+            </w:pPr>
+            <w:r/>
+            <w:r>
+              <w:rPr>
+                <w:b w:val="0"/>
+                <w:i w:val="0"/>
+                <w:color w:val="1F2937"/>
+                <w:sz w:val="20"/>
+              </w:rPr>
+              <w:t>Salesforce / Zendesk / Webhook / Zapier connectors</w:t>
+            </w:r>
+          </w:p>
+        </w:tc>
+        <w:tc>
+          <w:tcPr>
+            <w:tcW w:type="dxa" w:w="2880"/>
+            <w:tcBorders>
+              <w:top w:val="single" w:sz="4" w:space="0" w:color="C7D2FE"/>
+              <w:left w:val="single" w:sz="4" w:space="0" w:color="C7D2FE"/>
+              <w:bottom w:val="single" w:sz="4" w:space="0" w:color="C7D2FE"/>
+              <w:right w:val="single" w:sz="4" w:space="0" w:color="C7D2FE"/>
+            </w:tcBorders>
+          </w:tcPr>
+          <w:p>
+            <w:pPr>
+              <w:spacing w:before="40" w:after="40"/>
+            </w:pPr>
+            <w:r/>
+            <w:r>
+              <w:rPr>
+                <w:b w:val="0"/>
+                <w:i w:val="0"/>
+                <w:color w:val="1F2937"/>
+                <w:sz w:val="20"/>
+              </w:rPr>
+              <w:t>token + setting (instanceUrl/subdomain/url) — connect form me fields (#203)</w:t>
+            </w:r>
+          </w:p>
+        </w:tc>
+        <w:tc>
+          <w:tcPr>
+            <w:tcW w:type="dxa" w:w="2880"/>
+            <w:tcBorders>
+              <w:top w:val="single" w:sz="4" w:space="0" w:color="C7D2FE"/>
+              <w:left w:val="single" w:sz="4" w:space="0" w:color="C7D2FE"/>
+              <w:bottom w:val="single" w:sz="4" w:space="0" w:color="C7D2FE"/>
+              <w:right w:val="single" w:sz="4" w:space="0" w:color="C7D2FE"/>
+            </w:tcBorders>
+          </w:tcPr>
+          <w:p>
+            <w:pPr>
+              <w:spacing w:before="40" w:after="40"/>
+            </w:pPr>
+            <w:r/>
+            <w:r>
+              <w:rPr>
+                <w:b w:val="0"/>
+                <w:i w:val="0"/>
+                <w:color w:val="1F2937"/>
+                <w:sz w:val="20"/>
+              </w:rPr>
+              <w:t>✅ #202</w:t>
+            </w:r>
+          </w:p>
+        </w:tc>
+      </w:tr>
+    </w:tbl>
+    <w:p>
+      <w:pPr>
+        <w:spacing w:after="40"/>
+      </w:pPr>
+    </w:p>
+    <w:p>
+      <w:pPr>
+        <w:spacing w:after="80"/>
+      </w:pPr>
+      <w:r>
+        <w:rPr>
+          <w:b/>
+          <w:i w:val="0"/>
+          <w:color w:val="1F2937"/>
+          <w:sz w:val="21"/>
+        </w:rPr>
+        <w:t>Ab bhi partner/decision-gated:</w:t>
+      </w:r>
+      <w:r>
+        <w:rPr>
+          <w:b w:val="0"/>
+          <w:i w:val="0"/>
+          <w:color w:val="1F2937"/>
+          <w:sz w:val="21"/>
+        </w:rPr>
+        <w:t xml:space="preserve"> PCI card-capture (PCI-DSS partner), cloud KMS (</w:t>
+      </w:r>
+      <w:r>
+        <w:rPr>
+          <w:rFonts w:ascii="Consolas" w:hAnsi="Consolas"/>
+          <w:b w:val="0"/>
+          <w:i w:val="0"/>
+          <w:color w:val="1F2937"/>
+          <w:sz w:val="21"/>
+        </w:rPr>
+        <w:t>KMS_KEY_ID</w:t>
+      </w:r>
+      <w:r>
+        <w:rPr>
+          <w:b w:val="0"/>
+          <w:i w:val="0"/>
+          <w:color w:val="1F2937"/>
+          <w:sz w:val="21"/>
+        </w:rPr>
+        <w:t>), spam-label/STIR-SHAKEN lookup.</w:t>
       </w:r>
     </w:p>
     <w:sectPr>

</xml_diff>

<commit_message>
docs: regenerate PROJECT-FEATURES-EXPLAINED.docx from current .md (#245)
The styled Word doc had gone stale (built Jul 24; the .md source of
truth was current to Jul 30). The regen was previously blocked on
python-docx/lxml being unavailable in the sandbox — both are present
now, so ran scripts/gen-features-docx.py to rebuild from the Markdown
(55,005 → 58,203 bytes; 66 paragraphs / 17 tables). Faithful render of
the existing .md (no new feature text) — just re-syncs the pair per the
features-doc convention (.md stays the single source of truth).

Co-authored-by: thequantcoder <guptaarpita1702@gmail.com>
Co-authored-by: Claude Opus 4.8 (1M context) <noreply@anthropic.com>
</commit_message>
<xml_diff>
--- a/docs/PROJECT-FEATURES-EXPLAINED.docx
+++ b/docs/PROJECT-FEATURES-EXPLAINED.docx
@@ -16332,6 +16332,2608 @@
           <w:sz w:val="21"/>
         </w:rPr>
         <w:t xml:space="preserve"> Twilio, Stripe, SIP, Google Calendar/Sheets, voice biometrics, avatar, messaging channels.</w:t>
+      </w:r>
+    </w:p>
+    <w:p>
+      <w:pPr>
+        <w:pBdr>
+          <w:bottom w:val="single" w:sz="6" w:space="1" w:color="C7D2FE"/>
+        </w:pBdr>
+        <w:spacing w:after="80"/>
+      </w:pPr>
+    </w:p>
+    <w:p>
+      <w:pPr>
+        <w:spacing w:before="280" w:after="120"/>
+        <w:pBdr>
+          <w:bottom w:val="single" w:sz="10" w:space="2" w:color="0EA5E9"/>
+        </w:pBdr>
+      </w:pPr>
+      <w:r>
+        <w:rPr>
+          <w:b/>
+          <w:i w:val="0"/>
+          <w:color w:val="4F46E5"/>
+          <w:sz w:val="30"/>
+        </w:rPr>
+        <w:t>🇮🇳 India Voice (Sarvam AI) — India-first calling</w:t>
+      </w:r>
+    </w:p>
+    <w:p>
+      <w:pPr>
+        <w:spacing w:after="80"/>
+      </w:pPr>
+      <w:r>
+        <w:rPr>
+          <w:b w:val="0"/>
+          <w:i w:val="0"/>
+          <w:color w:val="1F2937"/>
+          <w:sz w:val="21"/>
+        </w:rPr>
+        <w:t xml:space="preserve">VocalIQ ka India play: ek </w:t>
+      </w:r>
+      <w:r>
+        <w:rPr>
+          <w:b/>
+          <w:i w:val="0"/>
+          <w:color w:val="1F2937"/>
+          <w:sz w:val="21"/>
+        </w:rPr>
+        <w:t>Indian-language agent</w:t>
+      </w:r>
+      <w:r>
+        <w:rPr>
+          <w:b w:val="0"/>
+          <w:i w:val="0"/>
+          <w:color w:val="1F2937"/>
+          <w:sz w:val="21"/>
+        </w:rPr>
+        <w:t xml:space="preserve"> ki poori call </w:t>
+      </w:r>
+      <w:r>
+        <w:rPr>
+          <w:b/>
+          <w:i w:val="0"/>
+          <w:color w:val="1F2937"/>
+          <w:sz w:val="21"/>
+        </w:rPr>
+        <w:t>Sarvam AI</w:t>
+      </w:r>
+      <w:r>
+        <w:rPr>
+          <w:b w:val="0"/>
+          <w:i w:val="0"/>
+          <w:color w:val="1F2937"/>
+          <w:sz w:val="21"/>
+        </w:rPr>
+        <w:t xml:space="preserve"> pe chalti hai — STT (Saaras v3), LLM (sarvam-30b), TTS (Bulbul v3) — best Hindi + regional accuracy ke liye. Sab kuch provider-router seam ke peeche hai aur </w:t>
+      </w:r>
+      <w:r>
+        <w:rPr>
+          <w:b/>
+          <w:i w:val="0"/>
+          <w:color w:val="1F2937"/>
+          <w:sz w:val="21"/>
+        </w:rPr>
+        <w:t>`SARVAM_API_KEY` set hone tak gated</w:t>
+      </w:r>
+      <w:r>
+        <w:rPr>
+          <w:b w:val="0"/>
+          <w:i w:val="0"/>
+          <w:color w:val="1F2937"/>
+          <w:sz w:val="21"/>
+        </w:rPr>
+        <w:t xml:space="preserve"> (key na ho to default stack pe fall back).</w:t>
+      </w:r>
+    </w:p>
+    <w:p>
+      <w:pPr>
+        <w:spacing w:after="80"/>
+      </w:pPr>
+      <w:r>
+        <w:rPr>
+          <w:b/>
+          <w:i w:val="0"/>
+          <w:color w:val="1F2937"/>
+          <w:sz w:val="21"/>
+        </w:rPr>
+        <w:t>Kaise kaam karta hai (end-to-end):</w:t>
+      </w:r>
+      <w:r>
+        <w:rPr>
+          <w:b w:val="0"/>
+          <w:i w:val="0"/>
+          <w:color w:val="1F2937"/>
+          <w:sz w:val="21"/>
+        </w:rPr>
+        <w:t xml:space="preserve"> Agent builder me aap </w:t>
+      </w:r>
+      <w:r>
+        <w:rPr>
+          <w:b/>
+          <w:i w:val="0"/>
+          <w:color w:val="1F2937"/>
+          <w:sz w:val="21"/>
+        </w:rPr>
+        <w:t>languages</w:t>
+      </w:r>
+      <w:r>
+        <w:rPr>
+          <w:b w:val="0"/>
+          <w:i w:val="0"/>
+          <w:color w:val="1F2937"/>
+          <w:sz w:val="21"/>
+        </w:rPr>
+        <w:t xml:space="preserve"> chunte ho — pehli (Primary) language call ki voice routing decide karti hai. Agar Primary koi Indian language hai (Hindi, Tamil, Marathi, Bengali, …) to loop apne aap Sarvam pe route ho jaata hai. Indian-language agent ke liye ek </w:t>
+      </w:r>
+      <w:r>
+        <w:rPr>
+          <w:b/>
+          <w:i w:val="0"/>
+          <w:color w:val="1F2937"/>
+          <w:sz w:val="21"/>
+        </w:rPr>
+        <w:t>Bulbul voice-picker</w:t>
+      </w:r>
+      <w:r>
+        <w:rPr>
+          <w:b w:val="0"/>
+          <w:i w:val="0"/>
+          <w:color w:val="1F2937"/>
+          <w:sz w:val="21"/>
+        </w:rPr>
+        <w:t xml:space="preserve"> bhi dikhta hai (39 speakers, gender-wise) — chuni hui awaaz agent ke </w:t>
+      </w:r>
+      <w:r>
+        <w:rPr>
+          <w:rFonts w:ascii="Consolas" w:hAnsi="Consolas"/>
+          <w:b w:val="0"/>
+          <w:i w:val="0"/>
+          <w:color w:val="1F2937"/>
+          <w:sz w:val="21"/>
+        </w:rPr>
+        <w:t>persona</w:t>
+      </w:r>
+      <w:r>
+        <w:rPr>
+          <w:b w:val="0"/>
+          <w:i w:val="0"/>
+          <w:color w:val="1F2937"/>
+          <w:sz w:val="21"/>
+        </w:rPr>
+        <w:t xml:space="preserve"> me store hoke Sarvam TTS ko drive karti hai.</w:t>
+      </w:r>
+    </w:p>
+    <w:tbl>
+      <w:tblPr>
+        <w:tblW w:type="auto" w:w="0"/>
+        <w:jc w:val="center"/>
+        <w:tblLayout w:type="autofit"/>
+        <w:tblLook w:firstColumn="1" w:firstRow="1" w:lastColumn="0" w:lastRow="0" w:noHBand="0" w:noVBand="1" w:val="04A0"/>
+      </w:tblPr>
+      <w:tblGrid>
+        <w:gridCol w:w="2880"/>
+        <w:gridCol w:w="2880"/>
+        <w:gridCol w:w="2880"/>
+      </w:tblGrid>
+      <w:tr>
+        <w:tc>
+          <w:tcPr>
+            <w:tcW w:type="dxa" w:w="2880"/>
+            <w:shd w:val="clear" w:color="auto" w:fill="4F46E5"/>
+            <w:tcBorders>
+              <w:top w:val="single" w:sz="4" w:space="0" w:color="C7D2FE"/>
+              <w:left w:val="single" w:sz="4" w:space="0" w:color="C7D2FE"/>
+              <w:bottom w:val="single" w:sz="4" w:space="0" w:color="C7D2FE"/>
+              <w:right w:val="single" w:sz="4" w:space="0" w:color="C7D2FE"/>
+            </w:tcBorders>
+          </w:tcPr>
+          <w:p>
+            <w:pPr>
+              <w:spacing w:before="40" w:after="40"/>
+            </w:pPr>
+            <w:r/>
+            <w:r>
+              <w:rPr>
+                <w:b/>
+                <w:i w:val="0"/>
+                <w:color w:val="FFFFFF"/>
+                <w:sz w:val="20"/>
+              </w:rPr>
+              <w:t>Feature</w:t>
+            </w:r>
+          </w:p>
+        </w:tc>
+        <w:tc>
+          <w:tcPr>
+            <w:tcW w:type="dxa" w:w="2880"/>
+            <w:shd w:val="clear" w:color="auto" w:fill="4F46E5"/>
+            <w:tcBorders>
+              <w:top w:val="single" w:sz="4" w:space="0" w:color="C7D2FE"/>
+              <w:left w:val="single" w:sz="4" w:space="0" w:color="C7D2FE"/>
+              <w:bottom w:val="single" w:sz="4" w:space="0" w:color="C7D2FE"/>
+              <w:right w:val="single" w:sz="4" w:space="0" w:color="C7D2FE"/>
+            </w:tcBorders>
+          </w:tcPr>
+          <w:p>
+            <w:pPr>
+              <w:spacing w:before="40" w:after="40"/>
+            </w:pPr>
+            <w:r/>
+            <w:r>
+              <w:rPr>
+                <w:b/>
+                <w:i w:val="0"/>
+                <w:color w:val="FFFFFF"/>
+                <w:sz w:val="20"/>
+              </w:rPr>
+              <w:t>Kya hai</w:t>
+            </w:r>
+          </w:p>
+        </w:tc>
+        <w:tc>
+          <w:tcPr>
+            <w:tcW w:type="dxa" w:w="2880"/>
+            <w:shd w:val="clear" w:color="auto" w:fill="4F46E5"/>
+            <w:tcBorders>
+              <w:top w:val="single" w:sz="4" w:space="0" w:color="C7D2FE"/>
+              <w:left w:val="single" w:sz="4" w:space="0" w:color="C7D2FE"/>
+              <w:bottom w:val="single" w:sz="4" w:space="0" w:color="C7D2FE"/>
+              <w:right w:val="single" w:sz="4" w:space="0" w:color="C7D2FE"/>
+            </w:tcBorders>
+          </w:tcPr>
+          <w:p>
+            <w:pPr>
+              <w:spacing w:before="40" w:after="40"/>
+            </w:pPr>
+            <w:r/>
+            <w:r>
+              <w:rPr>
+                <w:b/>
+                <w:i w:val="0"/>
+                <w:color w:val="FFFFFF"/>
+                <w:sz w:val="20"/>
+              </w:rPr>
+              <w:t>Status</w:t>
+            </w:r>
+          </w:p>
+        </w:tc>
+      </w:tr>
+      <w:tr>
+        <w:tc>
+          <w:tcPr>
+            <w:tcW w:type="dxa" w:w="2880"/>
+            <w:tcBorders>
+              <w:top w:val="single" w:sz="4" w:space="0" w:color="C7D2FE"/>
+              <w:left w:val="single" w:sz="4" w:space="0" w:color="C7D2FE"/>
+              <w:bottom w:val="single" w:sz="4" w:space="0" w:color="C7D2FE"/>
+              <w:right w:val="single" w:sz="4" w:space="0" w:color="C7D2FE"/>
+            </w:tcBorders>
+          </w:tcPr>
+          <w:p>
+            <w:pPr>
+              <w:spacing w:before="40" w:after="40"/>
+            </w:pPr>
+            <w:r/>
+            <w:r>
+              <w:rPr>
+                <w:b w:val="0"/>
+                <w:i w:val="0"/>
+                <w:color w:val="1F2937"/>
+                <w:sz w:val="20"/>
+              </w:rPr>
+              <w:t>Sarvam adapters (STT/LLM/TTS)</w:t>
+            </w:r>
+          </w:p>
+        </w:tc>
+        <w:tc>
+          <w:tcPr>
+            <w:tcW w:type="dxa" w:w="2880"/>
+            <w:tcBorders>
+              <w:top w:val="single" w:sz="4" w:space="0" w:color="C7D2FE"/>
+              <w:left w:val="single" w:sz="4" w:space="0" w:color="C7D2FE"/>
+              <w:bottom w:val="single" w:sz="4" w:space="0" w:color="C7D2FE"/>
+              <w:right w:val="single" w:sz="4" w:space="0" w:color="C7D2FE"/>
+            </w:tcBorders>
+          </w:tcPr>
+          <w:p>
+            <w:pPr>
+              <w:spacing w:before="40" w:after="40"/>
+            </w:pPr>
+            <w:r/>
+            <w:r>
+              <w:rPr>
+                <w:b w:val="0"/>
+                <w:i w:val="0"/>
+                <w:color w:val="1F2937"/>
+                <w:sz w:val="20"/>
+              </w:rPr>
+              <w:t>Saaras v3 + sarvam-30b + Bulbul v3, provider-router ke peeche</w:t>
+            </w:r>
+          </w:p>
+        </w:tc>
+        <w:tc>
+          <w:tcPr>
+            <w:tcW w:type="dxa" w:w="2880"/>
+            <w:tcBorders>
+              <w:top w:val="single" w:sz="4" w:space="0" w:color="C7D2FE"/>
+              <w:left w:val="single" w:sz="4" w:space="0" w:color="C7D2FE"/>
+              <w:bottom w:val="single" w:sz="4" w:space="0" w:color="C7D2FE"/>
+              <w:right w:val="single" w:sz="4" w:space="0" w:color="C7D2FE"/>
+            </w:tcBorders>
+          </w:tcPr>
+          <w:p>
+            <w:pPr>
+              <w:spacing w:before="40" w:after="40"/>
+            </w:pPr>
+            <w:r/>
+            <w:r>
+              <w:rPr>
+                <w:b w:val="0"/>
+                <w:i w:val="0"/>
+                <w:color w:val="1F2937"/>
+                <w:sz w:val="20"/>
+              </w:rPr>
+              <w:t>✅ merged (#190–192)</w:t>
+            </w:r>
+          </w:p>
+        </w:tc>
+      </w:tr>
+      <w:tr>
+        <w:tc>
+          <w:tcPr>
+            <w:tcW w:type="dxa" w:w="2880"/>
+            <w:shd w:val="clear" w:color="auto" w:fill="EEF2FF"/>
+            <w:tcBorders>
+              <w:top w:val="single" w:sz="4" w:space="0" w:color="C7D2FE"/>
+              <w:left w:val="single" w:sz="4" w:space="0" w:color="C7D2FE"/>
+              <w:bottom w:val="single" w:sz="4" w:space="0" w:color="C7D2FE"/>
+              <w:right w:val="single" w:sz="4" w:space="0" w:color="C7D2FE"/>
+            </w:tcBorders>
+          </w:tcPr>
+          <w:p>
+            <w:pPr>
+              <w:spacing w:before="40" w:after="40"/>
+            </w:pPr>
+            <w:r/>
+            <w:r>
+              <w:rPr>
+                <w:b w:val="0"/>
+                <w:i w:val="0"/>
+                <w:color w:val="1F2937"/>
+                <w:sz w:val="20"/>
+              </w:rPr>
+              <w:t>Indic auto-routing</w:t>
+            </w:r>
+          </w:p>
+        </w:tc>
+        <w:tc>
+          <w:tcPr>
+            <w:tcW w:type="dxa" w:w="2880"/>
+            <w:shd w:val="clear" w:color="auto" w:fill="EEF2FF"/>
+            <w:tcBorders>
+              <w:top w:val="single" w:sz="4" w:space="0" w:color="C7D2FE"/>
+              <w:left w:val="single" w:sz="4" w:space="0" w:color="C7D2FE"/>
+              <w:bottom w:val="single" w:sz="4" w:space="0" w:color="C7D2FE"/>
+              <w:right w:val="single" w:sz="4" w:space="0" w:color="C7D2FE"/>
+            </w:tcBorders>
+          </w:tcPr>
+          <w:p>
+            <w:pPr>
+              <w:spacing w:before="40" w:after="40"/>
+            </w:pPr>
+            <w:r/>
+            <w:r>
+              <w:rPr>
+                <w:b w:val="0"/>
+                <w:i w:val="0"/>
+                <w:color w:val="1F2937"/>
+                <w:sz w:val="20"/>
+              </w:rPr>
+              <w:t>Indic primary language ⇒ poori call Sarvam pe</w:t>
+            </w:r>
+          </w:p>
+        </w:tc>
+        <w:tc>
+          <w:tcPr>
+            <w:tcW w:type="dxa" w:w="2880"/>
+            <w:shd w:val="clear" w:color="auto" w:fill="EEF2FF"/>
+            <w:tcBorders>
+              <w:top w:val="single" w:sz="4" w:space="0" w:color="C7D2FE"/>
+              <w:left w:val="single" w:sz="4" w:space="0" w:color="C7D2FE"/>
+              <w:bottom w:val="single" w:sz="4" w:space="0" w:color="C7D2FE"/>
+              <w:right w:val="single" w:sz="4" w:space="0" w:color="C7D2FE"/>
+            </w:tcBorders>
+          </w:tcPr>
+          <w:p>
+            <w:pPr>
+              <w:spacing w:before="40" w:after="40"/>
+            </w:pPr>
+            <w:r/>
+            <w:r>
+              <w:rPr>
+                <w:b w:val="0"/>
+                <w:i w:val="0"/>
+                <w:color w:val="1F2937"/>
+                <w:sz w:val="20"/>
+              </w:rPr>
+              <w:t>✅ merged (#191)</w:t>
+            </w:r>
+          </w:p>
+        </w:tc>
+      </w:tr>
+      <w:tr>
+        <w:tc>
+          <w:tcPr>
+            <w:tcW w:type="dxa" w:w="2880"/>
+            <w:tcBorders>
+              <w:top w:val="single" w:sz="4" w:space="0" w:color="C7D2FE"/>
+              <w:left w:val="single" w:sz="4" w:space="0" w:color="C7D2FE"/>
+              <w:bottom w:val="single" w:sz="4" w:space="0" w:color="C7D2FE"/>
+              <w:right w:val="single" w:sz="4" w:space="0" w:color="C7D2FE"/>
+            </w:tcBorders>
+          </w:tcPr>
+          <w:p>
+            <w:pPr>
+              <w:spacing w:before="40" w:after="40"/>
+            </w:pPr>
+            <w:r/>
+            <w:r>
+              <w:rPr>
+                <w:b w:val="0"/>
+                <w:i w:val="0"/>
+                <w:color w:val="1F2937"/>
+                <w:sz w:val="20"/>
+              </w:rPr>
+              <w:t>Language picker + primary-language plumbing</w:t>
+            </w:r>
+          </w:p>
+        </w:tc>
+        <w:tc>
+          <w:tcPr>
+            <w:tcW w:type="dxa" w:w="2880"/>
+            <w:tcBorders>
+              <w:top w:val="single" w:sz="4" w:space="0" w:color="C7D2FE"/>
+              <w:left w:val="single" w:sz="4" w:space="0" w:color="C7D2FE"/>
+              <w:bottom w:val="single" w:sz="4" w:space="0" w:color="C7D2FE"/>
+              <w:right w:val="single" w:sz="4" w:space="0" w:color="C7D2FE"/>
+            </w:tcBorders>
+          </w:tcPr>
+          <w:p>
+            <w:pPr>
+              <w:spacing w:before="40" w:after="40"/>
+            </w:pPr>
+            <w:r/>
+            <w:r>
+              <w:rPr>
+                <w:b w:val="0"/>
+                <w:i w:val="0"/>
+                <w:color w:val="1F2937"/>
+                <w:sz w:val="20"/>
+              </w:rPr>
+              <w:t>Native-script picker; primary language web→api→voice tak jaata hai</w:t>
+            </w:r>
+          </w:p>
+        </w:tc>
+        <w:tc>
+          <w:tcPr>
+            <w:tcW w:type="dxa" w:w="2880"/>
+            <w:tcBorders>
+              <w:top w:val="single" w:sz="4" w:space="0" w:color="C7D2FE"/>
+              <w:left w:val="single" w:sz="4" w:space="0" w:color="C7D2FE"/>
+              <w:bottom w:val="single" w:sz="4" w:space="0" w:color="C7D2FE"/>
+              <w:right w:val="single" w:sz="4" w:space="0" w:color="C7D2FE"/>
+            </w:tcBorders>
+          </w:tcPr>
+          <w:p>
+            <w:pPr>
+              <w:spacing w:before="40" w:after="40"/>
+            </w:pPr>
+            <w:r/>
+            <w:r>
+              <w:rPr>
+                <w:b w:val="0"/>
+                <w:i w:val="0"/>
+                <w:color w:val="1F2937"/>
+                <w:sz w:val="20"/>
+              </w:rPr>
+              <w:t>✅ merged (#193)</w:t>
+            </w:r>
+          </w:p>
+        </w:tc>
+      </w:tr>
+      <w:tr>
+        <w:tc>
+          <w:tcPr>
+            <w:tcW w:type="dxa" w:w="2880"/>
+            <w:shd w:val="clear" w:color="auto" w:fill="EEF2FF"/>
+            <w:tcBorders>
+              <w:top w:val="single" w:sz="4" w:space="0" w:color="C7D2FE"/>
+              <w:left w:val="single" w:sz="4" w:space="0" w:color="C7D2FE"/>
+              <w:bottom w:val="single" w:sz="4" w:space="0" w:color="C7D2FE"/>
+              <w:right w:val="single" w:sz="4" w:space="0" w:color="C7D2FE"/>
+            </w:tcBorders>
+          </w:tcPr>
+          <w:p>
+            <w:pPr>
+              <w:spacing w:before="40" w:after="40"/>
+            </w:pPr>
+            <w:r/>
+            <w:r>
+              <w:rPr>
+                <w:b w:val="0"/>
+                <w:i w:val="0"/>
+                <w:color w:val="1F2937"/>
+                <w:sz w:val="20"/>
+              </w:rPr>
+              <w:t>22 Indian languages + 4 India agent templates</w:t>
+            </w:r>
+          </w:p>
+        </w:tc>
+        <w:tc>
+          <w:tcPr>
+            <w:tcW w:type="dxa" w:w="2880"/>
+            <w:shd w:val="clear" w:color="auto" w:fill="EEF2FF"/>
+            <w:tcBorders>
+              <w:top w:val="single" w:sz="4" w:space="0" w:color="C7D2FE"/>
+              <w:left w:val="single" w:sz="4" w:space="0" w:color="C7D2FE"/>
+              <w:bottom w:val="single" w:sz="4" w:space="0" w:color="C7D2FE"/>
+              <w:right w:val="single" w:sz="4" w:space="0" w:color="C7D2FE"/>
+            </w:tcBorders>
+          </w:tcPr>
+          <w:p>
+            <w:pPr>
+              <w:spacing w:before="40" w:after="40"/>
+            </w:pPr>
+            <w:r/>
+            <w:r>
+              <w:rPr>
+                <w:b w:val="0"/>
+                <w:i w:val="0"/>
+                <w:color w:val="1F2937"/>
+                <w:sz w:val="20"/>
+              </w:rPr>
+              <w:t>Scheduled languages catalog + Hindi/Tamil/Marathi/Bengali starters</w:t>
+            </w:r>
+          </w:p>
+        </w:tc>
+        <w:tc>
+          <w:tcPr>
+            <w:tcW w:type="dxa" w:w="2880"/>
+            <w:shd w:val="clear" w:color="auto" w:fill="EEF2FF"/>
+            <w:tcBorders>
+              <w:top w:val="single" w:sz="4" w:space="0" w:color="C7D2FE"/>
+              <w:left w:val="single" w:sz="4" w:space="0" w:color="C7D2FE"/>
+              <w:bottom w:val="single" w:sz="4" w:space="0" w:color="C7D2FE"/>
+              <w:right w:val="single" w:sz="4" w:space="0" w:color="C7D2FE"/>
+            </w:tcBorders>
+          </w:tcPr>
+          <w:p>
+            <w:pPr>
+              <w:spacing w:before="40" w:after="40"/>
+            </w:pPr>
+            <w:r/>
+            <w:r>
+              <w:rPr>
+                <w:b w:val="0"/>
+                <w:i w:val="0"/>
+                <w:color w:val="1F2937"/>
+                <w:sz w:val="20"/>
+              </w:rPr>
+              <w:t>✅ merged (#193)</w:t>
+            </w:r>
+          </w:p>
+        </w:tc>
+      </w:tr>
+      <w:tr>
+        <w:tc>
+          <w:tcPr>
+            <w:tcW w:type="dxa" w:w="2880"/>
+            <w:tcBorders>
+              <w:top w:val="single" w:sz="4" w:space="0" w:color="C7D2FE"/>
+              <w:left w:val="single" w:sz="4" w:space="0" w:color="C7D2FE"/>
+              <w:bottom w:val="single" w:sz="4" w:space="0" w:color="C7D2FE"/>
+              <w:right w:val="single" w:sz="4" w:space="0" w:color="C7D2FE"/>
+            </w:tcBorders>
+          </w:tcPr>
+          <w:p>
+            <w:pPr>
+              <w:spacing w:before="40" w:after="40"/>
+            </w:pPr>
+            <w:r/>
+            <w:r>
+              <w:rPr>
+                <w:b w:val="0"/>
+                <w:i w:val="0"/>
+                <w:color w:val="1F2937"/>
+                <w:sz w:val="20"/>
+              </w:rPr>
+              <w:t>Bulbul voice-picker (39 voices)</w:t>
+            </w:r>
+          </w:p>
+        </w:tc>
+        <w:tc>
+          <w:tcPr>
+            <w:tcW w:type="dxa" w:w="2880"/>
+            <w:tcBorders>
+              <w:top w:val="single" w:sz="4" w:space="0" w:color="C7D2FE"/>
+              <w:left w:val="single" w:sz="4" w:space="0" w:color="C7D2FE"/>
+              <w:bottom w:val="single" w:sz="4" w:space="0" w:color="C7D2FE"/>
+              <w:right w:val="single" w:sz="4" w:space="0" w:color="C7D2FE"/>
+            </w:tcBorders>
+          </w:tcPr>
+          <w:p>
+            <w:pPr>
+              <w:spacing w:before="40" w:after="40"/>
+            </w:pPr>
+            <w:r/>
+            <w:r>
+              <w:rPr>
+                <w:b w:val="0"/>
+                <w:i w:val="0"/>
+                <w:color w:val="1F2937"/>
+                <w:sz w:val="20"/>
+              </w:rPr>
+              <w:t>Indic agent ke liye speaker chuno → Sarvam TTS voice (</w:t>
+            </w:r>
+            <w:r>
+              <w:rPr>
+                <w:rFonts w:ascii="Consolas" w:hAnsi="Consolas"/>
+                <w:b w:val="0"/>
+                <w:i w:val="0"/>
+                <w:color w:val="1F2937"/>
+                <w:sz w:val="20"/>
+              </w:rPr>
+              <w:t>voiceId</w:t>
+            </w:r>
+            <w:r>
+              <w:rPr>
+                <w:b w:val="0"/>
+                <w:i w:val="0"/>
+                <w:color w:val="1F2937"/>
+                <w:sz w:val="20"/>
+              </w:rPr>
+              <w:t>→</w:t>
+            </w:r>
+            <w:r>
+              <w:rPr>
+                <w:rFonts w:ascii="Consolas" w:hAnsi="Consolas"/>
+                <w:b w:val="0"/>
+                <w:i w:val="0"/>
+                <w:color w:val="1F2937"/>
+                <w:sz w:val="20"/>
+              </w:rPr>
+              <w:t>voice_id</w:t>
+            </w:r>
+            <w:r>
+              <w:rPr>
+                <w:b w:val="0"/>
+                <w:i w:val="0"/>
+                <w:color w:val="1F2937"/>
+                <w:sz w:val="20"/>
+              </w:rPr>
+              <w:t>)</w:t>
+            </w:r>
+          </w:p>
+        </w:tc>
+        <w:tc>
+          <w:tcPr>
+            <w:tcW w:type="dxa" w:w="2880"/>
+            <w:tcBorders>
+              <w:top w:val="single" w:sz="4" w:space="0" w:color="C7D2FE"/>
+              <w:left w:val="single" w:sz="4" w:space="0" w:color="C7D2FE"/>
+              <w:bottom w:val="single" w:sz="4" w:space="0" w:color="C7D2FE"/>
+              <w:right w:val="single" w:sz="4" w:space="0" w:color="C7D2FE"/>
+            </w:tcBorders>
+          </w:tcPr>
+          <w:p>
+            <w:pPr>
+              <w:spacing w:before="40" w:after="40"/>
+            </w:pPr>
+            <w:r/>
+            <w:r>
+              <w:rPr>
+                <w:b w:val="0"/>
+                <w:i w:val="0"/>
+                <w:color w:val="1F2937"/>
+                <w:sz w:val="20"/>
+              </w:rPr>
+              <w:t>✅ (is PR me)</w:t>
+            </w:r>
+          </w:p>
+        </w:tc>
+      </w:tr>
+      <w:tr>
+        <w:tc>
+          <w:tcPr>
+            <w:tcW w:type="dxa" w:w="2880"/>
+            <w:shd w:val="clear" w:color="auto" w:fill="EEF2FF"/>
+            <w:tcBorders>
+              <w:top w:val="single" w:sz="4" w:space="0" w:color="C7D2FE"/>
+              <w:left w:val="single" w:sz="4" w:space="0" w:color="C7D2FE"/>
+              <w:bottom w:val="single" w:sz="4" w:space="0" w:color="C7D2FE"/>
+              <w:right w:val="single" w:sz="4" w:space="0" w:color="C7D2FE"/>
+            </w:tcBorders>
+          </w:tcPr>
+          <w:p>
+            <w:pPr>
+              <w:spacing w:before="40" w:after="40"/>
+            </w:pPr>
+            <w:r/>
+            <w:r>
+              <w:rPr>
+                <w:b w:val="0"/>
+                <w:i w:val="0"/>
+                <w:color w:val="1F2937"/>
+                <w:sz w:val="20"/>
+              </w:rPr>
+              <w:t>WhatsApp/Messenger bridges → Sarvam</w:t>
+            </w:r>
+          </w:p>
+        </w:tc>
+        <w:tc>
+          <w:tcPr>
+            <w:tcW w:type="dxa" w:w="2880"/>
+            <w:shd w:val="clear" w:color="auto" w:fill="EEF2FF"/>
+            <w:tcBorders>
+              <w:top w:val="single" w:sz="4" w:space="0" w:color="C7D2FE"/>
+              <w:left w:val="single" w:sz="4" w:space="0" w:color="C7D2FE"/>
+              <w:bottom w:val="single" w:sz="4" w:space="0" w:color="C7D2FE"/>
+              <w:right w:val="single" w:sz="4" w:space="0" w:color="C7D2FE"/>
+            </w:tcBorders>
+          </w:tcPr>
+          <w:p>
+            <w:pPr>
+              <w:spacing w:before="40" w:after="40"/>
+            </w:pPr>
+            <w:r/>
+            <w:r>
+              <w:rPr>
+                <w:b w:val="0"/>
+                <w:i w:val="0"/>
+                <w:color w:val="1F2937"/>
+                <w:sz w:val="20"/>
+              </w:rPr>
+              <w:t>Dono WebRTC bridges Sarvam pe wired</w:t>
+            </w:r>
+          </w:p>
+        </w:tc>
+        <w:tc>
+          <w:tcPr>
+            <w:tcW w:type="dxa" w:w="2880"/>
+            <w:shd w:val="clear" w:color="auto" w:fill="EEF2FF"/>
+            <w:tcBorders>
+              <w:top w:val="single" w:sz="4" w:space="0" w:color="C7D2FE"/>
+              <w:left w:val="single" w:sz="4" w:space="0" w:color="C7D2FE"/>
+              <w:bottom w:val="single" w:sz="4" w:space="0" w:color="C7D2FE"/>
+              <w:right w:val="single" w:sz="4" w:space="0" w:color="C7D2FE"/>
+            </w:tcBorders>
+          </w:tcPr>
+          <w:p>
+            <w:pPr>
+              <w:spacing w:before="40" w:after="40"/>
+            </w:pPr>
+            <w:r/>
+            <w:r>
+              <w:rPr>
+                <w:b w:val="0"/>
+                <w:i w:val="0"/>
+                <w:color w:val="1F2937"/>
+                <w:sz w:val="20"/>
+              </w:rPr>
+              <w:t>✅ merged (#192)</w:t>
+            </w:r>
+          </w:p>
+        </w:tc>
+      </w:tr>
+      <w:tr>
+        <w:tc>
+          <w:tcPr>
+            <w:tcW w:type="dxa" w:w="2880"/>
+            <w:tcBorders>
+              <w:top w:val="single" w:sz="4" w:space="0" w:color="C7D2FE"/>
+              <w:left w:val="single" w:sz="4" w:space="0" w:color="C7D2FE"/>
+              <w:bottom w:val="single" w:sz="4" w:space="0" w:color="C7D2FE"/>
+              <w:right w:val="single" w:sz="4" w:space="0" w:color="C7D2FE"/>
+            </w:tcBorders>
+          </w:tcPr>
+          <w:p>
+            <w:pPr>
+              <w:spacing w:before="40" w:after="40"/>
+            </w:pPr>
+            <w:r/>
+            <w:r>
+              <w:rPr>
+                <w:b w:val="0"/>
+                <w:i w:val="0"/>
+                <w:color w:val="1F2937"/>
+                <w:sz w:val="20"/>
+              </w:rPr>
+              <w:t>WhatsApp + Messenger language+voice plumbing</w:t>
+            </w:r>
+          </w:p>
+        </w:tc>
+        <w:tc>
+          <w:tcPr>
+            <w:tcW w:type="dxa" w:w="2880"/>
+            <w:tcBorders>
+              <w:top w:val="single" w:sz="4" w:space="0" w:color="C7D2FE"/>
+              <w:left w:val="single" w:sz="4" w:space="0" w:color="C7D2FE"/>
+              <w:bottom w:val="single" w:sz="4" w:space="0" w:color="C7D2FE"/>
+              <w:right w:val="single" w:sz="4" w:space="0" w:color="C7D2FE"/>
+            </w:tcBorders>
+          </w:tcPr>
+          <w:p>
+            <w:pPr>
+              <w:spacing w:before="40" w:after="40"/>
+            </w:pPr>
+            <w:r/>
+            <w:r>
+              <w:rPr>
+                <w:b w:val="0"/>
+                <w:i w:val="0"/>
+                <w:color w:val="1F2937"/>
+                <w:sz w:val="20"/>
+              </w:rPr>
+              <w:t>Inbound/outbound WA + Messenger call ab agent ki primary language + Bulbul voice pe chalti hai (Indic ⇒ Sarvam)</w:t>
+            </w:r>
+          </w:p>
+        </w:tc>
+        <w:tc>
+          <w:tcPr>
+            <w:tcW w:type="dxa" w:w="2880"/>
+            <w:tcBorders>
+              <w:top w:val="single" w:sz="4" w:space="0" w:color="C7D2FE"/>
+              <w:left w:val="single" w:sz="4" w:space="0" w:color="C7D2FE"/>
+              <w:bottom w:val="single" w:sz="4" w:space="0" w:color="C7D2FE"/>
+              <w:right w:val="single" w:sz="4" w:space="0" w:color="C7D2FE"/>
+            </w:tcBorders>
+          </w:tcPr>
+          <w:p>
+            <w:pPr>
+              <w:spacing w:before="40" w:after="40"/>
+            </w:pPr>
+            <w:r/>
+            <w:r>
+              <w:rPr>
+                <w:b w:val="0"/>
+                <w:i w:val="0"/>
+                <w:color w:val="1F2937"/>
+                <w:sz w:val="20"/>
+              </w:rPr>
+              <w:t>✅ merged (#195)</w:t>
+            </w:r>
+          </w:p>
+        </w:tc>
+      </w:tr>
+      <w:tr>
+        <w:tc>
+          <w:tcPr>
+            <w:tcW w:type="dxa" w:w="2880"/>
+            <w:shd w:val="clear" w:color="auto" w:fill="EEF2FF"/>
+            <w:tcBorders>
+              <w:top w:val="single" w:sz="4" w:space="0" w:color="C7D2FE"/>
+              <w:left w:val="single" w:sz="4" w:space="0" w:color="C7D2FE"/>
+              <w:bottom w:val="single" w:sz="4" w:space="0" w:color="C7D2FE"/>
+              <w:right w:val="single" w:sz="4" w:space="0" w:color="C7D2FE"/>
+            </w:tcBorders>
+          </w:tcPr>
+          <w:p>
+            <w:pPr>
+              <w:spacing w:before="40" w:after="40"/>
+            </w:pPr>
+            <w:r/>
+            <w:r>
+              <w:rPr>
+                <w:b w:val="0"/>
+                <w:i w:val="0"/>
+                <w:color w:val="1F2937"/>
+                <w:sz w:val="20"/>
+              </w:rPr>
+              <w:t>PSTN dialer language+voice plumbing (API side)</w:t>
+            </w:r>
+          </w:p>
+        </w:tc>
+        <w:tc>
+          <w:tcPr>
+            <w:tcW w:type="dxa" w:w="2880"/>
+            <w:shd w:val="clear" w:color="auto" w:fill="EEF2FF"/>
+            <w:tcBorders>
+              <w:top w:val="single" w:sz="4" w:space="0" w:color="C7D2FE"/>
+              <w:left w:val="single" w:sz="4" w:space="0" w:color="C7D2FE"/>
+              <w:bottom w:val="single" w:sz="4" w:space="0" w:color="C7D2FE"/>
+              <w:right w:val="single" w:sz="4" w:space="0" w:color="C7D2FE"/>
+            </w:tcBorders>
+          </w:tcPr>
+          <w:p>
+            <w:pPr>
+              <w:spacing w:before="40" w:after="40"/>
+            </w:pPr>
+            <w:r/>
+            <w:r>
+              <w:rPr>
+                <w:b w:val="0"/>
+                <w:i w:val="0"/>
+                <w:color w:val="1F2937"/>
+                <w:sz w:val="20"/>
+              </w:rPr>
+              <w:t xml:space="preserve">Outbound PSTN dial ab agent ki language + Bulbul voice </w:t>
+            </w:r>
+            <w:r>
+              <w:rPr>
+                <w:rFonts w:ascii="Consolas" w:hAnsi="Consolas"/>
+                <w:b w:val="0"/>
+                <w:i w:val="0"/>
+                <w:color w:val="1F2937"/>
+                <w:sz w:val="20"/>
+              </w:rPr>
+              <w:t>/calls/dial</w:t>
+            </w:r>
+            <w:r>
+              <w:rPr>
+                <w:b w:val="0"/>
+                <w:i w:val="0"/>
+                <w:color w:val="1F2937"/>
+                <w:sz w:val="20"/>
+              </w:rPr>
+              <w:t xml:space="preserve"> body me bhejta hai — ready for voice-side go-live</w:t>
+            </w:r>
+          </w:p>
+        </w:tc>
+        <w:tc>
+          <w:tcPr>
+            <w:tcW w:type="dxa" w:w="2880"/>
+            <w:shd w:val="clear" w:color="auto" w:fill="EEF2FF"/>
+            <w:tcBorders>
+              <w:top w:val="single" w:sz="4" w:space="0" w:color="C7D2FE"/>
+              <w:left w:val="single" w:sz="4" w:space="0" w:color="C7D2FE"/>
+              <w:bottom w:val="single" w:sz="4" w:space="0" w:color="C7D2FE"/>
+              <w:right w:val="single" w:sz="4" w:space="0" w:color="C7D2FE"/>
+            </w:tcBorders>
+          </w:tcPr>
+          <w:p>
+            <w:pPr>
+              <w:spacing w:before="40" w:after="40"/>
+            </w:pPr>
+            <w:r/>
+            <w:r>
+              <w:rPr>
+                <w:b w:val="0"/>
+                <w:i w:val="0"/>
+                <w:color w:val="1F2937"/>
+                <w:sz w:val="20"/>
+              </w:rPr>
+              <w:t>✅ (is PR me)</w:t>
+            </w:r>
+          </w:p>
+        </w:tc>
+      </w:tr>
+    </w:tbl>
+    <w:p>
+      <w:pPr>
+        <w:spacing w:after="40"/>
+      </w:pPr>
+    </w:p>
+    <w:p>
+      <w:pPr>
+        <w:spacing w:after="80"/>
+      </w:pPr>
+      <w:r>
+        <w:rPr>
+          <w:b/>
+          <w:i w:val="0"/>
+          <w:color w:val="1F2937"/>
+          <w:sz w:val="21"/>
+        </w:rPr>
+        <w:t>Live test pending (`SARVAM_API_KEY` chahiye):</w:t>
+      </w:r>
+      <w:r>
+        <w:rPr>
+          <w:b w:val="0"/>
+          <w:i w:val="0"/>
+          <w:color w:val="1F2937"/>
+          <w:sz w:val="21"/>
+        </w:rPr>
+        <w:t xml:space="preserve"> real Sarvam call verify (STT frame-encoding confirm). </w:t>
+      </w:r>
+      <w:r>
+        <w:rPr>
+          <w:b/>
+          <w:i w:val="0"/>
+          <w:color w:val="1F2937"/>
+          <w:sz w:val="21"/>
+        </w:rPr>
+        <w:t>Baaki:</w:t>
+      </w:r>
+      <w:r>
+        <w:rPr>
+          <w:b w:val="0"/>
+          <w:i w:val="0"/>
+          <w:color w:val="1F2937"/>
+          <w:sz w:val="21"/>
+        </w:rPr>
+        <w:t xml:space="preserve"> voice-side </w:t>
+      </w:r>
+      <w:r>
+        <w:rPr>
+          <w:rFonts w:ascii="Consolas" w:hAnsi="Consolas"/>
+          <w:b w:val="0"/>
+          <w:i w:val="0"/>
+          <w:color w:val="1F2937"/>
+          <w:sz w:val="21"/>
+        </w:rPr>
+        <w:t>POST /calls/dial</w:t>
+      </w:r>
+      <w:r>
+        <w:rPr>
+          <w:b w:val="0"/>
+          <w:i w:val="0"/>
+          <w:color w:val="1F2937"/>
+          <w:sz w:val="21"/>
+        </w:rPr>
+        <w:t xml:space="preserve"> endpoint (carrier-gated Twilio go-live — API side ready), full dashboard UI localization (translation content). *(Language+voice ab chaaro calling paths pe: web widget + WhatsApp + Messenger live, PSTN API-side ready.)*</w:t>
+      </w:r>
+    </w:p>
+    <w:p>
+      <w:pPr>
+        <w:pBdr>
+          <w:bottom w:val="single" w:sz="6" w:space="1" w:color="C7D2FE"/>
+        </w:pBdr>
+        <w:spacing w:after="80"/>
+      </w:pPr>
+    </w:p>
+    <w:p>
+      <w:pPr>
+        <w:spacing w:before="280" w:after="120"/>
+        <w:pBdr>
+          <w:bottom w:val="single" w:sz="10" w:space="2" w:color="0EA5E9"/>
+        </w:pBdr>
+      </w:pPr>
+      <w:r>
+        <w:rPr>
+          <w:b/>
+          <w:i w:val="0"/>
+          <w:color w:val="4F46E5"/>
+          <w:sz w:val="30"/>
+        </w:rPr>
+        <w:t>📝 In-call FORM node — call ke dauraan form bharwana (PARITY-03 residual → complete)</w:t>
+      </w:r>
+    </w:p>
+    <w:p>
+      <w:pPr>
+        <w:spacing w:after="80"/>
+      </w:pPr>
+      <w:r>
+        <w:rPr>
+          <w:b w:val="0"/>
+          <w:i w:val="0"/>
+          <w:color w:val="1F2937"/>
+          <w:sz w:val="21"/>
+        </w:rPr>
+        <w:t xml:space="preserve">Flow builder me ek naya </w:t>
+      </w:r>
+      <w:r>
+        <w:rPr>
+          <w:b/>
+          <w:i w:val="0"/>
+          <w:color w:val="1F2937"/>
+          <w:sz w:val="21"/>
+        </w:rPr>
+        <w:t>"Form" node</w:t>
+      </w:r>
+      <w:r>
+        <w:rPr>
+          <w:b w:val="0"/>
+          <w:i w:val="0"/>
+          <w:color w:val="1F2937"/>
+          <w:sz w:val="21"/>
+        </w:rPr>
+        <w:t xml:space="preserve">: author canvas pe drag karke tenant ki koi </w:t>
+      </w:r>
+      <w:r>
+        <w:rPr>
+          <w:b/>
+          <w:i w:val="0"/>
+          <w:color w:val="1F2937"/>
+          <w:sz w:val="21"/>
+        </w:rPr>
+        <w:t>saved Form</w:t>
+      </w:r>
+      <w:r>
+        <w:rPr>
+          <w:b w:val="0"/>
+          <w:i w:val="0"/>
+          <w:color w:val="1F2937"/>
+          <w:sz w:val="21"/>
+        </w:rPr>
+        <w:t xml:space="preserve"> (Day 37) chunta hai — call/chat ke dauraan agent har field poochta hai, jawab capture karta hai, aur end pe </w:t>
+      </w:r>
+      <w:r>
+        <w:rPr>
+          <w:b/>
+          <w:i w:val="0"/>
+          <w:color w:val="1F2937"/>
+          <w:sz w:val="21"/>
+        </w:rPr>
+        <w:t>FormSubmission + Contact + Lead</w:t>
+      </w:r>
+      <w:r>
+        <w:rPr>
+          <w:b w:val="0"/>
+          <w:i w:val="0"/>
+          <w:color w:val="1F2937"/>
+          <w:sz w:val="21"/>
+        </w:rPr>
+        <w:t xml:space="preserve"> save hota hai (webhook/Sheet routing samet). Non-technical users ke liye — no JSON.</w:t>
+      </w:r>
+    </w:p>
+    <w:tbl>
+      <w:tblPr>
+        <w:tblW w:type="auto" w:w="0"/>
+        <w:jc w:val="center"/>
+        <w:tblLayout w:type="autofit"/>
+        <w:tblLook w:firstColumn="1" w:firstRow="1" w:lastColumn="0" w:lastRow="0" w:noHBand="0" w:noVBand="1" w:val="04A0"/>
+      </w:tblPr>
+      <w:tblGrid>
+        <w:gridCol w:w="2880"/>
+        <w:gridCol w:w="2880"/>
+        <w:gridCol w:w="2880"/>
+      </w:tblGrid>
+      <w:tr>
+        <w:tc>
+          <w:tcPr>
+            <w:tcW w:type="dxa" w:w="2880"/>
+            <w:shd w:val="clear" w:color="auto" w:fill="4F46E5"/>
+            <w:tcBorders>
+              <w:top w:val="single" w:sz="4" w:space="0" w:color="C7D2FE"/>
+              <w:left w:val="single" w:sz="4" w:space="0" w:color="C7D2FE"/>
+              <w:bottom w:val="single" w:sz="4" w:space="0" w:color="C7D2FE"/>
+              <w:right w:val="single" w:sz="4" w:space="0" w:color="C7D2FE"/>
+            </w:tcBorders>
+          </w:tcPr>
+          <w:p>
+            <w:pPr>
+              <w:spacing w:before="40" w:after="40"/>
+            </w:pPr>
+            <w:r/>
+            <w:r>
+              <w:rPr>
+                <w:b/>
+                <w:i w:val="0"/>
+                <w:color w:val="FFFFFF"/>
+                <w:sz w:val="20"/>
+              </w:rPr>
+              <w:t>Piece</w:t>
+            </w:r>
+          </w:p>
+        </w:tc>
+        <w:tc>
+          <w:tcPr>
+            <w:tcW w:type="dxa" w:w="2880"/>
+            <w:shd w:val="clear" w:color="auto" w:fill="4F46E5"/>
+            <w:tcBorders>
+              <w:top w:val="single" w:sz="4" w:space="0" w:color="C7D2FE"/>
+              <w:left w:val="single" w:sz="4" w:space="0" w:color="C7D2FE"/>
+              <w:bottom w:val="single" w:sz="4" w:space="0" w:color="C7D2FE"/>
+              <w:right w:val="single" w:sz="4" w:space="0" w:color="C7D2FE"/>
+            </w:tcBorders>
+          </w:tcPr>
+          <w:p>
+            <w:pPr>
+              <w:spacing w:before="40" w:after="40"/>
+            </w:pPr>
+            <w:r/>
+            <w:r>
+              <w:rPr>
+                <w:b/>
+                <w:i w:val="0"/>
+                <w:color w:val="FFFFFF"/>
+                <w:sz w:val="20"/>
+              </w:rPr>
+              <w:t>Kya hai</w:t>
+            </w:r>
+          </w:p>
+        </w:tc>
+        <w:tc>
+          <w:tcPr>
+            <w:tcW w:type="dxa" w:w="2880"/>
+            <w:shd w:val="clear" w:color="auto" w:fill="4F46E5"/>
+            <w:tcBorders>
+              <w:top w:val="single" w:sz="4" w:space="0" w:color="C7D2FE"/>
+              <w:left w:val="single" w:sz="4" w:space="0" w:color="C7D2FE"/>
+              <w:bottom w:val="single" w:sz="4" w:space="0" w:color="C7D2FE"/>
+              <w:right w:val="single" w:sz="4" w:space="0" w:color="C7D2FE"/>
+            </w:tcBorders>
+          </w:tcPr>
+          <w:p>
+            <w:pPr>
+              <w:spacing w:before="40" w:after="40"/>
+            </w:pPr>
+            <w:r/>
+            <w:r>
+              <w:rPr>
+                <w:b/>
+                <w:i w:val="0"/>
+                <w:color w:val="FFFFFF"/>
+                <w:sz w:val="20"/>
+              </w:rPr>
+              <w:t>Status</w:t>
+            </w:r>
+          </w:p>
+        </w:tc>
+      </w:tr>
+      <w:tr>
+        <w:tc>
+          <w:tcPr>
+            <w:tcW w:type="dxa" w:w="2880"/>
+            <w:tcBorders>
+              <w:top w:val="single" w:sz="4" w:space="0" w:color="C7D2FE"/>
+              <w:left w:val="single" w:sz="4" w:space="0" w:color="C7D2FE"/>
+              <w:bottom w:val="single" w:sz="4" w:space="0" w:color="C7D2FE"/>
+              <w:right w:val="single" w:sz="4" w:space="0" w:color="C7D2FE"/>
+            </w:tcBorders>
+          </w:tcPr>
+          <w:p>
+            <w:pPr>
+              <w:spacing w:before="40" w:after="40"/>
+            </w:pPr>
+            <w:r/>
+            <w:r>
+              <w:rPr>
+                <w:b w:val="0"/>
+                <w:i w:val="0"/>
+                <w:color w:val="1F2937"/>
+                <w:sz w:val="20"/>
+              </w:rPr>
+              <w:t>Shared foundation</w:t>
+            </w:r>
+          </w:p>
+        </w:tc>
+        <w:tc>
+          <w:tcPr>
+            <w:tcW w:type="dxa" w:w="2880"/>
+            <w:tcBorders>
+              <w:top w:val="single" w:sz="4" w:space="0" w:color="C7D2FE"/>
+              <w:left w:val="single" w:sz="4" w:space="0" w:color="C7D2FE"/>
+              <w:bottom w:val="single" w:sz="4" w:space="0" w:color="C7D2FE"/>
+              <w:right w:val="single" w:sz="4" w:space="0" w:color="C7D2FE"/>
+            </w:tcBorders>
+          </w:tcPr>
+          <w:p>
+            <w:pPr>
+              <w:spacing w:before="40" w:after="40"/>
+            </w:pPr>
+            <w:r/>
+            <w:r>
+              <w:rPr>
+                <w:rFonts w:ascii="Consolas" w:hAnsi="Consolas"/>
+                <w:b w:val="0"/>
+                <w:i w:val="0"/>
+                <w:color w:val="1F2937"/>
+                <w:sz w:val="20"/>
+              </w:rPr>
+              <w:t>FlowNodeType.FORM</w:t>
+            </w:r>
+            <w:r>
+              <w:rPr>
+                <w:b w:val="0"/>
+                <w:i w:val="0"/>
+                <w:color w:val="1F2937"/>
+                <w:sz w:val="20"/>
+              </w:rPr>
+              <w:t xml:space="preserve"> + config + </w:t>
+            </w:r>
+            <w:r>
+              <w:rPr>
+                <w:b/>
+                <w:i w:val="0"/>
+                <w:color w:val="1F2937"/>
+                <w:sz w:val="20"/>
+              </w:rPr>
+              <w:t>compile-time expansion</w:t>
+            </w:r>
+            <w:r>
+              <w:rPr>
+                <w:b w:val="0"/>
+                <w:i w:val="0"/>
+                <w:color w:val="1F2937"/>
+                <w:sz w:val="20"/>
+              </w:rPr>
+              <w:t xml:space="preserve"> (FORM → SAY/LISTEN chain) — koi runtime/voice-loop change nahi</w:t>
+            </w:r>
+          </w:p>
+        </w:tc>
+        <w:tc>
+          <w:tcPr>
+            <w:tcW w:type="dxa" w:w="2880"/>
+            <w:tcBorders>
+              <w:top w:val="single" w:sz="4" w:space="0" w:color="C7D2FE"/>
+              <w:left w:val="single" w:sz="4" w:space="0" w:color="C7D2FE"/>
+              <w:bottom w:val="single" w:sz="4" w:space="0" w:color="C7D2FE"/>
+              <w:right w:val="single" w:sz="4" w:space="0" w:color="C7D2FE"/>
+            </w:tcBorders>
+          </w:tcPr>
+          <w:p>
+            <w:pPr>
+              <w:spacing w:before="40" w:after="40"/>
+            </w:pPr>
+            <w:r/>
+            <w:r>
+              <w:rPr>
+                <w:b w:val="0"/>
+                <w:i w:val="0"/>
+                <w:color w:val="1F2937"/>
+                <w:sz w:val="20"/>
+              </w:rPr>
+              <w:t>✅ merged (#204)</w:t>
+            </w:r>
+          </w:p>
+        </w:tc>
+      </w:tr>
+      <w:tr>
+        <w:tc>
+          <w:tcPr>
+            <w:tcW w:type="dxa" w:w="2880"/>
+            <w:shd w:val="clear" w:color="auto" w:fill="EEF2FF"/>
+            <w:tcBorders>
+              <w:top w:val="single" w:sz="4" w:space="0" w:color="C7D2FE"/>
+              <w:left w:val="single" w:sz="4" w:space="0" w:color="C7D2FE"/>
+              <w:bottom w:val="single" w:sz="4" w:space="0" w:color="C7D2FE"/>
+              <w:right w:val="single" w:sz="4" w:space="0" w:color="C7D2FE"/>
+            </w:tcBorders>
+          </w:tcPr>
+          <w:p>
+            <w:pPr>
+              <w:spacing w:before="40" w:after="40"/>
+            </w:pPr>
+            <w:r/>
+            <w:r>
+              <w:rPr>
+                <w:b w:val="0"/>
+                <w:i w:val="0"/>
+                <w:color w:val="1F2937"/>
+                <w:sz w:val="20"/>
+              </w:rPr>
+              <w:t>API wiring (chat/messaging)</w:t>
+            </w:r>
+          </w:p>
+        </w:tc>
+        <w:tc>
+          <w:tcPr>
+            <w:tcW w:type="dxa" w:w="2880"/>
+            <w:shd w:val="clear" w:color="auto" w:fill="EEF2FF"/>
+            <w:tcBorders>
+              <w:top w:val="single" w:sz="4" w:space="0" w:color="C7D2FE"/>
+              <w:left w:val="single" w:sz="4" w:space="0" w:color="C7D2FE"/>
+              <w:bottom w:val="single" w:sz="4" w:space="0" w:color="C7D2FE"/>
+              <w:right w:val="single" w:sz="4" w:space="0" w:color="C7D2FE"/>
+            </w:tcBorders>
+          </w:tcPr>
+          <w:p>
+            <w:pPr>
+              <w:spacing w:before="40" w:after="40"/>
+            </w:pPr>
+            <w:r/>
+            <w:r>
+              <w:rPr>
+                <w:rFonts w:ascii="Consolas" w:hAnsi="Consolas"/>
+                <w:b w:val="0"/>
+                <w:i w:val="0"/>
+                <w:color w:val="1F2937"/>
+                <w:sz w:val="20"/>
+              </w:rPr>
+              <w:t>chat.service</w:t>
+            </w:r>
+            <w:r>
+              <w:rPr>
+                <w:b w:val="0"/>
+                <w:i w:val="0"/>
+                <w:color w:val="1F2937"/>
+                <w:sz w:val="20"/>
+              </w:rPr>
+              <w:t xml:space="preserve"> FORM nodes resolve+expand karta hai; conversation end pe </w:t>
+            </w:r>
+            <w:r>
+              <w:rPr>
+                <w:rFonts w:ascii="Consolas" w:hAnsi="Consolas"/>
+                <w:b w:val="0"/>
+                <w:i w:val="0"/>
+                <w:color w:val="1F2937"/>
+                <w:sz w:val="20"/>
+              </w:rPr>
+              <w:t>submitForCall</w:t>
+            </w:r>
+            <w:r>
+              <w:rPr>
+                <w:b w:val="0"/>
+                <w:i w:val="0"/>
+                <w:color w:val="1F2937"/>
+                <w:sz w:val="20"/>
+              </w:rPr>
+              <w:t xml:space="preserve"> se save (deterministic ask/capture)</w:t>
+            </w:r>
+          </w:p>
+        </w:tc>
+        <w:tc>
+          <w:tcPr>
+            <w:tcW w:type="dxa" w:w="2880"/>
+            <w:shd w:val="clear" w:color="auto" w:fill="EEF2FF"/>
+            <w:tcBorders>
+              <w:top w:val="single" w:sz="4" w:space="0" w:color="C7D2FE"/>
+              <w:left w:val="single" w:sz="4" w:space="0" w:color="C7D2FE"/>
+              <w:bottom w:val="single" w:sz="4" w:space="0" w:color="C7D2FE"/>
+              <w:right w:val="single" w:sz="4" w:space="0" w:color="C7D2FE"/>
+            </w:tcBorders>
+          </w:tcPr>
+          <w:p>
+            <w:pPr>
+              <w:spacing w:before="40" w:after="40"/>
+            </w:pPr>
+            <w:r/>
+            <w:r>
+              <w:rPr>
+                <w:b w:val="0"/>
+                <w:i w:val="0"/>
+                <w:color w:val="1F2937"/>
+                <w:sz w:val="20"/>
+              </w:rPr>
+              <w:t>✅ merged (#205)</w:t>
+            </w:r>
+          </w:p>
+        </w:tc>
+      </w:tr>
+      <w:tr>
+        <w:tc>
+          <w:tcPr>
+            <w:tcW w:type="dxa" w:w="2880"/>
+            <w:tcBorders>
+              <w:top w:val="single" w:sz="4" w:space="0" w:color="C7D2FE"/>
+              <w:left w:val="single" w:sz="4" w:space="0" w:color="C7D2FE"/>
+              <w:bottom w:val="single" w:sz="4" w:space="0" w:color="C7D2FE"/>
+              <w:right w:val="single" w:sz="4" w:space="0" w:color="C7D2FE"/>
+            </w:tcBorders>
+          </w:tcPr>
+          <w:p>
+            <w:pPr>
+              <w:spacing w:before="40" w:after="40"/>
+            </w:pPr>
+            <w:r/>
+            <w:r>
+              <w:rPr>
+                <w:b w:val="0"/>
+                <w:i w:val="0"/>
+                <w:color w:val="1F2937"/>
+                <w:sz w:val="20"/>
+              </w:rPr>
+              <w:t>Web builder node</w:t>
+            </w:r>
+          </w:p>
+        </w:tc>
+        <w:tc>
+          <w:tcPr>
+            <w:tcW w:type="dxa" w:w="2880"/>
+            <w:tcBorders>
+              <w:top w:val="single" w:sz="4" w:space="0" w:color="C7D2FE"/>
+              <w:left w:val="single" w:sz="4" w:space="0" w:color="C7D2FE"/>
+              <w:bottom w:val="single" w:sz="4" w:space="0" w:color="C7D2FE"/>
+              <w:right w:val="single" w:sz="4" w:space="0" w:color="C7D2FE"/>
+            </w:tcBorders>
+          </w:tcPr>
+          <w:p>
+            <w:pPr>
+              <w:spacing w:before="40" w:after="40"/>
+            </w:pPr>
+            <w:r/>
+            <w:r>
+              <w:rPr>
+                <w:b w:val="0"/>
+                <w:i w:val="0"/>
+                <w:color w:val="1F2937"/>
+                <w:sz w:val="20"/>
+              </w:rPr>
+              <w:t>Palette me "Form" + config panel (form picker, intro line, confirm toggle)</w:t>
+            </w:r>
+          </w:p>
+        </w:tc>
+        <w:tc>
+          <w:tcPr>
+            <w:tcW w:type="dxa" w:w="2880"/>
+            <w:tcBorders>
+              <w:top w:val="single" w:sz="4" w:space="0" w:color="C7D2FE"/>
+              <w:left w:val="single" w:sz="4" w:space="0" w:color="C7D2FE"/>
+              <w:bottom w:val="single" w:sz="4" w:space="0" w:color="C7D2FE"/>
+              <w:right w:val="single" w:sz="4" w:space="0" w:color="C7D2FE"/>
+            </w:tcBorders>
+          </w:tcPr>
+          <w:p>
+            <w:pPr>
+              <w:spacing w:before="40" w:after="40"/>
+            </w:pPr>
+            <w:r/>
+            <w:r>
+              <w:rPr>
+                <w:b w:val="0"/>
+                <w:i w:val="0"/>
+                <w:color w:val="1F2937"/>
+                <w:sz w:val="20"/>
+              </w:rPr>
+              <w:t>✅ merged (#206)</w:t>
+            </w:r>
+          </w:p>
+        </w:tc>
+      </w:tr>
+      <w:tr>
+        <w:tc>
+          <w:tcPr>
+            <w:tcW w:type="dxa" w:w="2880"/>
+            <w:shd w:val="clear" w:color="auto" w:fill="EEF2FF"/>
+            <w:tcBorders>
+              <w:top w:val="single" w:sz="4" w:space="0" w:color="C7D2FE"/>
+              <w:left w:val="single" w:sz="4" w:space="0" w:color="C7D2FE"/>
+              <w:bottom w:val="single" w:sz="4" w:space="0" w:color="C7D2FE"/>
+              <w:right w:val="single" w:sz="4" w:space="0" w:color="C7D2FE"/>
+            </w:tcBorders>
+          </w:tcPr>
+          <w:p>
+            <w:pPr>
+              <w:spacing w:before="40" w:after="40"/>
+            </w:pPr>
+            <w:r/>
+            <w:r>
+              <w:rPr>
+                <w:b w:val="0"/>
+                <w:i w:val="0"/>
+                <w:color w:val="1F2937"/>
+                <w:sz w:val="20"/>
+              </w:rPr>
+              <w:t>Voice leg</w:t>
+            </w:r>
+          </w:p>
+        </w:tc>
+        <w:tc>
+          <w:tcPr>
+            <w:tcW w:type="dxa" w:w="2880"/>
+            <w:shd w:val="clear" w:color="auto" w:fill="EEF2FF"/>
+            <w:tcBorders>
+              <w:top w:val="single" w:sz="4" w:space="0" w:color="C7D2FE"/>
+              <w:left w:val="single" w:sz="4" w:space="0" w:color="C7D2FE"/>
+              <w:bottom w:val="single" w:sz="4" w:space="0" w:color="C7D2FE"/>
+              <w:right w:val="single" w:sz="4" w:space="0" w:color="C7D2FE"/>
+            </w:tcBorders>
+          </w:tcPr>
+          <w:p>
+            <w:pPr>
+              <w:spacing w:before="40" w:after="40"/>
+            </w:pPr>
+            <w:r/>
+            <w:r>
+              <w:rPr>
+                <w:b w:val="0"/>
+                <w:i w:val="0"/>
+                <w:color w:val="1F2937"/>
+                <w:sz w:val="20"/>
+              </w:rPr>
+              <w:t xml:space="preserve">Dispatch pe </w:t>
+            </w:r>
+            <w:r>
+              <w:rPr>
+                <w:b/>
+                <w:i w:val="0"/>
+                <w:color w:val="1F2937"/>
+                <w:sz w:val="20"/>
+              </w:rPr>
+              <w:t>collection brief</w:t>
+            </w:r>
+            <w:r>
+              <w:rPr>
+                <w:b w:val="0"/>
+                <w:i w:val="0"/>
+                <w:color w:val="1F2937"/>
+                <w:sz w:val="20"/>
+              </w:rPr>
+              <w:t xml:space="preserve"> system prompt me (agent fields poochta hai) + post-call </w:t>
+            </w:r>
+            <w:r>
+              <w:rPr>
+                <w:b/>
+                <w:i w:val="0"/>
+                <w:color w:val="1F2937"/>
+                <w:sz w:val="20"/>
+              </w:rPr>
+              <w:t>metered LLM extraction</w:t>
+            </w:r>
+            <w:r>
+              <w:rPr>
+                <w:b w:val="0"/>
+                <w:i w:val="0"/>
+                <w:color w:val="1F2937"/>
+                <w:sz w:val="20"/>
+              </w:rPr>
+              <w:t xml:space="preserve"> transcript se (</w:t>
+            </w:r>
+            <w:r>
+              <w:rPr>
+                <w:rFonts w:ascii="Consolas" w:hAnsi="Consolas"/>
+                <w:b w:val="0"/>
+                <w:i w:val="0"/>
+                <w:color w:val="1F2937"/>
+                <w:sz w:val="20"/>
+              </w:rPr>
+              <w:t>FormExtractionService</w:t>
+            </w:r>
+            <w:r>
+              <w:rPr>
+                <w:b w:val="0"/>
+                <w:i w:val="0"/>
+                <w:color w:val="1F2937"/>
+                <w:sz w:val="20"/>
+              </w:rPr>
+              <w:t xml:space="preserve"> → </w:t>
+            </w:r>
+            <w:r>
+              <w:rPr>
+                <w:rFonts w:ascii="Consolas" w:hAnsi="Consolas"/>
+                <w:b w:val="0"/>
+                <w:i w:val="0"/>
+                <w:color w:val="1F2937"/>
+                <w:sz w:val="20"/>
+              </w:rPr>
+              <w:t>submitForCall</w:t>
+            </w:r>
+            <w:r>
+              <w:rPr>
+                <w:b w:val="0"/>
+                <w:i w:val="0"/>
+                <w:color w:val="1F2937"/>
+                <w:sz w:val="20"/>
+              </w:rPr>
+              <w:t xml:space="preserve">), </w:t>
+            </w:r>
+            <w:r>
+              <w:rPr>
+                <w:rFonts w:ascii="Consolas" w:hAnsi="Consolas"/>
+                <w:b w:val="0"/>
+                <w:i w:val="0"/>
+                <w:color w:val="1F2937"/>
+                <w:sz w:val="20"/>
+              </w:rPr>
+              <w:t>recordDisposition</w:t>
+            </w:r>
+            <w:r>
+              <w:rPr>
+                <w:b w:val="0"/>
+                <w:i w:val="0"/>
+                <w:color w:val="1F2937"/>
+                <w:sz w:val="20"/>
+              </w:rPr>
+              <w:t xml:space="preserve"> hook se trigger</w:t>
+            </w:r>
+          </w:p>
+        </w:tc>
+        <w:tc>
+          <w:tcPr>
+            <w:tcW w:type="dxa" w:w="2880"/>
+            <w:shd w:val="clear" w:color="auto" w:fill="EEF2FF"/>
+            <w:tcBorders>
+              <w:top w:val="single" w:sz="4" w:space="0" w:color="C7D2FE"/>
+              <w:left w:val="single" w:sz="4" w:space="0" w:color="C7D2FE"/>
+              <w:bottom w:val="single" w:sz="4" w:space="0" w:color="C7D2FE"/>
+              <w:right w:val="single" w:sz="4" w:space="0" w:color="C7D2FE"/>
+            </w:tcBorders>
+          </w:tcPr>
+          <w:p>
+            <w:pPr>
+              <w:spacing w:before="40" w:after="40"/>
+            </w:pPr>
+            <w:r/>
+            <w:r>
+              <w:rPr>
+                <w:b w:val="0"/>
+                <w:i w:val="0"/>
+                <w:color w:val="1F2937"/>
+                <w:sz w:val="20"/>
+              </w:rPr>
+              <w:t>✅ (is PR me)</w:t>
+            </w:r>
+          </w:p>
+        </w:tc>
+      </w:tr>
+    </w:tbl>
+    <w:p>
+      <w:pPr>
+        <w:spacing w:after="40"/>
+      </w:pPr>
+    </w:p>
+    <w:p>
+      <w:pPr>
+        <w:spacing w:after="80"/>
+      </w:pPr>
+      <w:r>
+        <w:rPr>
+          <w:b/>
+          <w:i w:val="0"/>
+          <w:color w:val="1F2937"/>
+          <w:sz w:val="21"/>
+        </w:rPr>
+        <w:t>Voice note (honest):</w:t>
+      </w:r>
+      <w:r>
+        <w:rPr>
+          <w:b w:val="0"/>
+          <w:i w:val="0"/>
+          <w:color w:val="1F2937"/>
+          <w:sz w:val="21"/>
+        </w:rPr>
+        <w:t xml:space="preserve"> voice loop LLM-driven hai (deterministic flow-nodes execute nahi karta), isliye voice pe Day-31 post-call-intel pattern use hota hai — prompt se collect, transcript se metered extraction. Extraction tab chalta hai jab call ka Transcript ho (widget leg ki transcript persistence voice go-live ke saath aati hai). FORM-less flow pe </w:t>
+      </w:r>
+      <w:r>
+        <w:rPr>
+          <w:b/>
+          <w:i w:val="0"/>
+          <w:color w:val="1F2937"/>
+          <w:sz w:val="21"/>
+        </w:rPr>
+        <w:t>zero LLM spend</w:t>
+      </w:r>
+      <w:r>
+        <w:rPr>
+          <w:b w:val="0"/>
+          <w:i w:val="0"/>
+          <w:color w:val="1F2937"/>
+          <w:sz w:val="21"/>
+        </w:rPr>
+        <w:t>.</w:t>
+      </w:r>
+    </w:p>
+    <w:p>
+      <w:pPr>
+        <w:pBdr>
+          <w:bottom w:val="single" w:sz="6" w:space="1" w:color="C7D2FE"/>
+        </w:pBdr>
+        <w:spacing w:after="80"/>
+      </w:pPr>
+    </w:p>
+    <w:p>
+      <w:pPr>
+        <w:spacing w:before="280" w:after="120"/>
+        <w:pBdr>
+          <w:bottom w:val="single" w:sz="10" w:space="2" w:color="0EA5E9"/>
+        </w:pBdr>
+      </w:pPr>
+      <w:r>
+        <w:rPr>
+          <w:b/>
+          <w:i w:val="0"/>
+          <w:color w:val="4F46E5"/>
+          <w:sz w:val="30"/>
+        </w:rPr>
+        <w:t>🔧 Post-audit hardening — "advertised but inert" seams ab real (P1/P2 sweep)</w:t>
+      </w:r>
+    </w:p>
+    <w:p>
+      <w:pPr>
+        <w:spacing w:after="80"/>
+      </w:pPr>
+      <w:r>
+        <w:rPr>
+          <w:rFonts w:ascii="Consolas" w:hAnsi="Consolas"/>
+          <w:b w:val="0"/>
+          <w:i w:val="0"/>
+          <w:color w:val="1F2937"/>
+          <w:sz w:val="21"/>
+        </w:rPr>
+        <w:t>docs/PENDING-AUDIT.md</w:t>
+      </w:r>
+      <w:r>
+        <w:rPr>
+          <w:b w:val="0"/>
+          <w:i w:val="0"/>
+          <w:color w:val="1F2937"/>
+          <w:sz w:val="21"/>
+        </w:rPr>
+        <w:t xml:space="preserve"> (4-way audit, #197) ne pakda tha ki kuch DI factories key set hone pe bhi Disabled/mock return karti thi. Ab ye sab </w:t>
+      </w:r>
+      <w:r>
+        <w:rPr>
+          <w:b/>
+          <w:i w:val="0"/>
+          <w:color w:val="1F2937"/>
+          <w:sz w:val="21"/>
+        </w:rPr>
+        <w:t>real adapters</w:t>
+      </w:r>
+      <w:r>
+        <w:rPr>
+          <w:b w:val="0"/>
+          <w:i w:val="0"/>
+          <w:color w:val="1F2937"/>
+          <w:sz w:val="21"/>
+        </w:rPr>
+        <w:t xml:space="preserve"> hain — key daalte hi live:</w:t>
+      </w:r>
+    </w:p>
+    <w:tbl>
+      <w:tblPr>
+        <w:tblW w:type="auto" w:w="0"/>
+        <w:jc w:val="center"/>
+        <w:tblLayout w:type="autofit"/>
+        <w:tblLook w:firstColumn="1" w:firstRow="1" w:lastColumn="0" w:lastRow="0" w:noHBand="0" w:noVBand="1" w:val="04A0"/>
+      </w:tblPr>
+      <w:tblGrid>
+        <w:gridCol w:w="2880"/>
+        <w:gridCol w:w="2880"/>
+        <w:gridCol w:w="2880"/>
+      </w:tblGrid>
+      <w:tr>
+        <w:tc>
+          <w:tcPr>
+            <w:tcW w:type="dxa" w:w="2880"/>
+            <w:shd w:val="clear" w:color="auto" w:fill="4F46E5"/>
+            <w:tcBorders>
+              <w:top w:val="single" w:sz="4" w:space="0" w:color="C7D2FE"/>
+              <w:left w:val="single" w:sz="4" w:space="0" w:color="C7D2FE"/>
+              <w:bottom w:val="single" w:sz="4" w:space="0" w:color="C7D2FE"/>
+              <w:right w:val="single" w:sz="4" w:space="0" w:color="C7D2FE"/>
+            </w:tcBorders>
+          </w:tcPr>
+          <w:p>
+            <w:pPr>
+              <w:spacing w:before="40" w:after="40"/>
+            </w:pPr>
+            <w:r/>
+            <w:r>
+              <w:rPr>
+                <w:b/>
+                <w:i w:val="0"/>
+                <w:color w:val="FFFFFF"/>
+                <w:sz w:val="20"/>
+              </w:rPr>
+              <w:t>Seam</w:t>
+            </w:r>
+          </w:p>
+        </w:tc>
+        <w:tc>
+          <w:tcPr>
+            <w:tcW w:type="dxa" w:w="2880"/>
+            <w:shd w:val="clear" w:color="auto" w:fill="4F46E5"/>
+            <w:tcBorders>
+              <w:top w:val="single" w:sz="4" w:space="0" w:color="C7D2FE"/>
+              <w:left w:val="single" w:sz="4" w:space="0" w:color="C7D2FE"/>
+              <w:bottom w:val="single" w:sz="4" w:space="0" w:color="C7D2FE"/>
+              <w:right w:val="single" w:sz="4" w:space="0" w:color="C7D2FE"/>
+            </w:tcBorders>
+          </w:tcPr>
+          <w:p>
+            <w:pPr>
+              <w:spacing w:before="40" w:after="40"/>
+            </w:pPr>
+            <w:r/>
+            <w:r>
+              <w:rPr>
+                <w:b/>
+                <w:i w:val="0"/>
+                <w:color w:val="FFFFFF"/>
+                <w:sz w:val="20"/>
+              </w:rPr>
+              <w:t>Live jab</w:t>
+            </w:r>
+          </w:p>
+        </w:tc>
+        <w:tc>
+          <w:tcPr>
+            <w:tcW w:type="dxa" w:w="2880"/>
+            <w:shd w:val="clear" w:color="auto" w:fill="4F46E5"/>
+            <w:tcBorders>
+              <w:top w:val="single" w:sz="4" w:space="0" w:color="C7D2FE"/>
+              <w:left w:val="single" w:sz="4" w:space="0" w:color="C7D2FE"/>
+              <w:bottom w:val="single" w:sz="4" w:space="0" w:color="C7D2FE"/>
+              <w:right w:val="single" w:sz="4" w:space="0" w:color="C7D2FE"/>
+            </w:tcBorders>
+          </w:tcPr>
+          <w:p>
+            <w:pPr>
+              <w:spacing w:before="40" w:after="40"/>
+            </w:pPr>
+            <w:r/>
+            <w:r>
+              <w:rPr>
+                <w:b/>
+                <w:i w:val="0"/>
+                <w:color w:val="FFFFFF"/>
+                <w:sz w:val="20"/>
+              </w:rPr>
+              <w:t>PR</w:t>
+            </w:r>
+          </w:p>
+        </w:tc>
+      </w:tr>
+      <w:tr>
+        <w:tc>
+          <w:tcPr>
+            <w:tcW w:type="dxa" w:w="2880"/>
+            <w:tcBorders>
+              <w:top w:val="single" w:sz="4" w:space="0" w:color="C7D2FE"/>
+              <w:left w:val="single" w:sz="4" w:space="0" w:color="C7D2FE"/>
+              <w:bottom w:val="single" w:sz="4" w:space="0" w:color="C7D2FE"/>
+              <w:right w:val="single" w:sz="4" w:space="0" w:color="C7D2FE"/>
+            </w:tcBorders>
+          </w:tcPr>
+          <w:p>
+            <w:pPr>
+              <w:spacing w:before="40" w:after="40"/>
+            </w:pPr>
+            <w:r/>
+            <w:r>
+              <w:rPr>
+                <w:b w:val="0"/>
+                <w:i w:val="0"/>
+                <w:color w:val="1F2937"/>
+                <w:sz w:val="20"/>
+              </w:rPr>
+              <w:t>SSO / SAML (WorkOS)</w:t>
+            </w:r>
+          </w:p>
+        </w:tc>
+        <w:tc>
+          <w:tcPr>
+            <w:tcW w:type="dxa" w:w="2880"/>
+            <w:tcBorders>
+              <w:top w:val="single" w:sz="4" w:space="0" w:color="C7D2FE"/>
+              <w:left w:val="single" w:sz="4" w:space="0" w:color="C7D2FE"/>
+              <w:bottom w:val="single" w:sz="4" w:space="0" w:color="C7D2FE"/>
+              <w:right w:val="single" w:sz="4" w:space="0" w:color="C7D2FE"/>
+            </w:tcBorders>
+          </w:tcPr>
+          <w:p>
+            <w:pPr>
+              <w:spacing w:before="40" w:after="40"/>
+            </w:pPr>
+            <w:r/>
+            <w:r>
+              <w:rPr>
+                <w:rFonts w:ascii="Consolas" w:hAnsi="Consolas"/>
+                <w:b w:val="0"/>
+                <w:i w:val="0"/>
+                <w:color w:val="1F2937"/>
+                <w:sz w:val="20"/>
+              </w:rPr>
+              <w:t>WORKOS_API_KEY</w:t>
+            </w:r>
+            <w:r>
+              <w:rPr>
+                <w:b w:val="0"/>
+                <w:i w:val="0"/>
+                <w:color w:val="1F2937"/>
+                <w:sz w:val="20"/>
+              </w:rPr>
+              <w:t xml:space="preserve"> + </w:t>
+            </w:r>
+            <w:r>
+              <w:rPr>
+                <w:rFonts w:ascii="Consolas" w:hAnsi="Consolas"/>
+                <w:b w:val="0"/>
+                <w:i w:val="0"/>
+                <w:color w:val="1F2937"/>
+                <w:sz w:val="20"/>
+              </w:rPr>
+              <w:t>WORKOS_CLIENT_ID</w:t>
+            </w:r>
+          </w:p>
+        </w:tc>
+        <w:tc>
+          <w:tcPr>
+            <w:tcW w:type="dxa" w:w="2880"/>
+            <w:tcBorders>
+              <w:top w:val="single" w:sz="4" w:space="0" w:color="C7D2FE"/>
+              <w:left w:val="single" w:sz="4" w:space="0" w:color="C7D2FE"/>
+              <w:bottom w:val="single" w:sz="4" w:space="0" w:color="C7D2FE"/>
+              <w:right w:val="single" w:sz="4" w:space="0" w:color="C7D2FE"/>
+            </w:tcBorders>
+          </w:tcPr>
+          <w:p>
+            <w:pPr>
+              <w:spacing w:before="40" w:after="40"/>
+            </w:pPr>
+            <w:r/>
+            <w:r>
+              <w:rPr>
+                <w:b w:val="0"/>
+                <w:i w:val="0"/>
+                <w:color w:val="1F2937"/>
+                <w:sz w:val="20"/>
+              </w:rPr>
+              <w:t>✅ #198</w:t>
+            </w:r>
+          </w:p>
+        </w:tc>
+      </w:tr>
+      <w:tr>
+        <w:tc>
+          <w:tcPr>
+            <w:tcW w:type="dxa" w:w="2880"/>
+            <w:shd w:val="clear" w:color="auto" w:fill="EEF2FF"/>
+            <w:tcBorders>
+              <w:top w:val="single" w:sz="4" w:space="0" w:color="C7D2FE"/>
+              <w:left w:val="single" w:sz="4" w:space="0" w:color="C7D2FE"/>
+              <w:bottom w:val="single" w:sz="4" w:space="0" w:color="C7D2FE"/>
+              <w:right w:val="single" w:sz="4" w:space="0" w:color="C7D2FE"/>
+            </w:tcBorders>
+          </w:tcPr>
+          <w:p>
+            <w:pPr>
+              <w:spacing w:before="40" w:after="40"/>
+            </w:pPr>
+            <w:r/>
+            <w:r>
+              <w:rPr>
+                <w:b w:val="0"/>
+                <w:i w:val="0"/>
+                <w:color w:val="1F2937"/>
+                <w:sz w:val="20"/>
+              </w:rPr>
+              <w:t>Marketing email (Resend)</w:t>
+            </w:r>
+          </w:p>
+        </w:tc>
+        <w:tc>
+          <w:tcPr>
+            <w:tcW w:type="dxa" w:w="2880"/>
+            <w:shd w:val="clear" w:color="auto" w:fill="EEF2FF"/>
+            <w:tcBorders>
+              <w:top w:val="single" w:sz="4" w:space="0" w:color="C7D2FE"/>
+              <w:left w:val="single" w:sz="4" w:space="0" w:color="C7D2FE"/>
+              <w:bottom w:val="single" w:sz="4" w:space="0" w:color="C7D2FE"/>
+              <w:right w:val="single" w:sz="4" w:space="0" w:color="C7D2FE"/>
+            </w:tcBorders>
+          </w:tcPr>
+          <w:p>
+            <w:pPr>
+              <w:spacing w:before="40" w:after="40"/>
+            </w:pPr>
+            <w:r/>
+            <w:r>
+              <w:rPr>
+                <w:rFonts w:ascii="Consolas" w:hAnsi="Consolas"/>
+                <w:b w:val="0"/>
+                <w:i w:val="0"/>
+                <w:color w:val="1F2937"/>
+                <w:sz w:val="20"/>
+              </w:rPr>
+              <w:t>RESEND_API_KEY</w:t>
+            </w:r>
+            <w:r>
+              <w:rPr>
+                <w:b w:val="0"/>
+                <w:i w:val="0"/>
+                <w:color w:val="1F2937"/>
+                <w:sz w:val="20"/>
+              </w:rPr>
+              <w:t xml:space="preserve"> + </w:t>
+            </w:r>
+            <w:r>
+              <w:rPr>
+                <w:rFonts w:ascii="Consolas" w:hAnsi="Consolas"/>
+                <w:b w:val="0"/>
+                <w:i w:val="0"/>
+                <w:color w:val="1F2937"/>
+                <w:sz w:val="20"/>
+              </w:rPr>
+              <w:t>MARKETING_EMAIL_FROM</w:t>
+            </w:r>
+          </w:p>
+        </w:tc>
+        <w:tc>
+          <w:tcPr>
+            <w:tcW w:type="dxa" w:w="2880"/>
+            <w:shd w:val="clear" w:color="auto" w:fill="EEF2FF"/>
+            <w:tcBorders>
+              <w:top w:val="single" w:sz="4" w:space="0" w:color="C7D2FE"/>
+              <w:left w:val="single" w:sz="4" w:space="0" w:color="C7D2FE"/>
+              <w:bottom w:val="single" w:sz="4" w:space="0" w:color="C7D2FE"/>
+              <w:right w:val="single" w:sz="4" w:space="0" w:color="C7D2FE"/>
+            </w:tcBorders>
+          </w:tcPr>
+          <w:p>
+            <w:pPr>
+              <w:spacing w:before="40" w:after="40"/>
+            </w:pPr>
+            <w:r/>
+            <w:r>
+              <w:rPr>
+                <w:b w:val="0"/>
+                <w:i w:val="0"/>
+                <w:color w:val="1F2937"/>
+                <w:sz w:val="20"/>
+              </w:rPr>
+              <w:t>✅ #198</w:t>
+            </w:r>
+          </w:p>
+        </w:tc>
+      </w:tr>
+      <w:tr>
+        <w:tc>
+          <w:tcPr>
+            <w:tcW w:type="dxa" w:w="2880"/>
+            <w:tcBorders>
+              <w:top w:val="single" w:sz="4" w:space="0" w:color="C7D2FE"/>
+              <w:left w:val="single" w:sz="4" w:space="0" w:color="C7D2FE"/>
+              <w:bottom w:val="single" w:sz="4" w:space="0" w:color="C7D2FE"/>
+              <w:right w:val="single" w:sz="4" w:space="0" w:color="C7D2FE"/>
+            </w:tcBorders>
+          </w:tcPr>
+          <w:p>
+            <w:pPr>
+              <w:spacing w:before="40" w:after="40"/>
+            </w:pPr>
+            <w:r/>
+            <w:r>
+              <w:rPr>
+                <w:b w:val="0"/>
+                <w:i w:val="0"/>
+                <w:color w:val="1F2937"/>
+                <w:sz w:val="20"/>
+              </w:rPr>
+              <w:t>Video avatars (HeyGen streaming)</w:t>
+            </w:r>
+          </w:p>
+        </w:tc>
+        <w:tc>
+          <w:tcPr>
+            <w:tcW w:type="dxa" w:w="2880"/>
+            <w:tcBorders>
+              <w:top w:val="single" w:sz="4" w:space="0" w:color="C7D2FE"/>
+              <w:left w:val="single" w:sz="4" w:space="0" w:color="C7D2FE"/>
+              <w:bottom w:val="single" w:sz="4" w:space="0" w:color="C7D2FE"/>
+              <w:right w:val="single" w:sz="4" w:space="0" w:color="C7D2FE"/>
+            </w:tcBorders>
+          </w:tcPr>
+          <w:p>
+            <w:pPr>
+              <w:spacing w:before="40" w:after="40"/>
+            </w:pPr>
+            <w:r/>
+            <w:r>
+              <w:rPr>
+                <w:rFonts w:ascii="Consolas" w:hAnsi="Consolas"/>
+                <w:b w:val="0"/>
+                <w:i w:val="0"/>
+                <w:color w:val="1F2937"/>
+                <w:sz w:val="20"/>
+              </w:rPr>
+              <w:t>AVATAR_PROVIDER_API_KEY</w:t>
+            </w:r>
+          </w:p>
+        </w:tc>
+        <w:tc>
+          <w:tcPr>
+            <w:tcW w:type="dxa" w:w="2880"/>
+            <w:tcBorders>
+              <w:top w:val="single" w:sz="4" w:space="0" w:color="C7D2FE"/>
+              <w:left w:val="single" w:sz="4" w:space="0" w:color="C7D2FE"/>
+              <w:bottom w:val="single" w:sz="4" w:space="0" w:color="C7D2FE"/>
+              <w:right w:val="single" w:sz="4" w:space="0" w:color="C7D2FE"/>
+            </w:tcBorders>
+          </w:tcPr>
+          <w:p>
+            <w:pPr>
+              <w:spacing w:before="40" w:after="40"/>
+            </w:pPr>
+            <w:r/>
+            <w:r>
+              <w:rPr>
+                <w:b w:val="0"/>
+                <w:i w:val="0"/>
+                <w:color w:val="1F2937"/>
+                <w:sz w:val="20"/>
+              </w:rPr>
+              <w:t>✅ #198</w:t>
+            </w:r>
+          </w:p>
+        </w:tc>
+      </w:tr>
+      <w:tr>
+        <w:tc>
+          <w:tcPr>
+            <w:tcW w:type="dxa" w:w="2880"/>
+            <w:shd w:val="clear" w:color="auto" w:fill="EEF2FF"/>
+            <w:tcBorders>
+              <w:top w:val="single" w:sz="4" w:space="0" w:color="C7D2FE"/>
+              <w:left w:val="single" w:sz="4" w:space="0" w:color="C7D2FE"/>
+              <w:bottom w:val="single" w:sz="4" w:space="0" w:color="C7D2FE"/>
+              <w:right w:val="single" w:sz="4" w:space="0" w:color="C7D2FE"/>
+            </w:tcBorders>
+          </w:tcPr>
+          <w:p>
+            <w:pPr>
+              <w:spacing w:before="40" w:after="40"/>
+            </w:pPr>
+            <w:r/>
+            <w:r>
+              <w:rPr>
+                <w:b w:val="0"/>
+                <w:i w:val="0"/>
+                <w:color w:val="1F2937"/>
+                <w:sz w:val="20"/>
+              </w:rPr>
+              <w:t>PCI payment receipts (email via Resend seam)</w:t>
+            </w:r>
+          </w:p>
+        </w:tc>
+        <w:tc>
+          <w:tcPr>
+            <w:tcW w:type="dxa" w:w="2880"/>
+            <w:shd w:val="clear" w:color="auto" w:fill="EEF2FF"/>
+            <w:tcBorders>
+              <w:top w:val="single" w:sz="4" w:space="0" w:color="C7D2FE"/>
+              <w:left w:val="single" w:sz="4" w:space="0" w:color="C7D2FE"/>
+              <w:bottom w:val="single" w:sz="4" w:space="0" w:color="C7D2FE"/>
+              <w:right w:val="single" w:sz="4" w:space="0" w:color="C7D2FE"/>
+            </w:tcBorders>
+          </w:tcPr>
+          <w:p>
+            <w:pPr>
+              <w:spacing w:before="40" w:after="40"/>
+            </w:pPr>
+            <w:r/>
+            <w:r>
+              <w:rPr>
+                <w:b w:val="0"/>
+                <w:i w:val="0"/>
+                <w:color w:val="1F2937"/>
+                <w:sz w:val="20"/>
+              </w:rPr>
+              <w:t>Resend configured</w:t>
+            </w:r>
+          </w:p>
+        </w:tc>
+        <w:tc>
+          <w:tcPr>
+            <w:tcW w:type="dxa" w:w="2880"/>
+            <w:shd w:val="clear" w:color="auto" w:fill="EEF2FF"/>
+            <w:tcBorders>
+              <w:top w:val="single" w:sz="4" w:space="0" w:color="C7D2FE"/>
+              <w:left w:val="single" w:sz="4" w:space="0" w:color="C7D2FE"/>
+              <w:bottom w:val="single" w:sz="4" w:space="0" w:color="C7D2FE"/>
+              <w:right w:val="single" w:sz="4" w:space="0" w:color="C7D2FE"/>
+            </w:tcBorders>
+          </w:tcPr>
+          <w:p>
+            <w:pPr>
+              <w:spacing w:before="40" w:after="40"/>
+            </w:pPr>
+            <w:r/>
+            <w:r>
+              <w:rPr>
+                <w:b w:val="0"/>
+                <w:i w:val="0"/>
+                <w:color w:val="1F2937"/>
+                <w:sz w:val="20"/>
+              </w:rPr>
+              <w:t>✅ #199</w:t>
+            </w:r>
+          </w:p>
+        </w:tc>
+      </w:tr>
+      <w:tr>
+        <w:tc>
+          <w:tcPr>
+            <w:tcW w:type="dxa" w:w="2880"/>
+            <w:tcBorders>
+              <w:top w:val="single" w:sz="4" w:space="0" w:color="C7D2FE"/>
+              <w:left w:val="single" w:sz="4" w:space="0" w:color="C7D2FE"/>
+              <w:bottom w:val="single" w:sz="4" w:space="0" w:color="C7D2FE"/>
+              <w:right w:val="single" w:sz="4" w:space="0" w:color="C7D2FE"/>
+            </w:tcBorders>
+          </w:tcPr>
+          <w:p>
+            <w:pPr>
+              <w:spacing w:before="40" w:after="40"/>
+            </w:pPr>
+            <w:r/>
+            <w:r>
+              <w:rPr>
+                <w:b w:val="0"/>
+                <w:i w:val="0"/>
+                <w:color w:val="1F2937"/>
+                <w:sz w:val="20"/>
+              </w:rPr>
+              <w:t>Provider fine-tune (OpenAI JSONL upload + job)</w:t>
+            </w:r>
+          </w:p>
+        </w:tc>
+        <w:tc>
+          <w:tcPr>
+            <w:tcW w:type="dxa" w:w="2880"/>
+            <w:tcBorders>
+              <w:top w:val="single" w:sz="4" w:space="0" w:color="C7D2FE"/>
+              <w:left w:val="single" w:sz="4" w:space="0" w:color="C7D2FE"/>
+              <w:bottom w:val="single" w:sz="4" w:space="0" w:color="C7D2FE"/>
+              <w:right w:val="single" w:sz="4" w:space="0" w:color="C7D2FE"/>
+            </w:tcBorders>
+          </w:tcPr>
+          <w:p>
+            <w:pPr>
+              <w:spacing w:before="40" w:after="40"/>
+            </w:pPr>
+            <w:r/>
+            <w:r>
+              <w:rPr>
+                <w:rFonts w:ascii="Consolas" w:hAnsi="Consolas"/>
+                <w:b w:val="0"/>
+                <w:i w:val="0"/>
+                <w:color w:val="1F2937"/>
+                <w:sz w:val="20"/>
+              </w:rPr>
+              <w:t>OPENAI_API_KEY</w:t>
+            </w:r>
+          </w:p>
+        </w:tc>
+        <w:tc>
+          <w:tcPr>
+            <w:tcW w:type="dxa" w:w="2880"/>
+            <w:tcBorders>
+              <w:top w:val="single" w:sz="4" w:space="0" w:color="C7D2FE"/>
+              <w:left w:val="single" w:sz="4" w:space="0" w:color="C7D2FE"/>
+              <w:bottom w:val="single" w:sz="4" w:space="0" w:color="C7D2FE"/>
+              <w:right w:val="single" w:sz="4" w:space="0" w:color="C7D2FE"/>
+            </w:tcBorders>
+          </w:tcPr>
+          <w:p>
+            <w:pPr>
+              <w:spacing w:before="40" w:after="40"/>
+            </w:pPr>
+            <w:r/>
+            <w:r>
+              <w:rPr>
+                <w:b w:val="0"/>
+                <w:i w:val="0"/>
+                <w:color w:val="1F2937"/>
+                <w:sz w:val="20"/>
+              </w:rPr>
+              <w:t>✅ #200</w:t>
+            </w:r>
+          </w:p>
+        </w:tc>
+      </w:tr>
+      <w:tr>
+        <w:tc>
+          <w:tcPr>
+            <w:tcW w:type="dxa" w:w="2880"/>
+            <w:shd w:val="clear" w:color="auto" w:fill="EEF2FF"/>
+            <w:tcBorders>
+              <w:top w:val="single" w:sz="4" w:space="0" w:color="C7D2FE"/>
+              <w:left w:val="single" w:sz="4" w:space="0" w:color="C7D2FE"/>
+              <w:bottom w:val="single" w:sz="4" w:space="0" w:color="C7D2FE"/>
+              <w:right w:val="single" w:sz="4" w:space="0" w:color="C7D2FE"/>
+            </w:tcBorders>
+          </w:tcPr>
+          <w:p>
+            <w:pPr>
+              <w:spacing w:before="40" w:after="40"/>
+            </w:pPr>
+            <w:r/>
+            <w:r>
+              <w:rPr>
+                <w:b w:val="0"/>
+                <w:i w:val="0"/>
+                <w:color w:val="1F2937"/>
+                <w:sz w:val="20"/>
+              </w:rPr>
+              <w:t>Qdrant vector store (REST client, tenant-filtered)</w:t>
+            </w:r>
+          </w:p>
+        </w:tc>
+        <w:tc>
+          <w:tcPr>
+            <w:tcW w:type="dxa" w:w="2880"/>
+            <w:shd w:val="clear" w:color="auto" w:fill="EEF2FF"/>
+            <w:tcBorders>
+              <w:top w:val="single" w:sz="4" w:space="0" w:color="C7D2FE"/>
+              <w:left w:val="single" w:sz="4" w:space="0" w:color="C7D2FE"/>
+              <w:bottom w:val="single" w:sz="4" w:space="0" w:color="C7D2FE"/>
+              <w:right w:val="single" w:sz="4" w:space="0" w:color="C7D2FE"/>
+            </w:tcBorders>
+          </w:tcPr>
+          <w:p>
+            <w:pPr>
+              <w:spacing w:before="40" w:after="40"/>
+            </w:pPr>
+            <w:r/>
+            <w:r>
+              <w:rPr>
+                <w:rFonts w:ascii="Consolas" w:hAnsi="Consolas"/>
+                <w:b w:val="0"/>
+                <w:i w:val="0"/>
+                <w:color w:val="1F2937"/>
+                <w:sz w:val="20"/>
+              </w:rPr>
+              <w:t>QDRANT_URL</w:t>
+            </w:r>
+            <w:r>
+              <w:rPr>
+                <w:b w:val="0"/>
+                <w:i w:val="0"/>
+                <w:color w:val="1F2937"/>
+                <w:sz w:val="20"/>
+              </w:rPr>
+              <w:t xml:space="preserve"> (+</w:t>
+            </w:r>
+            <w:r>
+              <w:rPr>
+                <w:rFonts w:ascii="Consolas" w:hAnsi="Consolas"/>
+                <w:b w:val="0"/>
+                <w:i w:val="0"/>
+                <w:color w:val="1F2937"/>
+                <w:sz w:val="20"/>
+              </w:rPr>
+              <w:t>QDRANT_API_KEY</w:t>
+            </w:r>
+            <w:r>
+              <w:rPr>
+                <w:b w:val="0"/>
+                <w:i w:val="0"/>
+                <w:color w:val="1F2937"/>
+                <w:sz w:val="20"/>
+              </w:rPr>
+              <w:t>)</w:t>
+            </w:r>
+          </w:p>
+        </w:tc>
+        <w:tc>
+          <w:tcPr>
+            <w:tcW w:type="dxa" w:w="2880"/>
+            <w:shd w:val="clear" w:color="auto" w:fill="EEF2FF"/>
+            <w:tcBorders>
+              <w:top w:val="single" w:sz="4" w:space="0" w:color="C7D2FE"/>
+              <w:left w:val="single" w:sz="4" w:space="0" w:color="C7D2FE"/>
+              <w:bottom w:val="single" w:sz="4" w:space="0" w:color="C7D2FE"/>
+              <w:right w:val="single" w:sz="4" w:space="0" w:color="C7D2FE"/>
+            </w:tcBorders>
+          </w:tcPr>
+          <w:p>
+            <w:pPr>
+              <w:spacing w:before="40" w:after="40"/>
+            </w:pPr>
+            <w:r/>
+            <w:r>
+              <w:rPr>
+                <w:b w:val="0"/>
+                <w:i w:val="0"/>
+                <w:color w:val="1F2937"/>
+                <w:sz w:val="20"/>
+              </w:rPr>
+              <w:t>✅ #201</w:t>
+            </w:r>
+          </w:p>
+        </w:tc>
+      </w:tr>
+      <w:tr>
+        <w:tc>
+          <w:tcPr>
+            <w:tcW w:type="dxa" w:w="2880"/>
+            <w:tcBorders>
+              <w:top w:val="single" w:sz="4" w:space="0" w:color="C7D2FE"/>
+              <w:left w:val="single" w:sz="4" w:space="0" w:color="C7D2FE"/>
+              <w:bottom w:val="single" w:sz="4" w:space="0" w:color="C7D2FE"/>
+              <w:right w:val="single" w:sz="4" w:space="0" w:color="C7D2FE"/>
+            </w:tcBorders>
+          </w:tcPr>
+          <w:p>
+            <w:pPr>
+              <w:spacing w:before="40" w:after="40"/>
+            </w:pPr>
+            <w:r/>
+            <w:r>
+              <w:rPr>
+                <w:b w:val="0"/>
+                <w:i w:val="0"/>
+                <w:color w:val="1F2937"/>
+                <w:sz w:val="20"/>
+              </w:rPr>
+              <w:t>Salesforce / Zendesk / Webhook / Zapier connectors</w:t>
+            </w:r>
+          </w:p>
+        </w:tc>
+        <w:tc>
+          <w:tcPr>
+            <w:tcW w:type="dxa" w:w="2880"/>
+            <w:tcBorders>
+              <w:top w:val="single" w:sz="4" w:space="0" w:color="C7D2FE"/>
+              <w:left w:val="single" w:sz="4" w:space="0" w:color="C7D2FE"/>
+              <w:bottom w:val="single" w:sz="4" w:space="0" w:color="C7D2FE"/>
+              <w:right w:val="single" w:sz="4" w:space="0" w:color="C7D2FE"/>
+            </w:tcBorders>
+          </w:tcPr>
+          <w:p>
+            <w:pPr>
+              <w:spacing w:before="40" w:after="40"/>
+            </w:pPr>
+            <w:r/>
+            <w:r>
+              <w:rPr>
+                <w:b w:val="0"/>
+                <w:i w:val="0"/>
+                <w:color w:val="1F2937"/>
+                <w:sz w:val="20"/>
+              </w:rPr>
+              <w:t>token + setting (instanceUrl/subdomain/url) — connect form me fields (#203)</w:t>
+            </w:r>
+          </w:p>
+        </w:tc>
+        <w:tc>
+          <w:tcPr>
+            <w:tcW w:type="dxa" w:w="2880"/>
+            <w:tcBorders>
+              <w:top w:val="single" w:sz="4" w:space="0" w:color="C7D2FE"/>
+              <w:left w:val="single" w:sz="4" w:space="0" w:color="C7D2FE"/>
+              <w:bottom w:val="single" w:sz="4" w:space="0" w:color="C7D2FE"/>
+              <w:right w:val="single" w:sz="4" w:space="0" w:color="C7D2FE"/>
+            </w:tcBorders>
+          </w:tcPr>
+          <w:p>
+            <w:pPr>
+              <w:spacing w:before="40" w:after="40"/>
+            </w:pPr>
+            <w:r/>
+            <w:r>
+              <w:rPr>
+                <w:b w:val="0"/>
+                <w:i w:val="0"/>
+                <w:color w:val="1F2937"/>
+                <w:sz w:val="20"/>
+              </w:rPr>
+              <w:t>✅ #202</w:t>
+            </w:r>
+          </w:p>
+        </w:tc>
+      </w:tr>
+    </w:tbl>
+    <w:p>
+      <w:pPr>
+        <w:spacing w:after="40"/>
+      </w:pPr>
+    </w:p>
+    <w:p>
+      <w:pPr>
+        <w:spacing w:after="80"/>
+      </w:pPr>
+      <w:r>
+        <w:rPr>
+          <w:b/>
+          <w:i w:val="0"/>
+          <w:color w:val="1F2937"/>
+          <w:sz w:val="21"/>
+        </w:rPr>
+        <w:t>Ab bhi partner/decision-gated:</w:t>
+      </w:r>
+      <w:r>
+        <w:rPr>
+          <w:b w:val="0"/>
+          <w:i w:val="0"/>
+          <w:color w:val="1F2937"/>
+          <w:sz w:val="21"/>
+        </w:rPr>
+        <w:t xml:space="preserve"> PCI card-capture (PCI-DSS partner), cloud KMS (</w:t>
+      </w:r>
+      <w:r>
+        <w:rPr>
+          <w:rFonts w:ascii="Consolas" w:hAnsi="Consolas"/>
+          <w:b w:val="0"/>
+          <w:i w:val="0"/>
+          <w:color w:val="1F2937"/>
+          <w:sz w:val="21"/>
+        </w:rPr>
+        <w:t>KMS_KEY_ID</w:t>
+      </w:r>
+      <w:r>
+        <w:rPr>
+          <w:b w:val="0"/>
+          <w:i w:val="0"/>
+          <w:color w:val="1F2937"/>
+          <w:sz w:val="21"/>
+        </w:rPr>
+        <w:t>), spam-label/STIR-SHAKEN lookup.</w:t>
       </w:r>
     </w:p>
     <w:sectPr>

</xml_diff>